<commit_message>
Install Geant4 datasets into <install>/data; update manual and scripts
</commit_message>
<xml_diff>
--- a/MANUAL.docx
+++ b/MANUAL.docx
@@ -93,7 +93,7 @@
       <w:r>
         <w:fldChar w:fldCharType="separate"/>
       </w:r>
-      <w:hyperlink w:anchor="_Toc243409789" w:history="1">
+      <w:hyperlink w:anchor="_Toc243412937" w:history="1">
         <w:r>
           <w:rPr>
             <w:rStyle w:val="aff8"/>
@@ -120,7 +120,7 @@
             <w:noProof/>
             <w:webHidden/>
           </w:rPr>
-          <w:instrText xml:space="preserve"> PAGEREF _Toc243409789 \h </w:instrText>
+          <w:instrText xml:space="preserve"> PAGEREF _Toc243412937 \h </w:instrText>
         </w:r>
         <w:r>
           <w:rPr>
@@ -161,7 +161,7 @@
           <w:noProof/>
         </w:rPr>
       </w:pPr>
-      <w:hyperlink w:anchor="_Toc243409790" w:history="1">
+      <w:hyperlink w:anchor="_Toc243412938" w:history="1">
         <w:r>
           <w:rPr>
             <w:rStyle w:val="aff8"/>
@@ -188,7 +188,7 @@
             <w:noProof/>
             <w:webHidden/>
           </w:rPr>
-          <w:instrText xml:space="preserve"> PAGEREF _Toc243409790 \h </w:instrText>
+          <w:instrText xml:space="preserve"> PAGEREF _Toc243412938 \h </w:instrText>
         </w:r>
         <w:r>
           <w:rPr>
@@ -229,7 +229,7 @@
           <w:noProof/>
         </w:rPr>
       </w:pPr>
-      <w:hyperlink w:anchor="_Toc243409791" w:history="1">
+      <w:hyperlink w:anchor="_Toc243412939" w:history="1">
         <w:r>
           <w:rPr>
             <w:rStyle w:val="aff8"/>
@@ -256,7 +256,7 @@
             <w:noProof/>
             <w:webHidden/>
           </w:rPr>
-          <w:instrText xml:space="preserve"> PAGEREF _Toc243409791 \h </w:instrText>
+          <w:instrText xml:space="preserve"> PAGEREF _Toc243412939 \h </w:instrText>
         </w:r>
         <w:r>
           <w:rPr>
@@ -297,7 +297,7 @@
           <w:noProof/>
         </w:rPr>
       </w:pPr>
-      <w:hyperlink w:anchor="_Toc243409792" w:history="1">
+      <w:hyperlink w:anchor="_Toc243412940" w:history="1">
         <w:r>
           <w:rPr>
             <w:rStyle w:val="aff8"/>
@@ -324,7 +324,7 @@
             <w:noProof/>
             <w:webHidden/>
           </w:rPr>
-          <w:instrText xml:space="preserve"> PAGEREF _Toc243409792 \h </w:instrText>
+          <w:instrText xml:space="preserve"> PAGEREF _Toc243412940 \h </w:instrText>
         </w:r>
         <w:r>
           <w:rPr>
@@ -365,7 +365,7 @@
           <w:noProof/>
         </w:rPr>
       </w:pPr>
-      <w:hyperlink w:anchor="_Toc243409793" w:history="1">
+      <w:hyperlink w:anchor="_Toc243412941" w:history="1">
         <w:r>
           <w:rPr>
             <w:rStyle w:val="aff8"/>
@@ -392,7 +392,7 @@
             <w:noProof/>
             <w:webHidden/>
           </w:rPr>
-          <w:instrText xml:space="preserve"> PAGEREF _Toc243409793 \h </w:instrText>
+          <w:instrText xml:space="preserve"> PAGEREF _Toc243412941 \h </w:instrText>
         </w:r>
         <w:r>
           <w:rPr>
@@ -433,7 +433,7 @@
           <w:noProof/>
         </w:rPr>
       </w:pPr>
-      <w:hyperlink w:anchor="_Toc243409794" w:history="1">
+      <w:hyperlink w:anchor="_Toc243412942" w:history="1">
         <w:r>
           <w:rPr>
             <w:rStyle w:val="aff8"/>
@@ -460,7 +460,7 @@
             <w:noProof/>
             <w:webHidden/>
           </w:rPr>
-          <w:instrText xml:space="preserve"> PAGEREF _Toc243409794 \h </w:instrText>
+          <w:instrText xml:space="preserve"> PAGEREF _Toc243412942 \h </w:instrText>
         </w:r>
         <w:r>
           <w:rPr>
@@ -501,7 +501,7 @@
           <w:noProof/>
         </w:rPr>
       </w:pPr>
-      <w:hyperlink w:anchor="_Toc243409795" w:history="1">
+      <w:hyperlink w:anchor="_Toc243412943" w:history="1">
         <w:r>
           <w:rPr>
             <w:rStyle w:val="aff8"/>
@@ -528,7 +528,7 @@
             <w:noProof/>
             <w:webHidden/>
           </w:rPr>
-          <w:instrText xml:space="preserve"> PAGEREF _Toc243409795 \h </w:instrText>
+          <w:instrText xml:space="preserve"> PAGEREF _Toc243412943 \h </w:instrText>
         </w:r>
         <w:r>
           <w:rPr>
@@ -569,7 +569,7 @@
           <w:noProof/>
         </w:rPr>
       </w:pPr>
-      <w:hyperlink w:anchor="_Toc243409796" w:history="1">
+      <w:hyperlink w:anchor="_Toc243412944" w:history="1">
         <w:r>
           <w:rPr>
             <w:rStyle w:val="aff8"/>
@@ -596,7 +596,7 @@
             <w:noProof/>
             <w:webHidden/>
           </w:rPr>
-          <w:instrText xml:space="preserve"> PAGEREF _Toc243409796 \h </w:instrText>
+          <w:instrText xml:space="preserve"> PAGEREF _Toc243412944 \h </w:instrText>
         </w:r>
         <w:r>
           <w:rPr>
@@ -637,7 +637,7 @@
           <w:noProof/>
         </w:rPr>
       </w:pPr>
-      <w:hyperlink w:anchor="_Toc243409797" w:history="1">
+      <w:hyperlink w:anchor="_Toc243412945" w:history="1">
         <w:r>
           <w:rPr>
             <w:rStyle w:val="aff8"/>
@@ -664,7 +664,7 @@
             <w:noProof/>
             <w:webHidden/>
           </w:rPr>
-          <w:instrText xml:space="preserve"> PAGEREF _Toc243409797 \h </w:instrText>
+          <w:instrText xml:space="preserve"> PAGEREF _Toc243412945 \h </w:instrText>
         </w:r>
         <w:r>
           <w:rPr>
@@ -705,7 +705,7 @@
           <w:noProof/>
         </w:rPr>
       </w:pPr>
-      <w:hyperlink w:anchor="_Toc243409798" w:history="1">
+      <w:hyperlink w:anchor="_Toc243412946" w:history="1">
         <w:r>
           <w:rPr>
             <w:rStyle w:val="aff8"/>
@@ -732,7 +732,7 @@
             <w:noProof/>
             <w:webHidden/>
           </w:rPr>
-          <w:instrText xml:space="preserve"> PAGEREF _Toc243409798 \h </w:instrText>
+          <w:instrText xml:space="preserve"> PAGEREF _Toc243412946 \h </w:instrText>
         </w:r>
         <w:r>
           <w:rPr>
@@ -773,7 +773,7 @@
           <w:noProof/>
         </w:rPr>
       </w:pPr>
-      <w:hyperlink w:anchor="_Toc243409799" w:history="1">
+      <w:hyperlink w:anchor="_Toc243412947" w:history="1">
         <w:r>
           <w:rPr>
             <w:rStyle w:val="aff8"/>
@@ -800,7 +800,7 @@
             <w:noProof/>
             <w:webHidden/>
           </w:rPr>
-          <w:instrText xml:space="preserve"> PAGEREF _Toc243409799 \h </w:instrText>
+          <w:instrText xml:space="preserve"> PAGEREF _Toc243412947 \h </w:instrText>
         </w:r>
         <w:r>
           <w:rPr>
@@ -841,7 +841,7 @@
           <w:noProof/>
         </w:rPr>
       </w:pPr>
-      <w:hyperlink w:anchor="_Toc243409800" w:history="1">
+      <w:hyperlink w:anchor="_Toc243412948" w:history="1">
         <w:r>
           <w:rPr>
             <w:rStyle w:val="aff8"/>
@@ -868,7 +868,7 @@
             <w:noProof/>
             <w:webHidden/>
           </w:rPr>
-          <w:instrText xml:space="preserve"> PAGEREF _Toc243409800 \h </w:instrText>
+          <w:instrText xml:space="preserve"> PAGEREF _Toc243412948 \h </w:instrText>
         </w:r>
         <w:r>
           <w:rPr>
@@ -909,7 +909,7 @@
           <w:noProof/>
         </w:rPr>
       </w:pPr>
-      <w:hyperlink w:anchor="_Toc243409801" w:history="1">
+      <w:hyperlink w:anchor="_Toc243412949" w:history="1">
         <w:r>
           <w:rPr>
             <w:rStyle w:val="aff8"/>
@@ -936,7 +936,7 @@
             <w:noProof/>
             <w:webHidden/>
           </w:rPr>
-          <w:instrText xml:space="preserve"> PAGEREF _Toc243409801 \h </w:instrText>
+          <w:instrText xml:space="preserve"> PAGEREF _Toc243412949 \h </w:instrText>
         </w:r>
         <w:r>
           <w:rPr>
@@ -977,7 +977,7 @@
           <w:noProof/>
         </w:rPr>
       </w:pPr>
-      <w:hyperlink w:anchor="_Toc243409802" w:history="1">
+      <w:hyperlink w:anchor="_Toc243412950" w:history="1">
         <w:r>
           <w:rPr>
             <w:rStyle w:val="aff8"/>
@@ -1004,7 +1004,7 @@
             <w:noProof/>
             <w:webHidden/>
           </w:rPr>
-          <w:instrText xml:space="preserve"> PAGEREF _Toc243409802 \h </w:instrText>
+          <w:instrText xml:space="preserve"> PAGEREF _Toc243412950 \h </w:instrText>
         </w:r>
         <w:r>
           <w:rPr>
@@ -1045,7 +1045,7 @@
           <w:noProof/>
         </w:rPr>
       </w:pPr>
-      <w:hyperlink w:anchor="_Toc243409803" w:history="1">
+      <w:hyperlink w:anchor="_Toc243412951" w:history="1">
         <w:r>
           <w:rPr>
             <w:rStyle w:val="aff8"/>
@@ -1072,7 +1072,7 @@
             <w:noProof/>
             <w:webHidden/>
           </w:rPr>
-          <w:instrText xml:space="preserve"> PAGEREF _Toc243409803 \h </w:instrText>
+          <w:instrText xml:space="preserve"> PAGEREF _Toc243412951 \h </w:instrText>
         </w:r>
         <w:r>
           <w:rPr>
@@ -1113,7 +1113,7 @@
           <w:noProof/>
         </w:rPr>
       </w:pPr>
-      <w:hyperlink w:anchor="_Toc243409804" w:history="1">
+      <w:hyperlink w:anchor="_Toc243412952" w:history="1">
         <w:r>
           <w:rPr>
             <w:rStyle w:val="aff8"/>
@@ -1140,7 +1140,7 @@
             <w:noProof/>
             <w:webHidden/>
           </w:rPr>
-          <w:instrText xml:space="preserve"> PAGEREF _Toc243409804 \h </w:instrText>
+          <w:instrText xml:space="preserve"> PAGEREF _Toc243412952 \h </w:instrText>
         </w:r>
         <w:r>
           <w:rPr>
@@ -1181,7 +1181,7 @@
           <w:noProof/>
         </w:rPr>
       </w:pPr>
-      <w:hyperlink w:anchor="_Toc243409805" w:history="1">
+      <w:hyperlink w:anchor="_Toc243412953" w:history="1">
         <w:r>
           <w:rPr>
             <w:rStyle w:val="aff8"/>
@@ -1208,7 +1208,7 @@
             <w:noProof/>
             <w:webHidden/>
           </w:rPr>
-          <w:instrText xml:space="preserve"> PAGEREF _Toc243409805 \h </w:instrText>
+          <w:instrText xml:space="preserve"> PAGEREF _Toc243412953 \h </w:instrText>
         </w:r>
         <w:r>
           <w:rPr>
@@ -1249,7 +1249,7 @@
           <w:noProof/>
         </w:rPr>
       </w:pPr>
-      <w:hyperlink w:anchor="_Toc243409806" w:history="1">
+      <w:hyperlink w:anchor="_Toc243412954" w:history="1">
         <w:r>
           <w:rPr>
             <w:rStyle w:val="aff8"/>
@@ -1276,7 +1276,7 @@
             <w:noProof/>
             <w:webHidden/>
           </w:rPr>
-          <w:instrText xml:space="preserve"> PAGEREF _Toc243409806 \h </w:instrText>
+          <w:instrText xml:space="preserve"> PAGEREF _Toc243412954 \h </w:instrText>
         </w:r>
         <w:r>
           <w:rPr>
@@ -1317,7 +1317,7 @@
           <w:noProof/>
         </w:rPr>
       </w:pPr>
-      <w:hyperlink w:anchor="_Toc243409807" w:history="1">
+      <w:hyperlink w:anchor="_Toc243412955" w:history="1">
         <w:r>
           <w:rPr>
             <w:rStyle w:val="aff8"/>
@@ -1344,7 +1344,7 @@
             <w:noProof/>
             <w:webHidden/>
           </w:rPr>
-          <w:instrText xml:space="preserve"> PAGEREF _Toc243409807 \h </w:instrText>
+          <w:instrText xml:space="preserve"> PAGEREF _Toc243412955 \h </w:instrText>
         </w:r>
         <w:r>
           <w:rPr>
@@ -1385,7 +1385,7 @@
           <w:noProof/>
         </w:rPr>
       </w:pPr>
-      <w:hyperlink w:anchor="_Toc243409808" w:history="1">
+      <w:hyperlink w:anchor="_Toc243412956" w:history="1">
         <w:r>
           <w:rPr>
             <w:rStyle w:val="aff8"/>
@@ -1412,7 +1412,7 @@
             <w:noProof/>
             <w:webHidden/>
           </w:rPr>
-          <w:instrText xml:space="preserve"> PAGEREF _Toc243409808 \h </w:instrText>
+          <w:instrText xml:space="preserve"> PAGEREF _Toc243412956 \h </w:instrText>
         </w:r>
         <w:r>
           <w:rPr>
@@ -1453,7 +1453,7 @@
           <w:noProof/>
         </w:rPr>
       </w:pPr>
-      <w:hyperlink w:anchor="_Toc243409809" w:history="1">
+      <w:hyperlink w:anchor="_Toc243412957" w:history="1">
         <w:r>
           <w:rPr>
             <w:rStyle w:val="aff8"/>
@@ -1480,7 +1480,7 @@
             <w:noProof/>
             <w:webHidden/>
           </w:rPr>
-          <w:instrText xml:space="preserve"> PAGEREF _Toc243409809 \h </w:instrText>
+          <w:instrText xml:space="preserve"> PAGEREF _Toc243412957 \h </w:instrText>
         </w:r>
         <w:r>
           <w:rPr>
@@ -1521,7 +1521,7 @@
           <w:noProof/>
         </w:rPr>
       </w:pPr>
-      <w:hyperlink w:anchor="_Toc243409810" w:history="1">
+      <w:hyperlink w:anchor="_Toc243412958" w:history="1">
         <w:r>
           <w:rPr>
             <w:rStyle w:val="aff8"/>
@@ -1548,7 +1548,7 @@
             <w:noProof/>
             <w:webHidden/>
           </w:rPr>
-          <w:instrText xml:space="preserve"> PAGEREF _Toc243409810 \h </w:instrText>
+          <w:instrText xml:space="preserve"> PAGEREF _Toc243412958 \h </w:instrText>
         </w:r>
         <w:r>
           <w:rPr>
@@ -1589,7 +1589,7 @@
           <w:noProof/>
         </w:rPr>
       </w:pPr>
-      <w:hyperlink w:anchor="_Toc243409811" w:history="1">
+      <w:hyperlink w:anchor="_Toc243412959" w:history="1">
         <w:r>
           <w:rPr>
             <w:rStyle w:val="aff8"/>
@@ -1616,7 +1616,7 @@
             <w:noProof/>
             <w:webHidden/>
           </w:rPr>
-          <w:instrText xml:space="preserve"> PAGEREF _Toc243409811 \h </w:instrText>
+          <w:instrText xml:space="preserve"> PAGEREF _Toc243412959 \h </w:instrText>
         </w:r>
         <w:r>
           <w:rPr>
@@ -1657,7 +1657,7 @@
           <w:noProof/>
         </w:rPr>
       </w:pPr>
-      <w:hyperlink w:anchor="_Toc243409812" w:history="1">
+      <w:hyperlink w:anchor="_Toc243412960" w:history="1">
         <w:r>
           <w:rPr>
             <w:rStyle w:val="aff8"/>
@@ -1684,7 +1684,7 @@
             <w:noProof/>
             <w:webHidden/>
           </w:rPr>
-          <w:instrText xml:space="preserve"> PAGEREF _Toc243409812 \h </w:instrText>
+          <w:instrText xml:space="preserve"> PAGEREF _Toc243412960 \h </w:instrText>
         </w:r>
         <w:r>
           <w:rPr>
@@ -1725,7 +1725,7 @@
           <w:noProof/>
         </w:rPr>
       </w:pPr>
-      <w:hyperlink w:anchor="_Toc243409813" w:history="1">
+      <w:hyperlink w:anchor="_Toc243412961" w:history="1">
         <w:r>
           <w:rPr>
             <w:rStyle w:val="aff8"/>
@@ -1752,7 +1752,7 @@
             <w:noProof/>
             <w:webHidden/>
           </w:rPr>
-          <w:instrText xml:space="preserve"> PAGEREF _Toc243409813 \h </w:instrText>
+          <w:instrText xml:space="preserve"> PAGEREF _Toc243412961 \h </w:instrText>
         </w:r>
         <w:r>
           <w:rPr>
@@ -1793,7 +1793,7 @@
           <w:noProof/>
         </w:rPr>
       </w:pPr>
-      <w:hyperlink w:anchor="_Toc243409814" w:history="1">
+      <w:hyperlink w:anchor="_Toc243412962" w:history="1">
         <w:r>
           <w:rPr>
             <w:rStyle w:val="aff8"/>
@@ -1820,7 +1820,7 @@
             <w:noProof/>
             <w:webHidden/>
           </w:rPr>
-          <w:instrText xml:space="preserve"> PAGEREF _Toc243409814 \h </w:instrText>
+          <w:instrText xml:space="preserve"> PAGEREF _Toc243412962 \h </w:instrText>
         </w:r>
         <w:r>
           <w:rPr>
@@ -1861,7 +1861,7 @@
           <w:noProof/>
         </w:rPr>
       </w:pPr>
-      <w:hyperlink w:anchor="_Toc243409815" w:history="1">
+      <w:hyperlink w:anchor="_Toc243412963" w:history="1">
         <w:r>
           <w:rPr>
             <w:rStyle w:val="aff8"/>
@@ -1888,7 +1888,7 @@
             <w:noProof/>
             <w:webHidden/>
           </w:rPr>
-          <w:instrText xml:space="preserve"> PAGEREF _Toc243409815 \h </w:instrText>
+          <w:instrText xml:space="preserve"> PAGEREF _Toc243412963 \h </w:instrText>
         </w:r>
         <w:r>
           <w:rPr>
@@ -1929,7 +1929,7 @@
           <w:noProof/>
         </w:rPr>
       </w:pPr>
-      <w:hyperlink w:anchor="_Toc243409816" w:history="1">
+      <w:hyperlink w:anchor="_Toc243412964" w:history="1">
         <w:r>
           <w:rPr>
             <w:rStyle w:val="aff8"/>
@@ -1956,7 +1956,7 @@
             <w:noProof/>
             <w:webHidden/>
           </w:rPr>
-          <w:instrText xml:space="preserve"> PAGEREF _Toc243409816 \h </w:instrText>
+          <w:instrText xml:space="preserve"> PAGEREF _Toc243412964 \h </w:instrText>
         </w:r>
         <w:r>
           <w:rPr>
@@ -1997,7 +1997,7 @@
           <w:noProof/>
         </w:rPr>
       </w:pPr>
-      <w:hyperlink w:anchor="_Toc243409817" w:history="1">
+      <w:hyperlink w:anchor="_Toc243412965" w:history="1">
         <w:r>
           <w:rPr>
             <w:rStyle w:val="aff8"/>
@@ -2024,7 +2024,7 @@
             <w:noProof/>
             <w:webHidden/>
           </w:rPr>
-          <w:instrText xml:space="preserve"> PAGEREF _Toc243409817 \h </w:instrText>
+          <w:instrText xml:space="preserve"> PAGEREF _Toc243412965 \h </w:instrText>
         </w:r>
         <w:r>
           <w:rPr>
@@ -2065,7 +2065,7 @@
           <w:noProof/>
         </w:rPr>
       </w:pPr>
-      <w:hyperlink w:anchor="_Toc243409818" w:history="1">
+      <w:hyperlink w:anchor="_Toc243412966" w:history="1">
         <w:r>
           <w:rPr>
             <w:rStyle w:val="aff8"/>
@@ -2092,7 +2092,7 @@
             <w:noProof/>
             <w:webHidden/>
           </w:rPr>
-          <w:instrText xml:space="preserve"> PAGEREF _Toc243409818 \h </w:instrText>
+          <w:instrText xml:space="preserve"> PAGEREF _Toc243412966 \h </w:instrText>
         </w:r>
         <w:r>
           <w:rPr>
@@ -2137,7 +2137,7 @@
       <w:pPr>
         <w:pStyle w:val="1"/>
       </w:pPr>
-      <w:bookmarkStart w:id="0" w:name="_Toc243409789"/>
+      <w:bookmarkStart w:id="0" w:name="_Toc243412937"/>
       <w:r>
         <w:lastRenderedPageBreak/>
         <w:t>1. О программе</w:t>
@@ -2642,7 +2642,7 @@
       <w:pPr>
         <w:pStyle w:val="1"/>
       </w:pPr>
-      <w:bookmarkStart w:id="1" w:name="_Toc243409790"/>
+      <w:bookmarkStart w:id="1" w:name="_Toc243412938"/>
       <w:r>
         <w:t>2. Системные требования</w:t>
       </w:r>
@@ -3068,7 +3068,7 @@
       <w:pPr>
         <w:pStyle w:val="1"/>
       </w:pPr>
-      <w:bookmarkStart w:id="2" w:name="_Toc243409791"/>
+      <w:bookmarkStart w:id="2" w:name="_Toc243412939"/>
       <w:r>
         <w:t>3. Установка Geant4</w:t>
       </w:r>
@@ -3078,7 +3078,7 @@
       <w:pPr>
         <w:pStyle w:val="21"/>
       </w:pPr>
-      <w:bookmarkStart w:id="3" w:name="_Toc243409792"/>
+      <w:bookmarkStart w:id="3" w:name="_Toc243412940"/>
       <w:r>
         <w:t>3.1. Установка Geant4</w:t>
       </w:r>
@@ -3373,7 +3373,7 @@
       <w:pPr>
         <w:pStyle w:val="21"/>
       </w:pPr>
-      <w:bookmarkStart w:id="4" w:name="_Toc243409793"/>
+      <w:bookmarkStart w:id="4" w:name="_Toc243412941"/>
       <w:r>
         <w:t>3.2. Установка пакетов данных Geant4</w:t>
       </w:r>
@@ -3818,31 +3818,7 @@
         <w:t>install_data.bat</w:t>
       </w:r>
       <w:r>
-        <w:t xml:space="preserve"> — он распакует пакеты и сам пропишет переменные среды Windows. При первом запуске Windows может показать предупреждение «Windows защищена от запуска незнакомых приложений» — нажмите «Всё равно запустить».</w:t>
-      </w:r>
-    </w:p>
-    <w:p>
-      <w:pPr>
-        <w:spacing w:after="40"/>
-        <w:ind w:left="510" w:hanging="510"/>
-      </w:pPr>
-      <w:r>
-        <w:rPr>
-          <w:b/>
-        </w:rPr>
-        <w:t>4.</w:t>
-      </w:r>
-      <w:r>
-        <w:rPr>
-          <w:b/>
-        </w:rPr>
-        <w:tab/>
-      </w:r>
-      <w:r>
-        <w:t>Дождитесь конца: в конце должно появиться сообщ</w:t>
-      </w:r>
-      <w:r>
-        <w:t xml:space="preserve">ение </w:t>
+        <w:t xml:space="preserve"> — он распакует пакеты в папку </w:t>
       </w:r>
       <w:r>
         <w:rPr>
@@ -3850,10 +3826,34 @@
           <w:sz w:val="18"/>
           <w:shd w:val="clear" w:color="auto" w:fill="F4F4F4"/>
         </w:rPr>
-        <w:t>Готово: установлено 5 из 5 пакетов.</w:t>
-      </w:r>
-      <w:r>
-        <w:t xml:space="preserve"> Если каких-то пакетов не хватило — экран покажет перечень с ссылками: скачайте недостающие файлы, положите рядом с </w:t>
+        <w:t>&lt;каталог Geant4&gt;\data</w:t>
+      </w:r>
+      <w:r>
+        <w:t xml:space="preserve"> (она создаётся автоматически) и сам пропишет переменные среды Windows. При первом запуске Windows может показать предупреждение «Windows защищена от запуска незнакомых приложений» — нажмите «Всё равно запустить».</w:t>
+      </w:r>
+    </w:p>
+    <w:p>
+      <w:pPr>
+        <w:spacing w:after="40"/>
+        <w:ind w:left="510" w:hanging="510"/>
+      </w:pPr>
+      <w:r>
+        <w:rPr>
+          <w:b/>
+        </w:rPr>
+        <w:t>4.</w:t>
+      </w:r>
+      <w:r>
+        <w:rPr>
+          <w:b/>
+        </w:rPr>
+        <w:tab/>
+      </w:r>
+      <w:r>
+        <w:t>Дождитесь конца: в конце должно появить</w:t>
+      </w:r>
+      <w:r>
+        <w:t xml:space="preserve">ся сообщение </w:t>
       </w:r>
       <w:r>
         <w:rPr>
@@ -3861,31 +3861,10 @@
           <w:sz w:val="18"/>
           <w:shd w:val="clear" w:color="auto" w:fill="F4F4F4"/>
         </w:rPr>
-        <w:t>install_data.bat</w:t>
-      </w:r>
-      <w:r>
-        <w:t xml:space="preserve"> и запустите его ещё раз.</w:t>
-      </w:r>
-    </w:p>
-    <w:p>
-      <w:pPr>
-        <w:spacing w:after="40"/>
-        <w:ind w:left="510" w:hanging="510"/>
-      </w:pPr>
-      <w:r>
-        <w:rPr>
-          <w:b/>
-        </w:rPr>
-        <w:t>5.</w:t>
-      </w:r>
-      <w:r>
-        <w:rPr>
-          <w:b/>
-        </w:rPr>
-        <w:tab/>
-      </w:r>
-      <w:r>
-        <w:t xml:space="preserve">Запустите </w:t>
+        <w:t>Готово: установлено 5 из 5 пакетов.</w:t>
+      </w:r>
+      <w:r>
+        <w:t xml:space="preserve"> Если каких-то пакетов не хватило — экран покажет перечень с ссылками: скачайте недостающие файлы, положите рядом с </w:t>
       </w:r>
       <w:r>
         <w:rPr>
@@ -3893,13 +3872,45 @@
           <w:sz w:val="18"/>
           <w:shd w:val="clear" w:color="auto" w:fill="F4F4F4"/>
         </w:rPr>
+        <w:t>install_data.bat</w:t>
+      </w:r>
+      <w:r>
+        <w:t xml:space="preserve"> и запустите его ещё раз.</w:t>
+      </w:r>
+    </w:p>
+    <w:p>
+      <w:pPr>
+        <w:spacing w:after="40"/>
+        <w:ind w:left="510" w:hanging="510"/>
+      </w:pPr>
+      <w:r>
+        <w:rPr>
+          <w:b/>
+        </w:rPr>
+        <w:t>5.</w:t>
+      </w:r>
+      <w:r>
+        <w:rPr>
+          <w:b/>
+        </w:rPr>
+        <w:tab/>
+      </w:r>
+      <w:r>
+        <w:t xml:space="preserve">Запустите </w:t>
+      </w:r>
+      <w:r>
+        <w:rPr>
+          <w:rFonts w:ascii="Consolas" w:hAnsi="Consolas" w:cs="Consolas"/>
+          <w:sz w:val="18"/>
+          <w:shd w:val="clear" w:color="auto" w:fill="F4F4F4"/>
+        </w:rPr>
         <w:t>start.bat</w:t>
       </w:r>
       <w:r>
-        <w:t xml:space="preserve"> (раздел 5.3) — откроется окно прогр</w:t>
-      </w:r>
-      <w:r>
-        <w:t>аммы.</w:t>
+        <w:t xml:space="preserve"> (раздел 5.3) — откроется ок</w:t>
+      </w:r>
+      <w:r>
+        <w:t>но программы.</w:t>
       </w:r>
     </w:p>
     <w:p>
@@ -3960,7 +3971,7 @@
           <w:rFonts w:ascii="Consolas" w:hAnsi="Consolas" w:cs="Consolas"/>
           <w:sz w:val="18"/>
         </w:rPr>
-        <w:t xml:space="preserve"> Папка назначения: C:\Geant4\Geant4-11.4.1\data</w:t>
+        <w:t xml:space="preserve"> Папка назначения: C:\Geant4\data</w:t>
       </w:r>
     </w:p>
     <w:p>
@@ -3975,7 +3986,7 @@
           <w:rFonts w:ascii="Consolas" w:hAnsi="Consolas" w:cs="Consolas"/>
           <w:sz w:val="18"/>
         </w:rPr>
-        <w:t>=============================================================</w:t>
+        <w:t>============================================================</w:t>
       </w:r>
     </w:p>
     <w:p>
@@ -3990,7 +4001,7 @@
           <w:rFonts w:ascii="Consolas" w:hAnsi="Consolas" w:cs="Consolas"/>
           <w:sz w:val="18"/>
         </w:rPr>
-        <w:t xml:space="preserve">  [распаковано] G4EMLOW.8.8 - папка: ...\Geant4-11.4.1\data\G4EMLOW8.8</w:t>
+        <w:t xml:space="preserve">  [распаковано] G4EMLOW.8.8 - папка: ...\data\G4EMLOW8.8</w:t>
       </w:r>
     </w:p>
     <w:p>
@@ -4049,19 +4060,15 @@
           <w:rFonts w:ascii="Consolas" w:hAnsi="Consolas" w:cs="Consolas"/>
           <w:sz w:val="18"/>
         </w:rPr>
-        <w:t>===================================================</w:t>
-      </w:r>
-      <w:r>
-        <w:rPr>
-          <w:rFonts w:ascii="Consolas" w:hAnsi="Consolas" w:cs="Consolas"/>
-          <w:sz w:val="18"/>
-        </w:rPr>
-        <w:t>==========</w:t>
-      </w:r>
-    </w:p>
-    <w:p>
-      <w:r>
-        <w:t xml:space="preserve">Статус </w:t>
+        <w:t>=============================================================</w:t>
+      </w:r>
+    </w:p>
+    <w:p>
+      <w:r>
+        <w:t>Стат</w:t>
+      </w:r>
+      <w:r>
+        <w:t xml:space="preserve">ус </w:t>
       </w:r>
       <w:r>
         <w:rPr>
@@ -4091,18 +4098,13 @@
           <w:sz w:val="18"/>
           <w:shd w:val="clear" w:color="auto" w:fill="F4F4F4"/>
         </w:rPr>
-        <w:t>G4LEDATA data directory was</w:t>
-      </w:r>
-      <w:r>
-        <w:rPr>
-          <w:rFonts w:ascii="Consolas" w:hAnsi="Consolas" w:cs="Consolas"/>
-          <w:sz w:val="18"/>
-          <w:shd w:val="clear" w:color="auto" w:fill="F4F4F4"/>
-        </w:rPr>
-        <w:t xml:space="preserve"> not found</w:t>
-      </w:r>
-      <w:r>
-        <w:t xml:space="preserve"> (или похожую, с другим именем переменной):</w:t>
+        <w:t>G4LEDATA data directory was not found</w:t>
+      </w:r>
+      <w:r>
+        <w:t xml:space="preserve"> (или</w:t>
+      </w:r>
+      <w:r>
+        <w:t xml:space="preserve"> похожую, с другим именем переменной):</w:t>
       </w:r>
     </w:p>
     <w:tbl>
@@ -4249,6 +4251,7 @@
                 <w:sz w:val="18"/>
                 <w:shd w:val="clear" w:color="auto" w:fill="F4F4F4"/>
               </w:rPr>
+              <w:lastRenderedPageBreak/>
               <w:t>G4LEVELGAMMADATA ...</w:t>
             </w:r>
           </w:p>
@@ -4288,7 +4291,6 @@
                 <w:sz w:val="18"/>
                 <w:shd w:val="clear" w:color="auto" w:fill="F4F4F4"/>
               </w:rPr>
-              <w:lastRenderedPageBreak/>
               <w:t>G4ENSDFSTATEDATA ...</w:t>
             </w:r>
           </w:p>
@@ -4441,7 +4443,7 @@
           <w:rFonts w:ascii="Consolas" w:hAnsi="Consolas" w:cs="Consolas"/>
           <w:sz w:val="18"/>
         </w:rPr>
-        <w:t>[Исправлено] создана переменная G4LEDATA = C:\Geant4\Geant4-11.4.1\data\G4EMLOW8.8</w:t>
+        <w:t>[Исправлено] создана переменная G4LEDATA = C:\Geant4\data\G4EMLOW8.8</w:t>
       </w:r>
     </w:p>
     <w:p>
@@ -4472,12 +4474,12 @@
       <w:pPr>
         <w:pStyle w:val="1"/>
       </w:pPr>
-      <w:bookmarkStart w:id="5" w:name="_Toc243409794"/>
-      <w:r>
-        <w:t xml:space="preserve">4. </w:t>
-      </w:r>
-      <w:r>
-        <w:t>Установка Python и зависимостей</w:t>
+      <w:bookmarkStart w:id="5" w:name="_Toc243412942"/>
+      <w:r>
+        <w:t xml:space="preserve">4. Установка Python и </w:t>
+      </w:r>
+      <w:r>
+        <w:t>зависимостей</w:t>
       </w:r>
       <w:bookmarkEnd w:id="5"/>
     </w:p>
@@ -4485,7 +4487,7 @@
       <w:pPr>
         <w:pStyle w:val="21"/>
       </w:pPr>
-      <w:bookmarkStart w:id="6" w:name="_Toc243409795"/>
+      <w:bookmarkStart w:id="6" w:name="_Toc243412943"/>
       <w:r>
         <w:t>4.1. Установка Python</w:t>
       </w:r>
@@ -4569,7 +4571,10 @@
         <w:tab/>
       </w:r>
       <w:r>
-        <w:t>Запустите установщик.</w:t>
+        <w:t xml:space="preserve">Запустите </w:t>
+      </w:r>
+      <w:r>
+        <w:t>установщик.</w:t>
       </w:r>
     </w:p>
     <w:p>
@@ -4611,13 +4616,13 @@
         <w:rPr>
           <w:i/>
         </w:rPr>
-        <w:t>— первое окно установщика, внизу отмечена галоч</w:t>
+        <w:t>— первое окно установщика, внизу отмечена галочка «Add py</w:t>
       </w:r>
       <w:r>
         <w:rPr>
           <w:i/>
         </w:rPr>
-        <w:t>ка «Add python.exe to PATH», затем нажата кнопка «Install Now».</w:t>
+        <w:t>thon.exe to PATH», затем нажата кнопка «Install Now».</w:t>
       </w:r>
     </w:p>
     <w:p>
@@ -4654,7 +4659,7 @@
       <w:pPr>
         <w:pStyle w:val="21"/>
       </w:pPr>
-      <w:bookmarkStart w:id="7" w:name="_Toc243409796"/>
+      <w:bookmarkStart w:id="7" w:name="_Toc243412944"/>
       <w:r>
         <w:t>4.2. Открываем командную строку</w:t>
       </w:r>
@@ -4662,10 +4667,10 @@
     </w:p>
     <w:p>
       <w:r>
-        <w:t>Для установки одной библиотеки (matplotlib) понадобится командная строка — это чёрное окно, куда вводятся текстов</w:t>
-      </w:r>
-      <w:r>
-        <w:t>ые команды. Открывается она так:</w:t>
+        <w:t>Для установки одной библиотеки (matplotlib) понадобится командная строка — это чёрное окно, куда вводятся текстовые команды</w:t>
+      </w:r>
+      <w:r>
+        <w:t>. Открывается она так:</w:t>
       </w:r>
     </w:p>
     <w:p>
@@ -4756,13 +4761,13 @@
         <w:rPr>
           <w:i/>
         </w:rPr>
-        <w:t>— окно Win+</w:t>
+        <w:t xml:space="preserve">— окно Win+R, в поле </w:t>
       </w:r>
       <w:r>
         <w:rPr>
           <w:i/>
         </w:rPr>
-        <w:t>R, в поле «Открыть» набрано cmd.</w:t>
+        <w:t>«Открыть» набрано cmd.</w:t>
       </w:r>
     </w:p>
     <w:p>
@@ -4810,7 +4815,7 @@
       <w:pPr>
         <w:pStyle w:val="21"/>
       </w:pPr>
-      <w:bookmarkStart w:id="8" w:name="_Toc243409797"/>
+      <w:bookmarkStart w:id="8" w:name="_Toc243412945"/>
       <w:r>
         <w:t>4.3. Проверка, что Python установлен</w:t>
       </w:r>
@@ -4818,10 +4823,10 @@
     </w:p>
     <w:p>
       <w:r>
-        <w:t>В командной</w:t>
-      </w:r>
-      <w:r>
-        <w:t xml:space="preserve"> строке введите (можно скопировать и вставить) и нажмите Enter:</w:t>
+        <w:t>В командной строке вв</w:t>
+      </w:r>
+      <w:r>
+        <w:t>едите (можно скопировать и вставить) и нажмите Enter:</w:t>
       </w:r>
     </w:p>
     <w:p>
@@ -4871,10 +4876,10 @@
         <w:t>Python 3.11.x</w:t>
       </w:r>
       <w:r>
-        <w:t xml:space="preserve"> или старше — скачайте и переустановите Python, не забыв про галочку </w:t>
-      </w:r>
-      <w:r>
-        <w:t>«Add python.exe to PATH».</w:t>
+        <w:t xml:space="preserve"> или старше — скачайте и переустановите Python, не забыв про галочку «Add pytho</w:t>
+      </w:r>
+      <w:r>
+        <w:t>n.exe to PATH».</w:t>
       </w:r>
     </w:p>
     <w:p>
@@ -4886,7 +4891,7 @@
       <w:pPr>
         <w:pStyle w:val="21"/>
       </w:pPr>
-      <w:bookmarkStart w:id="9" w:name="_Toc243409798"/>
+      <w:bookmarkStart w:id="9" w:name="_Toc243412946"/>
       <w:r>
         <w:t>4.4. Установка matplotlib</w:t>
       </w:r>
@@ -4975,7 +4980,7 @@
       <w:pPr>
         <w:pStyle w:val="21"/>
       </w:pPr>
-      <w:bookmarkStart w:id="10" w:name="_Toc243409799"/>
+      <w:bookmarkStart w:id="10" w:name="_Toc243412947"/>
       <w:r>
         <w:t>4.5. Закройте командную строку</w:t>
       </w:r>
@@ -5001,7 +5006,7 @@
       <w:pPr>
         <w:pStyle w:val="1"/>
       </w:pPr>
-      <w:bookmarkStart w:id="11" w:name="_Toc243409800"/>
+      <w:bookmarkStart w:id="11" w:name="_Toc243412948"/>
       <w:r>
         <w:t>5. Скачивание и запуск программы</w:t>
       </w:r>
@@ -5011,7 +5016,7 @@
       <w:pPr>
         <w:pStyle w:val="21"/>
       </w:pPr>
-      <w:bookmarkStart w:id="12" w:name="_Toc243409801"/>
+      <w:bookmarkStart w:id="12" w:name="_Toc243412949"/>
       <w:r>
         <w:t>5.1. Скачивание</w:t>
       </w:r>
@@ -5061,7 +5066,7 @@
       <w:pPr>
         <w:pStyle w:val="21"/>
       </w:pPr>
-      <w:bookmarkStart w:id="13" w:name="_Toc243409802"/>
+      <w:bookmarkStart w:id="13" w:name="_Toc243412950"/>
       <w:r>
         <w:t>5.2. Распаковка</w:t>
       </w:r>
@@ -5249,7 +5254,7 @@
       <w:pPr>
         <w:pStyle w:val="21"/>
       </w:pPr>
-      <w:bookmarkStart w:id="14" w:name="_Toc243409803"/>
+      <w:bookmarkStart w:id="14" w:name="_Toc243412951"/>
       <w:r>
         <w:t>5.3. Запуск</w:t>
       </w:r>
@@ -5516,7 +5521,7 @@
       <w:pPr>
         <w:pStyle w:val="1"/>
       </w:pPr>
-      <w:bookmarkStart w:id="15" w:name="_Toc243409804"/>
+      <w:bookmarkStart w:id="15" w:name="_Toc243412952"/>
       <w:r>
         <w:t>6. Программа: устройство и пример расчёта</w:t>
       </w:r>
@@ -5526,7 +5531,7 @@
       <w:pPr>
         <w:pStyle w:val="21"/>
       </w:pPr>
-      <w:bookmarkStart w:id="16" w:name="_Toc243409805"/>
+      <w:bookmarkStart w:id="16" w:name="_Toc243412953"/>
       <w:r>
         <w:t>6.</w:t>
       </w:r>
@@ -5835,7 +5840,7 @@
       <w:pPr>
         <w:pStyle w:val="21"/>
       </w:pPr>
-      <w:bookmarkStart w:id="17" w:name="_Toc243409806"/>
+      <w:bookmarkStart w:id="17" w:name="_Toc243412954"/>
       <w:r>
         <w:t>6.2. Пример: Lu-177 в стакане</w:t>
       </w:r>
@@ -6466,7 +6471,7 @@
       <w:pPr>
         <w:pStyle w:val="21"/>
       </w:pPr>
-      <w:bookmarkStart w:id="18" w:name="_Toc243409807"/>
+      <w:bookmarkStart w:id="18" w:name="_Toc243412955"/>
       <w:r>
         <w:t>6.3. К</w:t>
       </w:r>
@@ -7001,7 +7006,7 @@
       <w:pPr>
         <w:pStyle w:val="21"/>
       </w:pPr>
-      <w:bookmarkStart w:id="19" w:name="_Toc243409808"/>
+      <w:bookmarkStart w:id="19" w:name="_Toc243412956"/>
       <w:r>
         <w:t>6.4. Где сохраняются результаты</w:t>
       </w:r>
@@ -7105,7 +7110,7 @@
       <w:pPr>
         <w:pStyle w:val="1"/>
       </w:pPr>
-      <w:bookmarkStart w:id="20" w:name="_Toc243409809"/>
+      <w:bookmarkStart w:id="20" w:name="_Toc243412957"/>
       <w:r>
         <w:t>7. Если что-то пошло не так</w:t>
       </w:r>
@@ -7115,7 +7120,7 @@
       <w:pPr>
         <w:pStyle w:val="21"/>
       </w:pPr>
-      <w:bookmarkStart w:id="21" w:name="_Toc243409810"/>
+      <w:bookmarkStart w:id="21" w:name="_Toc243412958"/>
       <w:r>
         <w:t>7.1. Сообщения start.bat</w:t>
       </w:r>
@@ -7524,7 +7529,7 @@
       <w:pPr>
         <w:pStyle w:val="21"/>
       </w:pPr>
-      <w:bookmarkStart w:id="22" w:name="_Toc243409811"/>
+      <w:bookmarkStart w:id="22" w:name="_Toc243412959"/>
       <w:r>
         <w:t>7.2. Ошибки Geant4 при расчёте</w:t>
       </w:r>
@@ -7848,7 +7853,7 @@
       <w:pPr>
         <w:pStyle w:val="21"/>
       </w:pPr>
-      <w:bookmarkStart w:id="23" w:name="_Toc243409812"/>
+      <w:bookmarkStart w:id="23" w:name="_Toc243412960"/>
       <w:r>
         <w:t>7.3. Окно программы открылось, но что-то не так</w:t>
       </w:r>
@@ -8000,10 +8005,10 @@
               <w:spacing w:after="40"/>
             </w:pPr>
             <w:r>
-              <w:t>Программа «зависла</w:t>
+              <w:t xml:space="preserve">Программа </w:t>
             </w:r>
             <w:r>
-              <w:t>» на прогресс-баре</w:t>
+              <w:t>«зависла» на прогресс-баре</w:t>
             </w:r>
           </w:p>
         </w:tc>
@@ -8051,7 +8056,10 @@
               <w:cnfStyle w:val="000000010000" w:firstRow="0" w:lastRow="0" w:firstColumn="0" w:lastColumn="0" w:oddVBand="0" w:evenVBand="0" w:oddHBand="0" w:evenHBand="1" w:firstRowFirstColumn="0" w:firstRowLastColumn="0" w:lastRowFirstColumn="0" w:lastRowLastColumn="0"/>
             </w:pPr>
             <w:r>
-              <w:t xml:space="preserve">Запустите start.bat через правую кнопку мыши → «Запуск от имени администратора». Если окно всё равно закрывается — запустите его из командной строки, чтобы увидеть текст ошибки: Win+R → </w:t>
+              <w:t>Запустите start.bat через правую кнопку мыши → «Запуск от имени адми</w:t>
+            </w:r>
+            <w:r>
+              <w:t xml:space="preserve">нистратора». Если окно всё равно закрывается — запустите его из командной строки, чтобы увидеть текст ошибки: Win+R → </w:t>
             </w:r>
             <w:r>
               <w:rPr>
@@ -8100,25 +8108,25 @@
       <w:pPr>
         <w:pStyle w:val="1"/>
       </w:pPr>
-      <w:bookmarkStart w:id="24" w:name="_Toc243409813"/>
-      <w:r>
-        <w:t xml:space="preserve">8. </w:t>
-      </w:r>
-      <w:r>
-        <w:t>Приложение для опытных пользователей</w:t>
+      <w:bookmarkStart w:id="24" w:name="_Toc243412961"/>
+      <w:r>
+        <w:t>8. Приложение для опытных пользователей</w:t>
       </w:r>
       <w:bookmarkEnd w:id="24"/>
     </w:p>
     <w:p>
       <w:r>
-        <w:t>Разделы ниже не нужны для обычной работы; они пригодятся, если потребуется запускать расчёты без интерфейса или разбираться в устройстве установки Geant4.</w:t>
+        <w:t xml:space="preserve">Разделы ниже не нужны для обычной </w:t>
+      </w:r>
+      <w:r>
+        <w:t>работы; они пригодятся, если потребуется запускать расчёты без интерфейса или разбираться в устройстве установки Geant4.</w:t>
       </w:r>
     </w:p>
     <w:p>
       <w:pPr>
         <w:pStyle w:val="21"/>
       </w:pPr>
-      <w:bookmarkStart w:id="25" w:name="_Toc243409814"/>
+      <w:bookmarkStart w:id="25" w:name="_Toc243412962"/>
       <w:r>
         <w:t>8.1. Пакетный режим (без графического интерфейса)</w:t>
       </w:r>
@@ -8134,10 +8142,7 @@
         <w:t>main.exe</w:t>
       </w:r>
       <w:r>
-        <w:t xml:space="preserve"> умеет</w:t>
-      </w:r>
-      <w:r>
-        <w:t xml:space="preserve"> работать по файлу-макросу:</w:t>
+        <w:t xml:space="preserve"> умеет работать по файлу-макросу:</w:t>
       </w:r>
     </w:p>
     <w:p>
@@ -8182,14 +8187,7 @@
           <w:rFonts w:ascii="Consolas" w:hAnsi="Consolas" w:cs="Consolas"/>
           <w:sz w:val="18"/>
         </w:rPr>
-        <w:t>/myDetector/setGeometry        cylind</w:t>
-      </w:r>
-      <w:r>
-        <w:rPr>
-          <w:rFonts w:ascii="Consolas" w:hAnsi="Consolas" w:cs="Consolas"/>
-          <w:sz w:val="18"/>
-        </w:rPr>
-        <w:t>er | beaker | tube</w:t>
+        <w:t>/myDetector/setGeometry        cylinder | beaker | tube</w:t>
       </w:r>
     </w:p>
     <w:p>
@@ -8219,7 +8217,14 @@
           <w:rFonts w:ascii="Consolas" w:hAnsi="Consolas" w:cs="Consolas"/>
           <w:sz w:val="18"/>
         </w:rPr>
-        <w:t>/myDetector/setHalfHeight      3 cm</w:t>
+        <w:t>/myDetector/setH</w:t>
+      </w:r>
+      <w:r>
+        <w:rPr>
+          <w:rFonts w:ascii="Consolas" w:hAnsi="Consolas" w:cs="Consolas"/>
+          <w:sz w:val="18"/>
+        </w:rPr>
+        <w:t>alfHeight      3 cm</w:t>
       </w:r>
     </w:p>
     <w:p>
@@ -8324,7 +8329,14 @@
           <w:rFonts w:ascii="Consolas" w:hAnsi="Consolas" w:cs="Consolas"/>
           <w:sz w:val="18"/>
         </w:rPr>
-        <w:t>/mySpectrum/enable</w:t>
+        <w:t>/mySpectrum/e</w:t>
+      </w:r>
+      <w:r>
+        <w:rPr>
+          <w:rFonts w:ascii="Consolas" w:hAnsi="Consolas" w:cs="Consolas"/>
+          <w:sz w:val="18"/>
+        </w:rPr>
+        <w:t>nable</w:t>
       </w:r>
     </w:p>
     <w:p>
@@ -8422,7 +8434,7 @@
       <w:pPr>
         <w:pStyle w:val="21"/>
       </w:pPr>
-      <w:bookmarkStart w:id="26" w:name="_Toc243409815"/>
+      <w:bookmarkStart w:id="26" w:name="_Toc243412963"/>
       <w:r>
         <w:t>8.2. Интерактивный режим с визуализацией</w:t>
       </w:r>
@@ -8474,7 +8486,34 @@
           <w:sz w:val="18"/>
           <w:shd w:val="clear" w:color="auto" w:fill="F4F4F4"/>
         </w:rPr>
-        <w:t>g</w:t>
+        <w:t>gui.mac</w:t>
+      </w:r>
+      <w:r>
+        <w:t xml:space="preserve"> ищутся в текущем каталоге.</w:t>
+      </w:r>
+    </w:p>
+    <w:p>
+      <w:pPr>
+        <w:pStyle w:val="21"/>
+      </w:pPr>
+      <w:bookmarkStart w:id="27" w:name="_Toc243412964"/>
+      <w:r>
+        <w:t>8.3. Ручная распаковка пакетов и переменны</w:t>
+      </w:r>
+      <w:r>
+        <w:t>е G4*DATA</w:t>
+      </w:r>
+      <w:bookmarkEnd w:id="27"/>
+    </w:p>
+    <w:p>
+      <w:r>
+        <w:rPr>
+          <w:b/>
+        </w:rPr>
+        <w:t>Распаковка вручную.</w:t>
+      </w:r>
+      <w:r>
+        <w:t xml:space="preserve"> Обычно пакеты ставит </w:t>
       </w:r>
       <w:r>
         <w:rPr>
@@ -8482,31 +8521,10 @@
           <w:sz w:val="18"/>
           <w:shd w:val="clear" w:color="auto" w:fill="F4F4F4"/>
         </w:rPr>
-        <w:t>ui.mac</w:t>
-      </w:r>
-      <w:r>
-        <w:t xml:space="preserve"> ищутся в текущем каталоге.</w:t>
-      </w:r>
-    </w:p>
-    <w:p>
-      <w:pPr>
-        <w:pStyle w:val="21"/>
-      </w:pPr>
-      <w:bookmarkStart w:id="27" w:name="_Toc243409816"/>
-      <w:r>
-        <w:t>8.3. Ручная распаковка пакетов и переменные G4*DATA</w:t>
-      </w:r>
-      <w:bookmarkEnd w:id="27"/>
-    </w:p>
-    <w:p>
-      <w:r>
-        <w:rPr>
-          <w:b/>
-        </w:rPr>
-        <w:t>Распаковка вручную.</w:t>
-      </w:r>
-      <w:r>
-        <w:t xml:space="preserve"> Обычно пакеты ставит </w:t>
+        <w:t>install_data.bat</w:t>
+      </w:r>
+      <w:r>
+        <w:t xml:space="preserve"> (раздел 3.2) — ручной способ нужен, только если он по каким-то причинам не подходит. Файл пакета имеет расширение </w:t>
       </w:r>
       <w:r>
         <w:rPr>
@@ -8514,13 +8532,13 @@
           <w:sz w:val="18"/>
           <w:shd w:val="clear" w:color="auto" w:fill="F4F4F4"/>
         </w:rPr>
-        <w:t>install_data.bat</w:t>
-      </w:r>
-      <w:r>
-        <w:t xml:space="preserve"> (раздел 3.2) — ручной способ нужен, только если он по каким-то причинам не подходит. Файл пакета имеет расширени</w:t>
-      </w:r>
-      <w:r>
-        <w:t xml:space="preserve">е </w:t>
+        <w:t>.tar.gz</w:t>
+      </w:r>
+      <w:r>
+        <w:t>: Windows 11 открывает такие архивы прямо в Проводнике (правая кноп</w:t>
+      </w:r>
+      <w:r>
+        <w:t xml:space="preserve">ка → «Извлечь всё»), а в Windows 10 встроенной поддержки нет — там пригодится бесплатный 7-Zip (описан ниже). Способ, работающий в обеих системах, — команда </w:t>
       </w:r>
       <w:r>
         <w:rPr>
@@ -8528,10 +8546,40 @@
           <w:sz w:val="18"/>
           <w:shd w:val="clear" w:color="auto" w:fill="F4F4F4"/>
         </w:rPr>
-        <w:t>.tar.gz</w:t>
-      </w:r>
-      <w:r>
-        <w:t xml:space="preserve">: Windows 11 открывает такие архивы прямо в Проводнике (правая кнопка → «Извлечь всё»), а в Windows 10 встроенной поддержки нет — там пригодится бесплатный 7-Zip (описан ниже). Способ, работающий в обеих системах, — команда </w:t>
+        <w:t>tar</w:t>
+      </w:r>
+      <w:r>
+        <w:t>, встроенная в Windows 10/11:</w:t>
+      </w:r>
+    </w:p>
+    <w:p>
+      <w:pPr>
+        <w:spacing w:after="40"/>
+        <w:ind w:left="510" w:hanging="510"/>
+      </w:pPr>
+      <w:r>
+        <w:rPr>
+          <w:b/>
+        </w:rPr>
+        <w:t>1.</w:t>
+      </w:r>
+      <w:r>
+        <w:rPr>
+          <w:b/>
+        </w:rPr>
+        <w:tab/>
+      </w:r>
+      <w:r>
+        <w:t xml:space="preserve">Откройте командную строку: </w:t>
+      </w:r>
+      <w:r>
+        <w:rPr>
+          <w:b/>
+        </w:rPr>
+        <w:t>Win + R</w:t>
+      </w:r>
+      <w:r>
+        <w:t xml:space="preserve"> → </w:t>
       </w:r>
       <w:r>
         <w:rPr>
@@ -8539,13 +8587,10 @@
           <w:sz w:val="18"/>
           <w:shd w:val="clear" w:color="auto" w:fill="F4F4F4"/>
         </w:rPr>
-        <w:t>tar</w:t>
-      </w:r>
-      <w:r>
-        <w:t>, встроенная в Windo</w:t>
-      </w:r>
-      <w:r>
-        <w:t>ws 10/11:</w:t>
+        <w:t>cmd</w:t>
+      </w:r>
+      <w:r>
+        <w:t xml:space="preserve"> → Enter (как в разделе 4.2).</w:t>
       </w:r>
     </w:p>
     <w:p>
@@ -8557,7 +8602,7 @@
         <w:rPr>
           <w:b/>
         </w:rPr>
-        <w:t>1.</w:t>
+        <w:t>2.</w:t>
       </w:r>
       <w:r>
         <w:rPr>
@@ -8566,135 +8611,109 @@
         <w:tab/>
       </w:r>
       <w:r>
-        <w:t xml:space="preserve">Откройте командную строку: </w:t>
-      </w:r>
+        <w:t>Перейдите в папку данных Geant4 (путь подставьте свой):</w:t>
+      </w:r>
+    </w:p>
+    <w:p>
+      <w:pPr>
+        <w:shd w:val="clear" w:color="auto" w:fill="F4F4F4"/>
+        <w:spacing w:before="120" w:line="240" w:lineRule="auto"/>
+        <w:ind w:left="227"/>
+      </w:pPr>
+      <w:r>
+        <w:rPr>
+          <w:rFonts w:ascii="Consolas" w:hAnsi="Consolas" w:cs="Consolas"/>
+          <w:sz w:val="18"/>
+        </w:rPr>
+        <w:t xml:space="preserve">   cd /d "C:\Geant4\data"</w:t>
+      </w:r>
+    </w:p>
+    <w:p>
+      <w:pPr>
+        <w:spacing w:after="40"/>
+        <w:ind w:left="510" w:hanging="510"/>
+      </w:pPr>
       <w:r>
         <w:rPr>
           <w:b/>
         </w:rPr>
-        <w:t>Win + R</w:t>
-      </w:r>
-      <w:r>
-        <w:t xml:space="preserve"> → </w:t>
-      </w:r>
+        <w:t>3.</w:t>
+      </w:r>
+      <w:r>
+        <w:rPr>
+          <w:b/>
+        </w:rPr>
+        <w:tab/>
+      </w:r>
+      <w:r>
+        <w:t>Распакуйте скачанный файл (путь подставьте свой, обычно это папка «Загрузки»):</w:t>
+      </w:r>
+    </w:p>
+    <w:p>
+      <w:pPr>
+        <w:shd w:val="clear" w:color="auto" w:fill="F4F4F4"/>
+        <w:spacing w:before="120" w:line="240" w:lineRule="auto"/>
+        <w:ind w:left="227"/>
+      </w:pPr>
+      <w:r>
+        <w:rPr>
+          <w:rFonts w:ascii="Consolas" w:hAnsi="Consolas" w:cs="Consolas"/>
+          <w:sz w:val="18"/>
+        </w:rPr>
+        <w:lastRenderedPageBreak/>
+        <w:t xml:space="preserve">   tar -xzf "C:\Users\&lt;имя пользователя&gt;\Downloads\G4EMLOW.</w:t>
+      </w:r>
+      <w:r>
+        <w:rPr>
+          <w:rFonts w:ascii="Consolas" w:hAnsi="Consolas" w:cs="Consolas"/>
+          <w:sz w:val="18"/>
+        </w:rPr>
+        <w:t>8.8.tar.gz"</w:t>
+      </w:r>
+    </w:p>
+    <w:p>
+      <w:pPr>
+        <w:spacing w:after="40"/>
+        <w:ind w:left="510" w:hanging="510"/>
+      </w:pPr>
+      <w:r>
+        <w:rPr>
+          <w:b/>
+        </w:rPr>
+        <w:t>4.</w:t>
+      </w:r>
+      <w:r>
+        <w:rPr>
+          <w:b/>
+        </w:rPr>
+        <w:tab/>
+      </w:r>
+      <w:r>
+        <w:t>Повторите команду для каждого скачанного пакета — у каждого свой путь к файлу.</w:t>
+      </w:r>
+    </w:p>
+    <w:p>
       <w:r>
         <w:rPr>
           <w:rFonts w:ascii="Consolas" w:hAnsi="Consolas" w:cs="Consolas"/>
           <w:sz w:val="18"/>
           <w:shd w:val="clear" w:color="auto" w:fill="F4F4F4"/>
         </w:rPr>
-        <w:t>cmd</w:t>
-      </w:r>
-      <w:r>
-        <w:t xml:space="preserve"> → Enter (как в разделе 4.2).</w:t>
-      </w:r>
-    </w:p>
-    <w:p>
-      <w:pPr>
-        <w:spacing w:after="40"/>
-        <w:ind w:left="510" w:hanging="510"/>
-      </w:pPr>
-      <w:r>
-        <w:rPr>
-          <w:b/>
-        </w:rPr>
-        <w:t>2.</w:t>
-      </w:r>
-      <w:r>
-        <w:rPr>
-          <w:b/>
-        </w:rPr>
-        <w:tab/>
-      </w:r>
-      <w:r>
-        <w:t>Перейдите в папку данных Geant4 (путь подставьте свой):</w:t>
-      </w:r>
-    </w:p>
-    <w:p>
-      <w:pPr>
-        <w:shd w:val="clear" w:color="auto" w:fill="F4F4F4"/>
-        <w:spacing w:before="120" w:line="240" w:lineRule="auto"/>
-        <w:ind w:left="227"/>
-      </w:pPr>
-      <w:r>
-        <w:rPr>
-          <w:rFonts w:ascii="Consolas" w:hAnsi="Consolas" w:cs="Consolas"/>
-          <w:sz w:val="18"/>
-        </w:rPr>
-        <w:t xml:space="preserve">   cd /d "C:\Geant4\share\Geant4\data"</w:t>
-      </w:r>
-    </w:p>
-    <w:p>
-      <w:pPr>
-        <w:spacing w:after="40"/>
-        <w:ind w:left="510" w:hanging="510"/>
-      </w:pPr>
-      <w:r>
-        <w:rPr>
-          <w:b/>
-        </w:rPr>
-        <w:t>3.</w:t>
-      </w:r>
-      <w:r>
-        <w:rPr>
-          <w:b/>
-        </w:rPr>
-        <w:tab/>
-      </w:r>
-      <w:r>
-        <w:t xml:space="preserve">Распакуйте скачанный файл (путь подставьте свой, обычно это папка </w:t>
-      </w:r>
-      <w:r>
-        <w:t>«Загрузки»):</w:t>
-      </w:r>
-    </w:p>
-    <w:p>
-      <w:pPr>
-        <w:shd w:val="clear" w:color="auto" w:fill="F4F4F4"/>
-        <w:spacing w:before="120" w:line="240" w:lineRule="auto"/>
-        <w:ind w:left="227"/>
-      </w:pPr>
-      <w:r>
-        <w:rPr>
-          <w:rFonts w:ascii="Consolas" w:hAnsi="Consolas" w:cs="Consolas"/>
-          <w:sz w:val="18"/>
-        </w:rPr>
-        <w:lastRenderedPageBreak/>
-        <w:t xml:space="preserve">   tar -xzf "C:\Users\&lt;имя пользователя&gt;\Downloads\G4EMLOW.8.8.tar.gz"</w:t>
-      </w:r>
-    </w:p>
-    <w:p>
-      <w:pPr>
-        <w:spacing w:after="40"/>
-        <w:ind w:left="510" w:hanging="510"/>
-      </w:pPr>
-      <w:r>
-        <w:rPr>
-          <w:b/>
-        </w:rPr>
-        <w:t>4.</w:t>
-      </w:r>
-      <w:r>
-        <w:rPr>
-          <w:b/>
-        </w:rPr>
-        <w:tab/>
-      </w:r>
-      <w:r>
-        <w:t>Повторите команду для каждого скачанного пакета — у каждого свой путь к файлу.</w:t>
-      </w:r>
-    </w:p>
-    <w:p>
+        <w:t>start.bat</w:t>
+      </w:r>
+      <w:r>
+        <w:t xml:space="preserve"> ищет папки в </w:t>
+      </w:r>
       <w:r>
         <w:rPr>
           <w:rFonts w:ascii="Consolas" w:hAnsi="Consolas" w:cs="Consolas"/>
           <w:sz w:val="18"/>
           <w:shd w:val="clear" w:color="auto" w:fill="F4F4F4"/>
         </w:rPr>
-        <w:t>start.bat</w:t>
-      </w:r>
-      <w:r>
-        <w:t xml:space="preserve"> ищет папки данных и в </w:t>
+        <w:t>&lt;каталог Geant4&gt;\data</w:t>
+      </w:r>
+      <w:r>
+        <w:t xml:space="preserve"> - там, куда их ставит </w:t>
       </w:r>
       <w:r>
         <w:rPr>
@@ -8702,10 +8721,10 @@
           <w:sz w:val="18"/>
           <w:shd w:val="clear" w:color="auto" w:fill="F4F4F4"/>
         </w:rPr>
-        <w:t>share\Geant4\data</w:t>
-      </w:r>
-      <w:r>
-        <w:t xml:space="preserve">, и в </w:t>
+        <w:t>install_data.bat</w:t>
+      </w:r>
+      <w:r>
+        <w:t xml:space="preserve">, - и запасным вариантом в </w:t>
       </w:r>
       <w:r>
         <w:rPr>
@@ -8713,7 +8732,27 @@
           <w:sz w:val="18"/>
           <w:shd w:val="clear" w:color="auto" w:fill="F4F4F4"/>
         </w:rPr>
-        <w:t>&lt;каталог Geant4&gt;\Geant4-&lt;версия&gt;\da</w:t>
+        <w:t>share\Geant4\data</w:t>
+      </w:r>
+      <w:r>
+        <w:t xml:space="preserve"> (если пакеты поставил установщик G</w:t>
+      </w:r>
+      <w:r>
+        <w:t>eant4).</w:t>
+      </w:r>
+    </w:p>
+    <w:p>
+      <w:r>
+        <w:t xml:space="preserve">Если командная строка пугает — распакуйте через бесплатный архиватор 7-Zip: правая кнопка мыши по файлу → </w:t>
+      </w:r>
+      <w:r>
+        <w:rPr>
+          <w:b/>
+        </w:rPr>
+        <w:t>7-Zip → «Извлечь сюда»</w:t>
+      </w:r>
+      <w:r>
+        <w:t xml:space="preserve">, затем перенесите появившуюся папку (например </w:t>
       </w:r>
       <w:r>
         <w:rPr>
@@ -8721,10 +8760,24 @@
           <w:sz w:val="18"/>
           <w:shd w:val="clear" w:color="auto" w:fill="F4F4F4"/>
         </w:rPr>
-        <w:t>ta</w:t>
-      </w:r>
-      <w:r>
-        <w:t xml:space="preserve"> (туда ставит пакеты </w:t>
+        <w:t>G4EMLOW8.8</w:t>
+      </w:r>
+      <w:r>
+        <w:t>) в папку данных Geant4.</w:t>
+      </w:r>
+    </w:p>
+    <w:p>
+      <w:r>
+        <w:rPr>
+          <w:b/>
+        </w:rPr>
+        <w:t>Переменные среды.</w:t>
+      </w:r>
+      <w:r>
+        <w:t xml:space="preserve"> Переменные окружения</w:t>
+      </w:r>
+      <w:r>
+        <w:t xml:space="preserve"> — это записи в системе Windows, которые указывают программам, где лежат файлы. Geant4 использует переменные вида </w:t>
       </w:r>
       <w:r>
         <w:rPr>
@@ -8732,27 +8785,10 @@
           <w:sz w:val="18"/>
           <w:shd w:val="clear" w:color="auto" w:fill="F4F4F4"/>
         </w:rPr>
-        <w:t>install_data.bat</w:t>
-      </w:r>
-      <w:r>
-        <w:t>) — распаковывать в любую из этих папок, результат одинаков.</w:t>
-      </w:r>
-    </w:p>
-    <w:p>
-      <w:r>
-        <w:t xml:space="preserve">Если командная строка пугает — распакуйте через бесплатный архиватор 7-Zip: правая кнопка мыши по файлу → </w:t>
-      </w:r>
-      <w:r>
-        <w:rPr>
-          <w:b/>
-        </w:rPr>
-        <w:t>7-Zip → «Извлечь сюда»</w:t>
-      </w:r>
-      <w:r>
-        <w:t>, затем перенесите появившую</w:t>
-      </w:r>
-      <w:r>
-        <w:t xml:space="preserve">ся папку (например </w:t>
+        <w:t>G4*DATA</w:t>
+      </w:r>
+      <w:r>
+        <w:t xml:space="preserve">: например, </w:t>
       </w:r>
       <w:r>
         <w:rPr>
@@ -8760,21 +8796,10 @@
           <w:sz w:val="18"/>
           <w:shd w:val="clear" w:color="auto" w:fill="F4F4F4"/>
         </w:rPr>
-        <w:t>G4EMLOW8.8</w:t>
-      </w:r>
-      <w:r>
-        <w:t>) в папку данных Geant4.</w:t>
-      </w:r>
-    </w:p>
-    <w:p>
-      <w:r>
-        <w:rPr>
-          <w:b/>
-        </w:rPr>
-        <w:t>Переменные среды.</w:t>
-      </w:r>
-      <w:r>
-        <w:t xml:space="preserve"> Переменные окружения — это записи в системе Windows, которые указывают программам, где лежат файлы. Geant4 использует переменные вида </w:t>
+        <w:t>G4RADIOACTIVEDATA</w:t>
+      </w:r>
+      <w:r>
+        <w:t xml:space="preserve"> указывает на папку со схемами распадов, </w:t>
       </w:r>
       <w:r>
         <w:rPr>
@@ -8782,10 +8807,62 @@
           <w:sz w:val="18"/>
           <w:shd w:val="clear" w:color="auto" w:fill="F4F4F4"/>
         </w:rPr>
-        <w:t>G4*DATA</w:t>
-      </w:r>
-      <w:r>
-        <w:t xml:space="preserve">: например, </w:t>
+        <w:t>G4LEVELGAMMADATA</w:t>
+      </w:r>
+      <w:r>
+        <w:t xml:space="preserve"> — на папку с уровнями дочерних ядер.</w:t>
+      </w:r>
+    </w:p>
+    <w:p>
+      <w:r>
+        <w:t>Обычно пере</w:t>
+      </w:r>
+      <w:r>
+        <w:t xml:space="preserve">менные создаёт установщик Geant4, но при установке без пакетов данных их может не оказаться. </w:t>
+      </w:r>
+      <w:r>
+        <w:rPr>
+          <w:b/>
+        </w:rPr>
+        <w:t>Проще всего не трогать их руками: запустите `install_data.bat`, а затем `start.bat`</w:t>
+      </w:r>
+      <w:r>
+        <w:t xml:space="preserve"> — они сами найдут папки данных и создадут недостающие переменные (раздел 3.2).</w:t>
+      </w:r>
+    </w:p>
+    <w:p>
+      <w:r>
+        <w:t>Если нужно посмотреть или создать переменную вручную:</w:t>
+      </w:r>
+    </w:p>
+    <w:p>
+      <w:pPr>
+        <w:spacing w:after="40"/>
+        <w:ind w:left="510" w:hanging="510"/>
+      </w:pPr>
+      <w:r>
+        <w:rPr>
+          <w:b/>
+        </w:rPr>
+        <w:t>1.</w:t>
+      </w:r>
+      <w:r>
+        <w:rPr>
+          <w:b/>
+        </w:rPr>
+        <w:tab/>
+      </w:r>
+      <w:r>
+        <w:t xml:space="preserve">Нажмите </w:t>
+      </w:r>
+      <w:r>
+        <w:rPr>
+          <w:b/>
+        </w:rPr>
+        <w:t>Win + R</w:t>
+      </w:r>
+      <w:r>
+        <w:t xml:space="preserve">, введите </w:t>
       </w:r>
       <w:r>
         <w:rPr>
@@ -8793,13 +8870,52 @@
           <w:sz w:val="18"/>
           <w:shd w:val="clear" w:color="auto" w:fill="F4F4F4"/>
         </w:rPr>
-        <w:t>G4RADIOACTIVEDATA</w:t>
-      </w:r>
-      <w:r>
-        <w:t xml:space="preserve"> указывает на </w:t>
-      </w:r>
-      <w:r>
-        <w:t xml:space="preserve">папку со схемами распадов, </w:t>
+        <w:t>sysdm.cpl</w:t>
+      </w:r>
+      <w:r>
+        <w:t>, нажмите Enter.</w:t>
+      </w:r>
+    </w:p>
+    <w:p>
+      <w:pPr>
+        <w:spacing w:after="40"/>
+        <w:ind w:left="510" w:hanging="510"/>
+      </w:pPr>
+      <w:r>
+        <w:rPr>
+          <w:b/>
+        </w:rPr>
+        <w:t>2.</w:t>
+      </w:r>
+      <w:r>
+        <w:rPr>
+          <w:b/>
+        </w:rPr>
+        <w:tab/>
+      </w:r>
+      <w:r>
+        <w:t>Вкладка «Дополнительно» → кнопка «Переменные среды…».</w:t>
+      </w:r>
+    </w:p>
+    <w:p>
+      <w:pPr>
+        <w:spacing w:after="40"/>
+        <w:ind w:left="510" w:hanging="510"/>
+      </w:pPr>
+      <w:r>
+        <w:rPr>
+          <w:b/>
+        </w:rPr>
+        <w:t>3.</w:t>
+      </w:r>
+      <w:r>
+        <w:rPr>
+          <w:b/>
+        </w:rPr>
+        <w:tab/>
+      </w:r>
+      <w:r>
+        <w:t xml:space="preserve">Найдите </w:t>
       </w:r>
       <w:r>
         <w:rPr>
@@ -8807,65 +8923,13 @@
           <w:sz w:val="18"/>
           <w:shd w:val="clear" w:color="auto" w:fill="F4F4F4"/>
         </w:rPr>
-        <w:t>G4LEVELGAMMADATA</w:t>
-      </w:r>
-      <w:r>
-        <w:t xml:space="preserve"> — на папку с уровнями дочерних ядер.</w:t>
-      </w:r>
-    </w:p>
-    <w:p>
-      <w:r>
-        <w:t xml:space="preserve">Обычно переменные создаёт установщик Geant4, но при установке без пакетов данных их может не оказаться. </w:t>
-      </w:r>
-      <w:r>
-        <w:rPr>
-          <w:b/>
-        </w:rPr>
-        <w:t>Проще всего не трогать их руками: запустите `install_data.bat`, а затем</w:t>
-      </w:r>
-      <w:r>
-        <w:rPr>
-          <w:b/>
-        </w:rPr>
-        <w:t xml:space="preserve"> `start.bat`</w:t>
-      </w:r>
-      <w:r>
-        <w:t xml:space="preserve"> — они сами найдут папки данных и создадут недостающие переменные (раздел 3.2).</w:t>
-      </w:r>
-    </w:p>
-    <w:p>
-      <w:r>
-        <w:t>Если нужно посмотреть или создать переменную вручную:</w:t>
-      </w:r>
-    </w:p>
-    <w:p>
-      <w:pPr>
-        <w:spacing w:after="40"/>
-        <w:ind w:left="510" w:hanging="510"/>
-      </w:pPr>
-      <w:r>
-        <w:rPr>
-          <w:b/>
-        </w:rPr>
-        <w:t>1.</w:t>
-      </w:r>
-      <w:r>
-        <w:rPr>
-          <w:b/>
-        </w:rPr>
-        <w:tab/>
-      </w:r>
-      <w:r>
-        <w:t xml:space="preserve">Нажмите </w:t>
-      </w:r>
-      <w:r>
-        <w:rPr>
-          <w:b/>
-        </w:rPr>
-        <w:t>Win + R</w:t>
-      </w:r>
-      <w:r>
-        <w:t xml:space="preserve">, введите </w:t>
+        <w:t>G4RADIOACTIVEDATA</w:t>
+      </w:r>
+      <w:r>
+        <w:t xml:space="preserve"> — она может находиться в блоке «Системные переменные» или «Пер</w:t>
+      </w:r>
+      <w:r>
+        <w:t xml:space="preserve">еменные пользователя»; значением должен быть путь вида </w:t>
       </w:r>
       <w:r>
         <w:rPr>
@@ -8873,10 +8937,21 @@
           <w:sz w:val="18"/>
           <w:shd w:val="clear" w:color="auto" w:fill="F4F4F4"/>
         </w:rPr>
-        <w:t>sysdm.cpl</w:t>
-      </w:r>
-      <w:r>
-        <w:t>, нажмите Enter.</w:t>
+        <w:t>...\data\RadioactiveDecay6.1.2</w:t>
+      </w:r>
+      <w:r>
+        <w:t>.</w:t>
+      </w:r>
+    </w:p>
+    <w:p>
+      <w:r>
+        <w:t xml:space="preserve">&gt; </w:t>
+      </w:r>
+      <w:r>
+        <w:rPr>
+          <w:b/>
+        </w:rPr>
+        <w:t>[Скриншот: окно «Переменные среды» с подсвеченной G4RADIOACTIVEDATA]</w:t>
       </w:r>
     </w:p>
     <w:p>
@@ -8888,7 +8963,7 @@
         <w:rPr>
           <w:b/>
         </w:rPr>
-        <w:t>2.</w:t>
+        <w:t>4.</w:t>
       </w:r>
       <w:r>
         <w:rPr>
@@ -8897,28 +8972,10 @@
         <w:tab/>
       </w:r>
       <w:r>
-        <w:t>Вкладка «Дополнительно» → кнопка «Переменные среды…».</w:t>
-      </w:r>
-    </w:p>
-    <w:p>
-      <w:pPr>
-        <w:spacing w:after="40"/>
-        <w:ind w:left="510" w:hanging="510"/>
-      </w:pPr>
-      <w:r>
-        <w:rPr>
-          <w:b/>
-        </w:rPr>
-        <w:t>3.</w:t>
-      </w:r>
-      <w:r>
-        <w:rPr>
-          <w:b/>
-        </w:rPr>
-        <w:tab/>
-      </w:r>
-      <w:r>
-        <w:t xml:space="preserve">Найдите </w:t>
+        <w:t>Если переменной нет, а папка с данными уже скачана — нажмите «Создать…» и укажите имя переменно</w:t>
+      </w:r>
+      <w:r>
+        <w:t xml:space="preserve">й и путь к папке. Но быстрее и надёжнее это делает </w:t>
       </w:r>
       <w:r>
         <w:rPr>
@@ -8926,10 +8983,31 @@
           <w:sz w:val="18"/>
           <w:shd w:val="clear" w:color="auto" w:fill="F4F4F4"/>
         </w:rPr>
-        <w:t>G4RADIOACTIVEDATA</w:t>
-      </w:r>
-      <w:r>
-        <w:t xml:space="preserve"> — она может находиться в блоке «Системные переменные» или «Переменные пользователя»; значением должен быть путь вида </w:t>
+        <w:t>start.bat</w:t>
+      </w:r>
+      <w:r>
+        <w:t>.</w:t>
+      </w:r>
+    </w:p>
+    <w:p>
+      <w:pPr>
+        <w:pStyle w:val="21"/>
+      </w:pPr>
+      <w:bookmarkStart w:id="28" w:name="_Toc243412965"/>
+      <w:r>
+        <w:t>8.4. Обновление и удаление</w:t>
+      </w:r>
+      <w:bookmarkEnd w:id="28"/>
+    </w:p>
+    <w:p>
+      <w:r>
+        <w:rPr>
+          <w:b/>
+        </w:rPr>
+        <w:t>Обновление:</w:t>
+      </w:r>
+      <w:r>
+        <w:t xml:space="preserve"> скачайте новый архив релиза, распакуйте его поверх папки программы, заменив файлы. Файлы </w:t>
       </w:r>
       <w:r>
         <w:rPr>
@@ -8937,48 +9015,10 @@
           <w:sz w:val="18"/>
           <w:shd w:val="clear" w:color="auto" w:fill="F4F4F4"/>
         </w:rPr>
-        <w:t>...\share\Geant4\data\RadioactiveDecay6.1.2</w:t>
-      </w:r>
-      <w:r>
-        <w:t>.</w:t>
-      </w:r>
-    </w:p>
-    <w:p>
-      <w:r>
-        <w:t xml:space="preserve">&gt; </w:t>
-      </w:r>
-      <w:r>
-        <w:rPr>
-          <w:b/>
-        </w:rPr>
-        <w:t>[Скриншот: окно «Переменные среды» с подсвеченной G4RADIOACTIV</w:t>
-      </w:r>
-      <w:r>
-        <w:rPr>
-          <w:b/>
-        </w:rPr>
-        <w:t>EDATA]</w:t>
-      </w:r>
-    </w:p>
-    <w:p>
-      <w:pPr>
-        <w:spacing w:after="40"/>
-        <w:ind w:left="510" w:hanging="510"/>
-      </w:pPr>
-      <w:r>
-        <w:rPr>
-          <w:b/>
-        </w:rPr>
-        <w:t>4.</w:t>
-      </w:r>
-      <w:r>
-        <w:rPr>
-          <w:b/>
-        </w:rPr>
-        <w:tab/>
-      </w:r>
-      <w:r>
-        <w:t xml:space="preserve">Если переменной нет, а папка с данными уже скачана — нажмите «Создать…» и укажите имя переменной и путь к папке. Но быстрее и надёжнее это делает </w:t>
+        <w:t>run.mac</w:t>
+      </w:r>
+      <w:r>
+        <w:t xml:space="preserve"> и </w:t>
       </w:r>
       <w:r>
         <w:rPr>
@@ -8986,70 +9026,24 @@
           <w:sz w:val="18"/>
           <w:shd w:val="clear" w:color="auto" w:fill="F4F4F4"/>
         </w:rPr>
-        <w:t>start.bat</w:t>
-      </w:r>
-      <w:r>
-        <w:t>.</w:t>
-      </w:r>
-    </w:p>
-    <w:p>
-      <w:pPr>
-        <w:pStyle w:val="21"/>
-      </w:pPr>
-      <w:bookmarkStart w:id="28" w:name="_Toc243409817"/>
-      <w:r>
-        <w:t>8.4. Обновление и удаление</w:t>
-      </w:r>
-      <w:bookmarkEnd w:id="28"/>
+        <w:t>results.txt</w:t>
+      </w:r>
+      <w:r>
+        <w:t xml:space="preserve"> при обновлении можно сохранить.</w:t>
+      </w:r>
     </w:p>
     <w:p>
       <w:r>
         <w:rPr>
           <w:b/>
         </w:rPr>
-        <w:t>Обновление:</w:t>
-      </w:r>
-      <w:r>
-        <w:t xml:space="preserve"> скачайте новый архив релиза, распакуйте его поверх</w:t>
-      </w:r>
-      <w:r>
-        <w:t xml:space="preserve"> папки программы, заменив файлы. Файлы </w:t>
-      </w:r>
-      <w:r>
-        <w:rPr>
-          <w:rFonts w:ascii="Consolas" w:hAnsi="Consolas" w:cs="Consolas"/>
-          <w:sz w:val="18"/>
-          <w:shd w:val="clear" w:color="auto" w:fill="F4F4F4"/>
-        </w:rPr>
-        <w:t>run.mac</w:t>
-      </w:r>
-      <w:r>
-        <w:t xml:space="preserve"> и </w:t>
-      </w:r>
-      <w:r>
-        <w:rPr>
-          <w:rFonts w:ascii="Consolas" w:hAnsi="Consolas" w:cs="Consolas"/>
-          <w:sz w:val="18"/>
-          <w:shd w:val="clear" w:color="auto" w:fill="F4F4F4"/>
-        </w:rPr>
-        <w:t>results.txt</w:t>
-      </w:r>
-      <w:r>
-        <w:t xml:space="preserve"> при обновлении можно сохранить.</w:t>
-      </w:r>
-    </w:p>
-    <w:p>
-      <w:r>
-        <w:rPr>
-          <w:b/>
-        </w:rPr>
         <w:t>Удаление:</w:t>
       </w:r>
       <w:r>
-        <w:t xml:space="preserve"> просто удалите папку программы. Установленные Geant4, Python и matplotlib удаляются стандартными средствами Windows («Приложения»), если они больше не ну</w:t>
-      </w:r>
-      <w:r>
-        <w:t>жны.</w:t>
+        <w:t xml:space="preserve"> пр</w:t>
+      </w:r>
+      <w:r>
+        <w:t>осто удалите папку программы. Установленные Geant4, Python и matplotlib удаляются стандартными средствами Windows («Приложения»), если они больше не нужны.</w:t>
       </w:r>
     </w:p>
     <w:p>
@@ -9064,7 +9058,7 @@
       <w:pPr>
         <w:pStyle w:val="1"/>
       </w:pPr>
-      <w:bookmarkStart w:id="29" w:name="_Toc243409818"/>
+      <w:bookmarkStart w:id="29" w:name="_Toc243412966"/>
       <w:r>
         <w:t>9. Контрольный список перед первым запуском</w:t>
       </w:r>
@@ -9216,10 +9210,7 @@
         <w:tab/>
       </w:r>
       <w:r>
-        <w:t>Ус</w:t>
-      </w:r>
-      <w:r>
-        <w:t>тановлен matplotlib (раздел 4.4).</w:t>
+        <w:t>Установлен matplotlib (раздел 4.4).</w:t>
       </w:r>
     </w:p>
     <w:p>
@@ -9305,10 +9296,7 @@
         <w:tab/>
       </w:r>
       <w:r>
-        <w:t>На вкладке «Радионуклид» выбран нуклид, и показан</w:t>
-      </w:r>
-      <w:r>
-        <w:t>ы T½ и статус данных Geant4.</w:t>
+        <w:t>На вкладке «Радионуклид» выбран нуклид, и показаны T½ и статус данных Geant4.</w:t>
       </w:r>
     </w:p>
     <w:p>
@@ -20951,7 +20939,7 @@
     <w:autoRedefine/>
     <w:uiPriority w:val="39"/>
     <w:unhideWhenUsed/>
-    <w:rsid w:val="006509F8"/>
+    <w:rsid w:val="00847817"/>
     <w:pPr>
       <w:spacing w:after="100"/>
     </w:pPr>
@@ -20963,7 +20951,7 @@
     <w:autoRedefine/>
     <w:uiPriority w:val="39"/>
     <w:unhideWhenUsed/>
-    <w:rsid w:val="006509F8"/>
+    <w:rsid w:val="00847817"/>
     <w:pPr>
       <w:spacing w:after="100"/>
       <w:ind w:left="220"/>
@@ -20974,7 +20962,7 @@
     <w:basedOn w:val="a2"/>
     <w:uiPriority w:val="99"/>
     <w:unhideWhenUsed/>
-    <w:rsid w:val="006509F8"/>
+    <w:rsid w:val="00847817"/>
     <w:rPr>
       <w:color w:val="0000FF" w:themeColor="hyperlink"/>
       <w:u w:val="single"/>

</xml_diff>

<commit_message>
Install datasets into <install>/data only; drop share\Geant4\data paths
</commit_message>
<xml_diff>
--- a/MANUAL.docx
+++ b/MANUAL.docx
@@ -93,7 +93,7 @@
       <w:r>
         <w:fldChar w:fldCharType="separate"/>
       </w:r>
-      <w:hyperlink w:anchor="_Toc243412937" w:history="1">
+      <w:hyperlink w:anchor="_Toc243413221" w:history="1">
         <w:r>
           <w:rPr>
             <w:rStyle w:val="aff8"/>
@@ -120,7 +120,7 @@
             <w:noProof/>
             <w:webHidden/>
           </w:rPr>
-          <w:instrText xml:space="preserve"> PAGEREF _Toc243412937 \h </w:instrText>
+          <w:instrText xml:space="preserve"> PAGEREF _Toc243413221 \h </w:instrText>
         </w:r>
         <w:r>
           <w:rPr>
@@ -161,7 +161,7 @@
           <w:noProof/>
         </w:rPr>
       </w:pPr>
-      <w:hyperlink w:anchor="_Toc243412938" w:history="1">
+      <w:hyperlink w:anchor="_Toc243413222" w:history="1">
         <w:r>
           <w:rPr>
             <w:rStyle w:val="aff8"/>
@@ -188,7 +188,7 @@
             <w:noProof/>
             <w:webHidden/>
           </w:rPr>
-          <w:instrText xml:space="preserve"> PAGEREF _Toc243412938 \h </w:instrText>
+          <w:instrText xml:space="preserve"> PAGEREF _Toc243413222 \h </w:instrText>
         </w:r>
         <w:r>
           <w:rPr>
@@ -229,7 +229,7 @@
           <w:noProof/>
         </w:rPr>
       </w:pPr>
-      <w:hyperlink w:anchor="_Toc243412939" w:history="1">
+      <w:hyperlink w:anchor="_Toc243413223" w:history="1">
         <w:r>
           <w:rPr>
             <w:rStyle w:val="aff8"/>
@@ -256,7 +256,7 @@
             <w:noProof/>
             <w:webHidden/>
           </w:rPr>
-          <w:instrText xml:space="preserve"> PAGEREF _Toc243412939 \h </w:instrText>
+          <w:instrText xml:space="preserve"> PAGEREF _Toc243413223 \h </w:instrText>
         </w:r>
         <w:r>
           <w:rPr>
@@ -297,7 +297,7 @@
           <w:noProof/>
         </w:rPr>
       </w:pPr>
-      <w:hyperlink w:anchor="_Toc243412940" w:history="1">
+      <w:hyperlink w:anchor="_Toc243413224" w:history="1">
         <w:r>
           <w:rPr>
             <w:rStyle w:val="aff8"/>
@@ -324,7 +324,7 @@
             <w:noProof/>
             <w:webHidden/>
           </w:rPr>
-          <w:instrText xml:space="preserve"> PAGEREF _Toc243412940 \h </w:instrText>
+          <w:instrText xml:space="preserve"> PAGEREF _Toc243413224 \h </w:instrText>
         </w:r>
         <w:r>
           <w:rPr>
@@ -365,7 +365,7 @@
           <w:noProof/>
         </w:rPr>
       </w:pPr>
-      <w:hyperlink w:anchor="_Toc243412941" w:history="1">
+      <w:hyperlink w:anchor="_Toc243413225" w:history="1">
         <w:r>
           <w:rPr>
             <w:rStyle w:val="aff8"/>
@@ -392,7 +392,7 @@
             <w:noProof/>
             <w:webHidden/>
           </w:rPr>
-          <w:instrText xml:space="preserve"> PAGEREF _Toc243412941 \h </w:instrText>
+          <w:instrText xml:space="preserve"> PAGEREF _Toc243413225 \h </w:instrText>
         </w:r>
         <w:r>
           <w:rPr>
@@ -433,7 +433,7 @@
           <w:noProof/>
         </w:rPr>
       </w:pPr>
-      <w:hyperlink w:anchor="_Toc243412942" w:history="1">
+      <w:hyperlink w:anchor="_Toc243413226" w:history="1">
         <w:r>
           <w:rPr>
             <w:rStyle w:val="aff8"/>
@@ -460,7 +460,7 @@
             <w:noProof/>
             <w:webHidden/>
           </w:rPr>
-          <w:instrText xml:space="preserve"> PAGEREF _Toc243412942 \h </w:instrText>
+          <w:instrText xml:space="preserve"> PAGEREF _Toc243413226 \h </w:instrText>
         </w:r>
         <w:r>
           <w:rPr>
@@ -501,7 +501,7 @@
           <w:noProof/>
         </w:rPr>
       </w:pPr>
-      <w:hyperlink w:anchor="_Toc243412943" w:history="1">
+      <w:hyperlink w:anchor="_Toc243413227" w:history="1">
         <w:r>
           <w:rPr>
             <w:rStyle w:val="aff8"/>
@@ -528,7 +528,7 @@
             <w:noProof/>
             <w:webHidden/>
           </w:rPr>
-          <w:instrText xml:space="preserve"> PAGEREF _Toc243412943 \h </w:instrText>
+          <w:instrText xml:space="preserve"> PAGEREF _Toc243413227 \h </w:instrText>
         </w:r>
         <w:r>
           <w:rPr>
@@ -569,7 +569,7 @@
           <w:noProof/>
         </w:rPr>
       </w:pPr>
-      <w:hyperlink w:anchor="_Toc243412944" w:history="1">
+      <w:hyperlink w:anchor="_Toc243413228" w:history="1">
         <w:r>
           <w:rPr>
             <w:rStyle w:val="aff8"/>
@@ -596,7 +596,7 @@
             <w:noProof/>
             <w:webHidden/>
           </w:rPr>
-          <w:instrText xml:space="preserve"> PAGEREF _Toc243412944 \h </w:instrText>
+          <w:instrText xml:space="preserve"> PAGEREF _Toc243413228 \h </w:instrText>
         </w:r>
         <w:r>
           <w:rPr>
@@ -637,7 +637,7 @@
           <w:noProof/>
         </w:rPr>
       </w:pPr>
-      <w:hyperlink w:anchor="_Toc243412945" w:history="1">
+      <w:hyperlink w:anchor="_Toc243413229" w:history="1">
         <w:r>
           <w:rPr>
             <w:rStyle w:val="aff8"/>
@@ -664,7 +664,7 @@
             <w:noProof/>
             <w:webHidden/>
           </w:rPr>
-          <w:instrText xml:space="preserve"> PAGEREF _Toc243412945 \h </w:instrText>
+          <w:instrText xml:space="preserve"> PAGEREF _Toc243413229 \h </w:instrText>
         </w:r>
         <w:r>
           <w:rPr>
@@ -705,7 +705,7 @@
           <w:noProof/>
         </w:rPr>
       </w:pPr>
-      <w:hyperlink w:anchor="_Toc243412946" w:history="1">
+      <w:hyperlink w:anchor="_Toc243413230" w:history="1">
         <w:r>
           <w:rPr>
             <w:rStyle w:val="aff8"/>
@@ -732,7 +732,7 @@
             <w:noProof/>
             <w:webHidden/>
           </w:rPr>
-          <w:instrText xml:space="preserve"> PAGEREF _Toc243412946 \h </w:instrText>
+          <w:instrText xml:space="preserve"> PAGEREF _Toc243413230 \h </w:instrText>
         </w:r>
         <w:r>
           <w:rPr>
@@ -773,7 +773,7 @@
           <w:noProof/>
         </w:rPr>
       </w:pPr>
-      <w:hyperlink w:anchor="_Toc243412947" w:history="1">
+      <w:hyperlink w:anchor="_Toc243413231" w:history="1">
         <w:r>
           <w:rPr>
             <w:rStyle w:val="aff8"/>
@@ -800,7 +800,7 @@
             <w:noProof/>
             <w:webHidden/>
           </w:rPr>
-          <w:instrText xml:space="preserve"> PAGEREF _Toc243412947 \h </w:instrText>
+          <w:instrText xml:space="preserve"> PAGEREF _Toc243413231 \h </w:instrText>
         </w:r>
         <w:r>
           <w:rPr>
@@ -841,7 +841,7 @@
           <w:noProof/>
         </w:rPr>
       </w:pPr>
-      <w:hyperlink w:anchor="_Toc243412948" w:history="1">
+      <w:hyperlink w:anchor="_Toc243413232" w:history="1">
         <w:r>
           <w:rPr>
             <w:rStyle w:val="aff8"/>
@@ -868,7 +868,7 @@
             <w:noProof/>
             <w:webHidden/>
           </w:rPr>
-          <w:instrText xml:space="preserve"> PAGEREF _Toc243412948 \h </w:instrText>
+          <w:instrText xml:space="preserve"> PAGEREF _Toc243413232 \h </w:instrText>
         </w:r>
         <w:r>
           <w:rPr>
@@ -909,7 +909,7 @@
           <w:noProof/>
         </w:rPr>
       </w:pPr>
-      <w:hyperlink w:anchor="_Toc243412949" w:history="1">
+      <w:hyperlink w:anchor="_Toc243413233" w:history="1">
         <w:r>
           <w:rPr>
             <w:rStyle w:val="aff8"/>
@@ -936,7 +936,7 @@
             <w:noProof/>
             <w:webHidden/>
           </w:rPr>
-          <w:instrText xml:space="preserve"> PAGEREF _Toc243412949 \h </w:instrText>
+          <w:instrText xml:space="preserve"> PAGEREF _Toc243413233 \h </w:instrText>
         </w:r>
         <w:r>
           <w:rPr>
@@ -977,7 +977,7 @@
           <w:noProof/>
         </w:rPr>
       </w:pPr>
-      <w:hyperlink w:anchor="_Toc243412950" w:history="1">
+      <w:hyperlink w:anchor="_Toc243413234" w:history="1">
         <w:r>
           <w:rPr>
             <w:rStyle w:val="aff8"/>
@@ -1004,7 +1004,7 @@
             <w:noProof/>
             <w:webHidden/>
           </w:rPr>
-          <w:instrText xml:space="preserve"> PAGEREF _Toc243412950 \h </w:instrText>
+          <w:instrText xml:space="preserve"> PAGEREF _Toc243413234 \h </w:instrText>
         </w:r>
         <w:r>
           <w:rPr>
@@ -1045,7 +1045,7 @@
           <w:noProof/>
         </w:rPr>
       </w:pPr>
-      <w:hyperlink w:anchor="_Toc243412951" w:history="1">
+      <w:hyperlink w:anchor="_Toc243413235" w:history="1">
         <w:r>
           <w:rPr>
             <w:rStyle w:val="aff8"/>
@@ -1072,7 +1072,7 @@
             <w:noProof/>
             <w:webHidden/>
           </w:rPr>
-          <w:instrText xml:space="preserve"> PAGEREF _Toc243412951 \h </w:instrText>
+          <w:instrText xml:space="preserve"> PAGEREF _Toc243413235 \h </w:instrText>
         </w:r>
         <w:r>
           <w:rPr>
@@ -1113,7 +1113,7 @@
           <w:noProof/>
         </w:rPr>
       </w:pPr>
-      <w:hyperlink w:anchor="_Toc243412952" w:history="1">
+      <w:hyperlink w:anchor="_Toc243413236" w:history="1">
         <w:r>
           <w:rPr>
             <w:rStyle w:val="aff8"/>
@@ -1140,7 +1140,7 @@
             <w:noProof/>
             <w:webHidden/>
           </w:rPr>
-          <w:instrText xml:space="preserve"> PAGEREF _Toc243412952 \h </w:instrText>
+          <w:instrText xml:space="preserve"> PAGEREF _Toc243413236 \h </w:instrText>
         </w:r>
         <w:r>
           <w:rPr>
@@ -1181,7 +1181,7 @@
           <w:noProof/>
         </w:rPr>
       </w:pPr>
-      <w:hyperlink w:anchor="_Toc243412953" w:history="1">
+      <w:hyperlink w:anchor="_Toc243413237" w:history="1">
         <w:r>
           <w:rPr>
             <w:rStyle w:val="aff8"/>
@@ -1208,7 +1208,7 @@
             <w:noProof/>
             <w:webHidden/>
           </w:rPr>
-          <w:instrText xml:space="preserve"> PAGEREF _Toc243412953 \h </w:instrText>
+          <w:instrText xml:space="preserve"> PAGEREF _Toc243413237 \h </w:instrText>
         </w:r>
         <w:r>
           <w:rPr>
@@ -1249,7 +1249,7 @@
           <w:noProof/>
         </w:rPr>
       </w:pPr>
-      <w:hyperlink w:anchor="_Toc243412954" w:history="1">
+      <w:hyperlink w:anchor="_Toc243413238" w:history="1">
         <w:r>
           <w:rPr>
             <w:rStyle w:val="aff8"/>
@@ -1276,7 +1276,7 @@
             <w:noProof/>
             <w:webHidden/>
           </w:rPr>
-          <w:instrText xml:space="preserve"> PAGEREF _Toc243412954 \h </w:instrText>
+          <w:instrText xml:space="preserve"> PAGEREF _Toc243413238 \h </w:instrText>
         </w:r>
         <w:r>
           <w:rPr>
@@ -1317,7 +1317,7 @@
           <w:noProof/>
         </w:rPr>
       </w:pPr>
-      <w:hyperlink w:anchor="_Toc243412955" w:history="1">
+      <w:hyperlink w:anchor="_Toc243413239" w:history="1">
         <w:r>
           <w:rPr>
             <w:rStyle w:val="aff8"/>
@@ -1344,7 +1344,7 @@
             <w:noProof/>
             <w:webHidden/>
           </w:rPr>
-          <w:instrText xml:space="preserve"> PAGEREF _Toc243412955 \h </w:instrText>
+          <w:instrText xml:space="preserve"> PAGEREF _Toc243413239 \h </w:instrText>
         </w:r>
         <w:r>
           <w:rPr>
@@ -1385,7 +1385,7 @@
           <w:noProof/>
         </w:rPr>
       </w:pPr>
-      <w:hyperlink w:anchor="_Toc243412956" w:history="1">
+      <w:hyperlink w:anchor="_Toc243413240" w:history="1">
         <w:r>
           <w:rPr>
             <w:rStyle w:val="aff8"/>
@@ -1412,7 +1412,7 @@
             <w:noProof/>
             <w:webHidden/>
           </w:rPr>
-          <w:instrText xml:space="preserve"> PAGEREF _Toc243412956 \h </w:instrText>
+          <w:instrText xml:space="preserve"> PAGEREF _Toc243413240 \h </w:instrText>
         </w:r>
         <w:r>
           <w:rPr>
@@ -1453,7 +1453,7 @@
           <w:noProof/>
         </w:rPr>
       </w:pPr>
-      <w:hyperlink w:anchor="_Toc243412957" w:history="1">
+      <w:hyperlink w:anchor="_Toc243413241" w:history="1">
         <w:r>
           <w:rPr>
             <w:rStyle w:val="aff8"/>
@@ -1480,7 +1480,7 @@
             <w:noProof/>
             <w:webHidden/>
           </w:rPr>
-          <w:instrText xml:space="preserve"> PAGEREF _Toc243412957 \h </w:instrText>
+          <w:instrText xml:space="preserve"> PAGEREF _Toc243413241 \h </w:instrText>
         </w:r>
         <w:r>
           <w:rPr>
@@ -1521,7 +1521,7 @@
           <w:noProof/>
         </w:rPr>
       </w:pPr>
-      <w:hyperlink w:anchor="_Toc243412958" w:history="1">
+      <w:hyperlink w:anchor="_Toc243413242" w:history="1">
         <w:r>
           <w:rPr>
             <w:rStyle w:val="aff8"/>
@@ -1548,7 +1548,7 @@
             <w:noProof/>
             <w:webHidden/>
           </w:rPr>
-          <w:instrText xml:space="preserve"> PAGEREF _Toc243412958 \h </w:instrText>
+          <w:instrText xml:space="preserve"> PAGEREF _Toc243413242 \h </w:instrText>
         </w:r>
         <w:r>
           <w:rPr>
@@ -1589,7 +1589,7 @@
           <w:noProof/>
         </w:rPr>
       </w:pPr>
-      <w:hyperlink w:anchor="_Toc243412959" w:history="1">
+      <w:hyperlink w:anchor="_Toc243413243" w:history="1">
         <w:r>
           <w:rPr>
             <w:rStyle w:val="aff8"/>
@@ -1616,7 +1616,7 @@
             <w:noProof/>
             <w:webHidden/>
           </w:rPr>
-          <w:instrText xml:space="preserve"> PAGEREF _Toc243412959 \h </w:instrText>
+          <w:instrText xml:space="preserve"> PAGEREF _Toc243413243 \h </w:instrText>
         </w:r>
         <w:r>
           <w:rPr>
@@ -1657,7 +1657,7 @@
           <w:noProof/>
         </w:rPr>
       </w:pPr>
-      <w:hyperlink w:anchor="_Toc243412960" w:history="1">
+      <w:hyperlink w:anchor="_Toc243413244" w:history="1">
         <w:r>
           <w:rPr>
             <w:rStyle w:val="aff8"/>
@@ -1684,7 +1684,7 @@
             <w:noProof/>
             <w:webHidden/>
           </w:rPr>
-          <w:instrText xml:space="preserve"> PAGEREF _Toc243412960 \h </w:instrText>
+          <w:instrText xml:space="preserve"> PAGEREF _Toc243413244 \h </w:instrText>
         </w:r>
         <w:r>
           <w:rPr>
@@ -1725,7 +1725,7 @@
           <w:noProof/>
         </w:rPr>
       </w:pPr>
-      <w:hyperlink w:anchor="_Toc243412961" w:history="1">
+      <w:hyperlink w:anchor="_Toc243413245" w:history="1">
         <w:r>
           <w:rPr>
             <w:rStyle w:val="aff8"/>
@@ -1752,7 +1752,7 @@
             <w:noProof/>
             <w:webHidden/>
           </w:rPr>
-          <w:instrText xml:space="preserve"> PAGEREF _Toc243412961 \h </w:instrText>
+          <w:instrText xml:space="preserve"> PAGEREF _Toc243413245 \h </w:instrText>
         </w:r>
         <w:r>
           <w:rPr>
@@ -1793,7 +1793,7 @@
           <w:noProof/>
         </w:rPr>
       </w:pPr>
-      <w:hyperlink w:anchor="_Toc243412962" w:history="1">
+      <w:hyperlink w:anchor="_Toc243413246" w:history="1">
         <w:r>
           <w:rPr>
             <w:rStyle w:val="aff8"/>
@@ -1820,7 +1820,7 @@
             <w:noProof/>
             <w:webHidden/>
           </w:rPr>
-          <w:instrText xml:space="preserve"> PAGEREF _Toc243412962 \h </w:instrText>
+          <w:instrText xml:space="preserve"> PAGEREF _Toc243413246 \h </w:instrText>
         </w:r>
         <w:r>
           <w:rPr>
@@ -1861,7 +1861,7 @@
           <w:noProof/>
         </w:rPr>
       </w:pPr>
-      <w:hyperlink w:anchor="_Toc243412963" w:history="1">
+      <w:hyperlink w:anchor="_Toc243413247" w:history="1">
         <w:r>
           <w:rPr>
             <w:rStyle w:val="aff8"/>
@@ -1888,7 +1888,7 @@
             <w:noProof/>
             <w:webHidden/>
           </w:rPr>
-          <w:instrText xml:space="preserve"> PAGEREF _Toc243412963 \h </w:instrText>
+          <w:instrText xml:space="preserve"> PAGEREF _Toc243413247 \h </w:instrText>
         </w:r>
         <w:r>
           <w:rPr>
@@ -1929,7 +1929,7 @@
           <w:noProof/>
         </w:rPr>
       </w:pPr>
-      <w:hyperlink w:anchor="_Toc243412964" w:history="1">
+      <w:hyperlink w:anchor="_Toc243413248" w:history="1">
         <w:r>
           <w:rPr>
             <w:rStyle w:val="aff8"/>
@@ -1956,7 +1956,7 @@
             <w:noProof/>
             <w:webHidden/>
           </w:rPr>
-          <w:instrText xml:space="preserve"> PAGEREF _Toc243412964 \h </w:instrText>
+          <w:instrText xml:space="preserve"> PAGEREF _Toc243413248 \h </w:instrText>
         </w:r>
         <w:r>
           <w:rPr>
@@ -1997,7 +1997,7 @@
           <w:noProof/>
         </w:rPr>
       </w:pPr>
-      <w:hyperlink w:anchor="_Toc243412965" w:history="1">
+      <w:hyperlink w:anchor="_Toc243413249" w:history="1">
         <w:r>
           <w:rPr>
             <w:rStyle w:val="aff8"/>
@@ -2024,7 +2024,7 @@
             <w:noProof/>
             <w:webHidden/>
           </w:rPr>
-          <w:instrText xml:space="preserve"> PAGEREF _Toc243412965 \h </w:instrText>
+          <w:instrText xml:space="preserve"> PAGEREF _Toc243413249 \h </w:instrText>
         </w:r>
         <w:r>
           <w:rPr>
@@ -2065,7 +2065,7 @@
           <w:noProof/>
         </w:rPr>
       </w:pPr>
-      <w:hyperlink w:anchor="_Toc243412966" w:history="1">
+      <w:hyperlink w:anchor="_Toc243413250" w:history="1">
         <w:r>
           <w:rPr>
             <w:rStyle w:val="aff8"/>
@@ -2092,7 +2092,7 @@
             <w:noProof/>
             <w:webHidden/>
           </w:rPr>
-          <w:instrText xml:space="preserve"> PAGEREF _Toc243412966 \h </w:instrText>
+          <w:instrText xml:space="preserve"> PAGEREF _Toc243413250 \h </w:instrText>
         </w:r>
         <w:r>
           <w:rPr>
@@ -2137,7 +2137,7 @@
       <w:pPr>
         <w:pStyle w:val="1"/>
       </w:pPr>
-      <w:bookmarkStart w:id="0" w:name="_Toc243412937"/>
+      <w:bookmarkStart w:id="0" w:name="_Toc243413221"/>
       <w:r>
         <w:lastRenderedPageBreak/>
         <w:t>1. О программе</w:t>
@@ -2642,7 +2642,7 @@
       <w:pPr>
         <w:pStyle w:val="1"/>
       </w:pPr>
-      <w:bookmarkStart w:id="1" w:name="_Toc243412938"/>
+      <w:bookmarkStart w:id="1" w:name="_Toc243413222"/>
       <w:r>
         <w:t>2. Системные требования</w:t>
       </w:r>
@@ -3068,7 +3068,7 @@
       <w:pPr>
         <w:pStyle w:val="1"/>
       </w:pPr>
-      <w:bookmarkStart w:id="2" w:name="_Toc243412939"/>
+      <w:bookmarkStart w:id="2" w:name="_Toc243413223"/>
       <w:r>
         <w:t>3. Установка Geant4</w:t>
       </w:r>
@@ -3078,7 +3078,7 @@
       <w:pPr>
         <w:pStyle w:val="21"/>
       </w:pPr>
-      <w:bookmarkStart w:id="3" w:name="_Toc243412940"/>
+      <w:bookmarkStart w:id="3" w:name="_Toc243413224"/>
       <w:r>
         <w:t>3.1. Установка Geant4</w:t>
       </w:r>
@@ -3373,7 +3373,7 @@
       <w:pPr>
         <w:pStyle w:val="21"/>
       </w:pPr>
-      <w:bookmarkStart w:id="4" w:name="_Toc243412941"/>
+      <w:bookmarkStart w:id="4" w:name="_Toc243413225"/>
       <w:r>
         <w:t>3.2. Установка пакетов данных Geant4</w:t>
       </w:r>
@@ -4474,7 +4474,7 @@
       <w:pPr>
         <w:pStyle w:val="1"/>
       </w:pPr>
-      <w:bookmarkStart w:id="5" w:name="_Toc243412942"/>
+      <w:bookmarkStart w:id="5" w:name="_Toc243413226"/>
       <w:r>
         <w:t xml:space="preserve">4. Установка Python и </w:t>
       </w:r>
@@ -4487,7 +4487,7 @@
       <w:pPr>
         <w:pStyle w:val="21"/>
       </w:pPr>
-      <w:bookmarkStart w:id="6" w:name="_Toc243412943"/>
+      <w:bookmarkStart w:id="6" w:name="_Toc243413227"/>
       <w:r>
         <w:t>4.1. Установка Python</w:t>
       </w:r>
@@ -4659,7 +4659,7 @@
       <w:pPr>
         <w:pStyle w:val="21"/>
       </w:pPr>
-      <w:bookmarkStart w:id="7" w:name="_Toc243412944"/>
+      <w:bookmarkStart w:id="7" w:name="_Toc243413228"/>
       <w:r>
         <w:t>4.2. Открываем командную строку</w:t>
       </w:r>
@@ -4815,7 +4815,7 @@
       <w:pPr>
         <w:pStyle w:val="21"/>
       </w:pPr>
-      <w:bookmarkStart w:id="8" w:name="_Toc243412945"/>
+      <w:bookmarkStart w:id="8" w:name="_Toc243413229"/>
       <w:r>
         <w:t>4.3. Проверка, что Python установлен</w:t>
       </w:r>
@@ -4891,7 +4891,7 @@
       <w:pPr>
         <w:pStyle w:val="21"/>
       </w:pPr>
-      <w:bookmarkStart w:id="9" w:name="_Toc243412946"/>
+      <w:bookmarkStart w:id="9" w:name="_Toc243413230"/>
       <w:r>
         <w:t>4.4. Установка matplotlib</w:t>
       </w:r>
@@ -4980,7 +4980,7 @@
       <w:pPr>
         <w:pStyle w:val="21"/>
       </w:pPr>
-      <w:bookmarkStart w:id="10" w:name="_Toc243412947"/>
+      <w:bookmarkStart w:id="10" w:name="_Toc243413231"/>
       <w:r>
         <w:t>4.5. Закройте командную строку</w:t>
       </w:r>
@@ -5006,7 +5006,7 @@
       <w:pPr>
         <w:pStyle w:val="1"/>
       </w:pPr>
-      <w:bookmarkStart w:id="11" w:name="_Toc243412948"/>
+      <w:bookmarkStart w:id="11" w:name="_Toc243413232"/>
       <w:r>
         <w:t>5. Скачивание и запуск программы</w:t>
       </w:r>
@@ -5016,7 +5016,7 @@
       <w:pPr>
         <w:pStyle w:val="21"/>
       </w:pPr>
-      <w:bookmarkStart w:id="12" w:name="_Toc243412949"/>
+      <w:bookmarkStart w:id="12" w:name="_Toc243413233"/>
       <w:r>
         <w:t>5.1. Скачивание</w:t>
       </w:r>
@@ -5066,7 +5066,7 @@
       <w:pPr>
         <w:pStyle w:val="21"/>
       </w:pPr>
-      <w:bookmarkStart w:id="13" w:name="_Toc243412950"/>
+      <w:bookmarkStart w:id="13" w:name="_Toc243413234"/>
       <w:r>
         <w:t>5.2. Распаковка</w:t>
       </w:r>
@@ -5254,7 +5254,7 @@
       <w:pPr>
         <w:pStyle w:val="21"/>
       </w:pPr>
-      <w:bookmarkStart w:id="14" w:name="_Toc243412951"/>
+      <w:bookmarkStart w:id="14" w:name="_Toc243413235"/>
       <w:r>
         <w:t>5.3. Запуск</w:t>
       </w:r>
@@ -5521,7 +5521,7 @@
       <w:pPr>
         <w:pStyle w:val="1"/>
       </w:pPr>
-      <w:bookmarkStart w:id="15" w:name="_Toc243412952"/>
+      <w:bookmarkStart w:id="15" w:name="_Toc243413236"/>
       <w:r>
         <w:t>6. Программа: устройство и пример расчёта</w:t>
       </w:r>
@@ -5531,7 +5531,7 @@
       <w:pPr>
         <w:pStyle w:val="21"/>
       </w:pPr>
-      <w:bookmarkStart w:id="16" w:name="_Toc243412953"/>
+      <w:bookmarkStart w:id="16" w:name="_Toc243413237"/>
       <w:r>
         <w:t>6.</w:t>
       </w:r>
@@ -5840,7 +5840,7 @@
       <w:pPr>
         <w:pStyle w:val="21"/>
       </w:pPr>
-      <w:bookmarkStart w:id="17" w:name="_Toc243412954"/>
+      <w:bookmarkStart w:id="17" w:name="_Toc243413238"/>
       <w:r>
         <w:t>6.2. Пример: Lu-177 в стакане</w:t>
       </w:r>
@@ -6471,7 +6471,7 @@
       <w:pPr>
         <w:pStyle w:val="21"/>
       </w:pPr>
-      <w:bookmarkStart w:id="18" w:name="_Toc243412955"/>
+      <w:bookmarkStart w:id="18" w:name="_Toc243413239"/>
       <w:r>
         <w:t>6.3. К</w:t>
       </w:r>
@@ -7006,7 +7006,7 @@
       <w:pPr>
         <w:pStyle w:val="21"/>
       </w:pPr>
-      <w:bookmarkStart w:id="19" w:name="_Toc243412956"/>
+      <w:bookmarkStart w:id="19" w:name="_Toc243413240"/>
       <w:r>
         <w:t>6.4. Где сохраняются результаты</w:t>
       </w:r>
@@ -7110,7 +7110,7 @@
       <w:pPr>
         <w:pStyle w:val="1"/>
       </w:pPr>
-      <w:bookmarkStart w:id="20" w:name="_Toc243412957"/>
+      <w:bookmarkStart w:id="20" w:name="_Toc243413241"/>
       <w:r>
         <w:t>7. Если что-то пошло не так</w:t>
       </w:r>
@@ -7120,7 +7120,7 @@
       <w:pPr>
         <w:pStyle w:val="21"/>
       </w:pPr>
-      <w:bookmarkStart w:id="21" w:name="_Toc243412958"/>
+      <w:bookmarkStart w:id="21" w:name="_Toc243413242"/>
       <w:r>
         <w:t>7.1. Сообщения start.bat</w:t>
       </w:r>
@@ -7529,7 +7529,7 @@
       <w:pPr>
         <w:pStyle w:val="21"/>
       </w:pPr>
-      <w:bookmarkStart w:id="22" w:name="_Toc243412959"/>
+      <w:bookmarkStart w:id="22" w:name="_Toc243413243"/>
       <w:r>
         <w:t>7.2. Ошибки Geant4 при расчёте</w:t>
       </w:r>
@@ -7853,7 +7853,7 @@
       <w:pPr>
         <w:pStyle w:val="21"/>
       </w:pPr>
-      <w:bookmarkStart w:id="23" w:name="_Toc243412960"/>
+      <w:bookmarkStart w:id="23" w:name="_Toc243413244"/>
       <w:r>
         <w:t>7.3. Окно программы открылось, но что-то не так</w:t>
       </w:r>
@@ -8108,7 +8108,7 @@
       <w:pPr>
         <w:pStyle w:val="1"/>
       </w:pPr>
-      <w:bookmarkStart w:id="24" w:name="_Toc243412961"/>
+      <w:bookmarkStart w:id="24" w:name="_Toc243413245"/>
       <w:r>
         <w:t>8. Приложение для опытных пользователей</w:t>
       </w:r>
@@ -8126,7 +8126,7 @@
       <w:pPr>
         <w:pStyle w:val="21"/>
       </w:pPr>
-      <w:bookmarkStart w:id="25" w:name="_Toc243412962"/>
+      <w:bookmarkStart w:id="25" w:name="_Toc243413246"/>
       <w:r>
         <w:t>8.1. Пакетный режим (без графического интерфейса)</w:t>
       </w:r>
@@ -8434,7 +8434,7 @@
       <w:pPr>
         <w:pStyle w:val="21"/>
       </w:pPr>
-      <w:bookmarkStart w:id="26" w:name="_Toc243412963"/>
+      <w:bookmarkStart w:id="26" w:name="_Toc243413247"/>
       <w:r>
         <w:t>8.2. Интерактивный режим с визуализацией</w:t>
       </w:r>
@@ -8496,7 +8496,7 @@
       <w:pPr>
         <w:pStyle w:val="21"/>
       </w:pPr>
-      <w:bookmarkStart w:id="27" w:name="_Toc243412964"/>
+      <w:bookmarkStart w:id="27" w:name="_Toc243413248"/>
       <w:r>
         <w:t>8.3. Ручная распаковка пакетов и переменны</w:t>
       </w:r>
@@ -8724,7 +8724,24 @@
         <w:t>install_data.bat</w:t>
       </w:r>
       <w:r>
-        <w:t xml:space="preserve">, - и запасным вариантом в </w:t>
+        <w:t>.</w:t>
+      </w:r>
+    </w:p>
+    <w:p>
+      <w:r>
+        <w:t>Если командная строка пугает — распакуйте через бесплатный архиватор 7-Zip: п</w:t>
+      </w:r>
+      <w:r>
+        <w:t xml:space="preserve">равая кнопка мыши по файлу → </w:t>
+      </w:r>
+      <w:r>
+        <w:rPr>
+          <w:b/>
+        </w:rPr>
+        <w:t>7-Zip → «Извлечь сюда»</w:t>
+      </w:r>
+      <w:r>
+        <w:t xml:space="preserve">, затем перенесите появившуюся папку (например </w:t>
       </w:r>
       <w:r>
         <w:rPr>
@@ -8732,27 +8749,24 @@
           <w:sz w:val="18"/>
           <w:shd w:val="clear" w:color="auto" w:fill="F4F4F4"/>
         </w:rPr>
-        <w:t>share\Geant4\data</w:t>
-      </w:r>
-      <w:r>
-        <w:t xml:space="preserve"> (если пакеты поставил установщик G</w:t>
-      </w:r>
-      <w:r>
-        <w:t>eant4).</w:t>
-      </w:r>
-    </w:p>
-    <w:p>
-      <w:r>
-        <w:t xml:space="preserve">Если командная строка пугает — распакуйте через бесплатный архиватор 7-Zip: правая кнопка мыши по файлу → </w:t>
-      </w:r>
+        <w:t>G4EMLOW8.8</w:t>
+      </w:r>
+      <w:r>
+        <w:t>) в папку данных Geant4.</w:t>
+      </w:r>
+    </w:p>
+    <w:p>
       <w:r>
         <w:rPr>
           <w:b/>
         </w:rPr>
-        <w:t>7-Zip → «Извлечь сюда»</w:t>
-      </w:r>
-      <w:r>
-        <w:t xml:space="preserve">, затем перенесите появившуюся папку (например </w:t>
+        <w:t>Переменные среды.</w:t>
+      </w:r>
+      <w:r>
+        <w:t xml:space="preserve"> Переменные окружения — это записи в системе Windows, которые указывают программам, где лежат файлы. Geant</w:t>
+      </w:r>
+      <w:r>
+        <w:t xml:space="preserve">4 использует переменные вида </w:t>
       </w:r>
       <w:r>
         <w:rPr>
@@ -8760,24 +8774,10 @@
           <w:sz w:val="18"/>
           <w:shd w:val="clear" w:color="auto" w:fill="F4F4F4"/>
         </w:rPr>
-        <w:t>G4EMLOW8.8</w:t>
-      </w:r>
-      <w:r>
-        <w:t>) в папку данных Geant4.</w:t>
-      </w:r>
-    </w:p>
-    <w:p>
-      <w:r>
-        <w:rPr>
-          <w:b/>
-        </w:rPr>
-        <w:t>Переменные среды.</w:t>
-      </w:r>
-      <w:r>
-        <w:t xml:space="preserve"> Переменные окружения</w:t>
-      </w:r>
-      <w:r>
-        <w:t xml:space="preserve"> — это записи в системе Windows, которые указывают программам, где лежат файлы. Geant4 использует переменные вида </w:t>
+        <w:t>G4*DATA</w:t>
+      </w:r>
+      <w:r>
+        <w:t xml:space="preserve">: например, </w:t>
       </w:r>
       <w:r>
         <w:rPr>
@@ -8785,10 +8785,10 @@
           <w:sz w:val="18"/>
           <w:shd w:val="clear" w:color="auto" w:fill="F4F4F4"/>
         </w:rPr>
-        <w:t>G4*DATA</w:t>
-      </w:r>
-      <w:r>
-        <w:t xml:space="preserve">: например, </w:t>
+        <w:t>G4RADIOACTIVEDATA</w:t>
+      </w:r>
+      <w:r>
+        <w:t xml:space="preserve"> указывает на папку со схемами распадов, </w:t>
       </w:r>
       <w:r>
         <w:rPr>
@@ -8796,10 +8796,62 @@
           <w:sz w:val="18"/>
           <w:shd w:val="clear" w:color="auto" w:fill="F4F4F4"/>
         </w:rPr>
-        <w:t>G4RADIOACTIVEDATA</w:t>
-      </w:r>
-      <w:r>
-        <w:t xml:space="preserve"> указывает на папку со схемами распадов, </w:t>
+        <w:t>G4LEVELGAMMADATA</w:t>
+      </w:r>
+      <w:r>
+        <w:t xml:space="preserve"> — на папку с уровнями дочерних ядер.</w:t>
+      </w:r>
+    </w:p>
+    <w:p>
+      <w:r>
+        <w:t>Обычно переменные создаёт установщик Geant4, но при установке без пакетов данных их может не ока</w:t>
+      </w:r>
+      <w:r>
+        <w:t xml:space="preserve">заться. </w:t>
+      </w:r>
+      <w:r>
+        <w:rPr>
+          <w:b/>
+        </w:rPr>
+        <w:t>Проще всего не трогать их руками: запустите `install_data.bat`, а затем `start.bat`</w:t>
+      </w:r>
+      <w:r>
+        <w:t xml:space="preserve"> — они сами найдут папки данных и создадут недостающие переменные (раздел 3.2).</w:t>
+      </w:r>
+    </w:p>
+    <w:p>
+      <w:r>
+        <w:t>Если нужно посмотреть или создать переменную вручную:</w:t>
+      </w:r>
+    </w:p>
+    <w:p>
+      <w:pPr>
+        <w:spacing w:after="40"/>
+        <w:ind w:left="510" w:hanging="510"/>
+      </w:pPr>
+      <w:r>
+        <w:rPr>
+          <w:b/>
+        </w:rPr>
+        <w:t>1.</w:t>
+      </w:r>
+      <w:r>
+        <w:rPr>
+          <w:b/>
+        </w:rPr>
+        <w:tab/>
+      </w:r>
+      <w:r>
+        <w:t xml:space="preserve">Нажмите </w:t>
+      </w:r>
+      <w:r>
+        <w:rPr>
+          <w:b/>
+        </w:rPr>
+        <w:t>Win + R</w:t>
+      </w:r>
+      <w:r>
+        <w:t xml:space="preserve">, введите </w:t>
       </w:r>
       <w:r>
         <w:rPr>
@@ -8807,62 +8859,7 @@
           <w:sz w:val="18"/>
           <w:shd w:val="clear" w:color="auto" w:fill="F4F4F4"/>
         </w:rPr>
-        <w:t>G4LEVELGAMMADATA</w:t>
-      </w:r>
-      <w:r>
-        <w:t xml:space="preserve"> — на папку с уровнями дочерних ядер.</w:t>
-      </w:r>
-    </w:p>
-    <w:p>
-      <w:r>
-        <w:t>Обычно пере</w:t>
-      </w:r>
-      <w:r>
-        <w:t xml:space="preserve">менные создаёт установщик Geant4, но при установке без пакетов данных их может не оказаться. </w:t>
-      </w:r>
-      <w:r>
-        <w:rPr>
-          <w:b/>
-        </w:rPr>
-        <w:t>Проще всего не трогать их руками: запустите `install_data.bat`, а затем `start.bat`</w:t>
-      </w:r>
-      <w:r>
-        <w:t xml:space="preserve"> — они сами найдут папки данных и создадут недостающие переменные (раздел 3.2).</w:t>
-      </w:r>
-    </w:p>
-    <w:p>
-      <w:r>
-        <w:t>Если нужно посмотреть или создать переменную вручную:</w:t>
-      </w:r>
-    </w:p>
-    <w:p>
-      <w:pPr>
-        <w:spacing w:after="40"/>
-        <w:ind w:left="510" w:hanging="510"/>
-      </w:pPr>
-      <w:r>
-        <w:rPr>
-          <w:b/>
-        </w:rPr>
-        <w:t>1.</w:t>
-      </w:r>
-      <w:r>
-        <w:rPr>
-          <w:b/>
-        </w:rPr>
-        <w:tab/>
-      </w:r>
-      <w:r>
-        <w:t xml:space="preserve">Нажмите </w:t>
-      </w:r>
-      <w:r>
-        <w:rPr>
-          <w:b/>
-        </w:rPr>
-        <w:t>Win + R</w:t>
-      </w:r>
-      <w:r>
-        <w:t xml:space="preserve">, введите </w:t>
+        <w:t>sys</w:t>
       </w:r>
       <w:r>
         <w:rPr>
@@ -8870,7 +8867,7 @@
           <w:sz w:val="18"/>
           <w:shd w:val="clear" w:color="auto" w:fill="F4F4F4"/>
         </w:rPr>
-        <w:t>sysdm.cpl</w:t>
+        <w:t>dm.cpl</w:t>
       </w:r>
       <w:r>
         <w:t>, нажмите Enter.</w:t>
@@ -8926,10 +8923,7 @@
         <w:t>G4RADIOACTIVEDATA</w:t>
       </w:r>
       <w:r>
-        <w:t xml:space="preserve"> — она может находиться в блоке «Системные переменные» или «Пер</w:t>
-      </w:r>
-      <w:r>
-        <w:t xml:space="preserve">еменные пользователя»; значением должен быть путь вида </w:t>
+        <w:t xml:space="preserve"> — она может находиться в блоке «Системные переменные» или «Переменные пользователя»; значением должен быть путь вида </w:t>
       </w:r>
       <w:r>
         <w:rPr>
@@ -8972,10 +8966,7 @@
         <w:tab/>
       </w:r>
       <w:r>
-        <w:t>Если переменной нет, а папка с данными уже скачана — нажмите «Создать…» и укажите имя переменно</w:t>
-      </w:r>
-      <w:r>
-        <w:t xml:space="preserve">й и путь к папке. Но быстрее и надёжнее это делает </w:t>
+        <w:t xml:space="preserve">Если переменной нет, а папка с данными уже скачана — нажмите «Создать…» и укажите имя переменной и путь к папке. Но быстрее и надёжнее это делает </w:t>
       </w:r>
       <w:r>
         <w:rPr>
@@ -8993,9 +8984,12 @@
       <w:pPr>
         <w:pStyle w:val="21"/>
       </w:pPr>
-      <w:bookmarkStart w:id="28" w:name="_Toc243412965"/>
-      <w:r>
-        <w:t>8.4. Обновление и удаление</w:t>
+      <w:bookmarkStart w:id="28" w:name="_Toc243413249"/>
+      <w:r>
+        <w:t>8.4. Обновление и удале</w:t>
+      </w:r>
+      <w:r>
+        <w:t>ние</w:t>
       </w:r>
       <w:bookmarkEnd w:id="28"/>
     </w:p>
@@ -9040,10 +9034,10 @@
         <w:t>Удаление:</w:t>
       </w:r>
       <w:r>
-        <w:t xml:space="preserve"> пр</w:t>
-      </w:r>
-      <w:r>
-        <w:t>осто удалите папку программы. Установленные Geant4, Python и matplotlib удаляются стандартными средствами Windows («Приложения»), если они больше не нужны.</w:t>
+        <w:t xml:space="preserve"> просто удалите папку программы. Установленные Geant4, Python и matplotlib удаляются ста</w:t>
+      </w:r>
+      <w:r>
+        <w:t>ндартными средствами Windows («Приложения»), если они больше не нужны.</w:t>
       </w:r>
     </w:p>
     <w:p>
@@ -9058,7 +9052,7 @@
       <w:pPr>
         <w:pStyle w:val="1"/>
       </w:pPr>
-      <w:bookmarkStart w:id="29" w:name="_Toc243412966"/>
+      <w:bookmarkStart w:id="29" w:name="_Toc243413250"/>
       <w:r>
         <w:t>9. Контрольный список перед первым запуском</w:t>
       </w:r>
@@ -9103,7 +9097,10 @@
         <w:tab/>
       </w:r>
       <w:r>
-        <w:t>Установлен Geant4 11.4.1 (раздел 3), отмечена опция добавления в PATH, компьютер перезагружался после установки.</w:t>
+        <w:t xml:space="preserve">Установлен Geant4 11.4.1 (раздел 3), отмечена опция добавления в PATH, компьютер </w:t>
+      </w:r>
+      <w:r>
+        <w:t>перезагружался после установки.</w:t>
       </w:r>
     </w:p>
     <w:p>
@@ -9189,7 +9186,10 @@
         <w:t>py --version</w:t>
       </w:r>
       <w:r>
-        <w:t xml:space="preserve"> возвращает нужную версию (раздел 4.3).</w:t>
+        <w:t xml:space="preserve"> возвращае</w:t>
+      </w:r>
+      <w:r>
+        <w:t>т нужную версию (раздел 4.3).</w:t>
       </w:r>
     </w:p>
     <w:p>
@@ -9286,7 +9286,6 @@
         <w:rPr>
           <w:rFonts w:ascii="Segoe UI Symbol" w:hAnsi="Segoe UI Symbol"/>
         </w:rPr>
-        <w:lastRenderedPageBreak/>
         <w:t>☐</w:t>
       </w:r>
       <w:r>
@@ -9296,7 +9295,10 @@
         <w:tab/>
       </w:r>
       <w:r>
-        <w:t>На вкладке «Радионуклид» выбран нуклид, и показаны T½ и статус данных Geant4.</w:t>
+        <w:t>На вкладке «Рад</w:t>
+      </w:r>
+      <w:r>
+        <w:t>ионуклид» выбран нуклид, и показаны T½ и статус данных Geant4.</w:t>
       </w:r>
     </w:p>
     <w:p>
@@ -9308,6 +9310,7 @@
         <w:rPr>
           <w:rFonts w:ascii="Segoe UI Symbol" w:hAnsi="Segoe UI Symbol"/>
         </w:rPr>
+        <w:lastRenderedPageBreak/>
         <w:t>☐</w:t>
       </w:r>
       <w:r>
@@ -20939,7 +20942,7 @@
     <w:autoRedefine/>
     <w:uiPriority w:val="39"/>
     <w:unhideWhenUsed/>
-    <w:rsid w:val="00847817"/>
+    <w:rsid w:val="00E27F98"/>
     <w:pPr>
       <w:spacing w:after="100"/>
     </w:pPr>
@@ -20951,7 +20954,7 @@
     <w:autoRedefine/>
     <w:uiPriority w:val="39"/>
     <w:unhideWhenUsed/>
-    <w:rsid w:val="00847817"/>
+    <w:rsid w:val="00E27F98"/>
     <w:pPr>
       <w:spacing w:after="100"/>
       <w:ind w:left="220"/>
@@ -20962,7 +20965,7 @@
     <w:basedOn w:val="a2"/>
     <w:uiPriority w:val="99"/>
     <w:unhideWhenUsed/>
-    <w:rsid w:val="00847817"/>
+    <w:rsid w:val="00E27F98"/>
     <w:rPr>
       <w:color w:val="0000FF" w:themeColor="hyperlink"/>
       <w:u w:val="single"/>

</xml_diff>

<commit_message>
Request admin rights automatically; install all datasets; update manual
</commit_message>
<xml_diff>
--- a/MANUAL.docx
+++ b/MANUAL.docx
@@ -27,7 +27,7 @@
         <w:ind w:left="340" w:hanging="198"/>
       </w:pPr>
       <w:r>
-        <w:t>Версия документа: 3.3</w:t>
+        <w:t>Версия документа: 3.4</w:t>
       </w:r>
     </w:p>
     <w:p>
@@ -93,7 +93,7 @@
       <w:r>
         <w:fldChar w:fldCharType="separate"/>
       </w:r>
-      <w:hyperlink w:anchor="_Toc243415794" w:history="1">
+      <w:hyperlink w:anchor="_Toc243493612" w:history="1">
         <w:r>
           <w:rPr>
             <w:rStyle w:val="aff8"/>
@@ -120,7 +120,7 @@
             <w:noProof/>
             <w:webHidden/>
           </w:rPr>
-          <w:instrText xml:space="preserve"> PAGEREF _Toc243415794 \h </w:instrText>
+          <w:instrText xml:space="preserve"> PAGEREF _Toc243493612 \h </w:instrText>
         </w:r>
         <w:r>
           <w:rPr>
@@ -161,7 +161,7 @@
           <w:noProof/>
         </w:rPr>
       </w:pPr>
-      <w:hyperlink w:anchor="_Toc243415795" w:history="1">
+      <w:hyperlink w:anchor="_Toc243493613" w:history="1">
         <w:r>
           <w:rPr>
             <w:rStyle w:val="aff8"/>
@@ -188,7 +188,7 @@
             <w:noProof/>
             <w:webHidden/>
           </w:rPr>
-          <w:instrText xml:space="preserve"> PAGEREF _Toc243415795 \h </w:instrText>
+          <w:instrText xml:space="preserve"> PAGEREF _Toc243493613 \h </w:instrText>
         </w:r>
         <w:r>
           <w:rPr>
@@ -229,7 +229,7 @@
           <w:noProof/>
         </w:rPr>
       </w:pPr>
-      <w:hyperlink w:anchor="_Toc243415796" w:history="1">
+      <w:hyperlink w:anchor="_Toc243493614" w:history="1">
         <w:r>
           <w:rPr>
             <w:rStyle w:val="aff8"/>
@@ -256,7 +256,7 @@
             <w:noProof/>
             <w:webHidden/>
           </w:rPr>
-          <w:instrText xml:space="preserve"> PAGEREF _Toc243415796 \h </w:instrText>
+          <w:instrText xml:space="preserve"> PAGEREF _Toc243493614 \h </w:instrText>
         </w:r>
         <w:r>
           <w:rPr>
@@ -297,7 +297,7 @@
           <w:noProof/>
         </w:rPr>
       </w:pPr>
-      <w:hyperlink w:anchor="_Toc243415797" w:history="1">
+      <w:hyperlink w:anchor="_Toc243493615" w:history="1">
         <w:r>
           <w:rPr>
             <w:rStyle w:val="aff8"/>
@@ -324,7 +324,7 @@
             <w:noProof/>
             <w:webHidden/>
           </w:rPr>
-          <w:instrText xml:space="preserve"> PAGEREF _Toc243415797 \h </w:instrText>
+          <w:instrText xml:space="preserve"> PAGEREF _Toc243493615 \h </w:instrText>
         </w:r>
         <w:r>
           <w:rPr>
@@ -365,7 +365,7 @@
           <w:noProof/>
         </w:rPr>
       </w:pPr>
-      <w:hyperlink w:anchor="_Toc243415798" w:history="1">
+      <w:hyperlink w:anchor="_Toc243493616" w:history="1">
         <w:r>
           <w:rPr>
             <w:rStyle w:val="aff8"/>
@@ -392,7 +392,7 @@
             <w:noProof/>
             <w:webHidden/>
           </w:rPr>
-          <w:instrText xml:space="preserve"> PAGEREF _Toc243415798 \h </w:instrText>
+          <w:instrText xml:space="preserve"> PAGEREF _Toc243493616 \h </w:instrText>
         </w:r>
         <w:r>
           <w:rPr>
@@ -433,7 +433,7 @@
           <w:noProof/>
         </w:rPr>
       </w:pPr>
-      <w:hyperlink w:anchor="_Toc243415799" w:history="1">
+      <w:hyperlink w:anchor="_Toc243493617" w:history="1">
         <w:r>
           <w:rPr>
             <w:rStyle w:val="aff8"/>
@@ -460,7 +460,7 @@
             <w:noProof/>
             <w:webHidden/>
           </w:rPr>
-          <w:instrText xml:space="preserve"> PAGEREF _Toc243415799 \h </w:instrText>
+          <w:instrText xml:space="preserve"> PAGEREF _Toc243493617 \h </w:instrText>
         </w:r>
         <w:r>
           <w:rPr>
@@ -501,7 +501,7 @@
           <w:noProof/>
         </w:rPr>
       </w:pPr>
-      <w:hyperlink w:anchor="_Toc243415800" w:history="1">
+      <w:hyperlink w:anchor="_Toc243493618" w:history="1">
         <w:r>
           <w:rPr>
             <w:rStyle w:val="aff8"/>
@@ -528,7 +528,7 @@
             <w:noProof/>
             <w:webHidden/>
           </w:rPr>
-          <w:instrText xml:space="preserve"> PAGEREF _Toc243415800 \h </w:instrText>
+          <w:instrText xml:space="preserve"> PAGEREF _Toc243493618 \h </w:instrText>
         </w:r>
         <w:r>
           <w:rPr>
@@ -569,7 +569,7 @@
           <w:noProof/>
         </w:rPr>
       </w:pPr>
-      <w:hyperlink w:anchor="_Toc243415801" w:history="1">
+      <w:hyperlink w:anchor="_Toc243493619" w:history="1">
         <w:r>
           <w:rPr>
             <w:rStyle w:val="aff8"/>
@@ -596,7 +596,7 @@
             <w:noProof/>
             <w:webHidden/>
           </w:rPr>
-          <w:instrText xml:space="preserve"> PAGEREF _Toc243415801 \h </w:instrText>
+          <w:instrText xml:space="preserve"> PAGEREF _Toc243493619 \h </w:instrText>
         </w:r>
         <w:r>
           <w:rPr>
@@ -637,7 +637,7 @@
           <w:noProof/>
         </w:rPr>
       </w:pPr>
-      <w:hyperlink w:anchor="_Toc243415802" w:history="1">
+      <w:hyperlink w:anchor="_Toc243493620" w:history="1">
         <w:r>
           <w:rPr>
             <w:rStyle w:val="aff8"/>
@@ -664,7 +664,7 @@
             <w:noProof/>
             <w:webHidden/>
           </w:rPr>
-          <w:instrText xml:space="preserve"> PAGEREF _Toc243415802 \h </w:instrText>
+          <w:instrText xml:space="preserve"> PAGEREF _Toc243493620 \h </w:instrText>
         </w:r>
         <w:r>
           <w:rPr>
@@ -705,7 +705,7 @@
           <w:noProof/>
         </w:rPr>
       </w:pPr>
-      <w:hyperlink w:anchor="_Toc243415803" w:history="1">
+      <w:hyperlink w:anchor="_Toc243493621" w:history="1">
         <w:r>
           <w:rPr>
             <w:rStyle w:val="aff8"/>
@@ -732,7 +732,7 @@
             <w:noProof/>
             <w:webHidden/>
           </w:rPr>
-          <w:instrText xml:space="preserve"> PAGEREF _Toc243415803 \h </w:instrText>
+          <w:instrText xml:space="preserve"> PAGEREF _Toc243493621 \h </w:instrText>
         </w:r>
         <w:r>
           <w:rPr>
@@ -773,7 +773,7 @@
           <w:noProof/>
         </w:rPr>
       </w:pPr>
-      <w:hyperlink w:anchor="_Toc243415804" w:history="1">
+      <w:hyperlink w:anchor="_Toc243493622" w:history="1">
         <w:r>
           <w:rPr>
             <w:rStyle w:val="aff8"/>
@@ -800,7 +800,7 @@
             <w:noProof/>
             <w:webHidden/>
           </w:rPr>
-          <w:instrText xml:space="preserve"> PAGEREF _Toc243415804 \h </w:instrText>
+          <w:instrText xml:space="preserve"> PAGEREF _Toc243493622 \h </w:instrText>
         </w:r>
         <w:r>
           <w:rPr>
@@ -841,7 +841,7 @@
           <w:noProof/>
         </w:rPr>
       </w:pPr>
-      <w:hyperlink w:anchor="_Toc243415805" w:history="1">
+      <w:hyperlink w:anchor="_Toc243493623" w:history="1">
         <w:r>
           <w:rPr>
             <w:rStyle w:val="aff8"/>
@@ -868,7 +868,7 @@
             <w:noProof/>
             <w:webHidden/>
           </w:rPr>
-          <w:instrText xml:space="preserve"> PAGEREF _Toc243415805 \h </w:instrText>
+          <w:instrText xml:space="preserve"> PAGEREF _Toc243493623 \h </w:instrText>
         </w:r>
         <w:r>
           <w:rPr>
@@ -909,7 +909,7 @@
           <w:noProof/>
         </w:rPr>
       </w:pPr>
-      <w:hyperlink w:anchor="_Toc243415806" w:history="1">
+      <w:hyperlink w:anchor="_Toc243493624" w:history="1">
         <w:r>
           <w:rPr>
             <w:rStyle w:val="aff8"/>
@@ -936,7 +936,7 @@
             <w:noProof/>
             <w:webHidden/>
           </w:rPr>
-          <w:instrText xml:space="preserve"> PAGEREF _Toc243415806 \h </w:instrText>
+          <w:instrText xml:space="preserve"> PAGEREF _Toc243493624 \h </w:instrText>
         </w:r>
         <w:r>
           <w:rPr>
@@ -977,7 +977,7 @@
           <w:noProof/>
         </w:rPr>
       </w:pPr>
-      <w:hyperlink w:anchor="_Toc243415807" w:history="1">
+      <w:hyperlink w:anchor="_Toc243493625" w:history="1">
         <w:r>
           <w:rPr>
             <w:rStyle w:val="aff8"/>
@@ -1004,7 +1004,7 @@
             <w:noProof/>
             <w:webHidden/>
           </w:rPr>
-          <w:instrText xml:space="preserve"> PAGEREF _Toc243415807 \h </w:instrText>
+          <w:instrText xml:space="preserve"> PAGEREF _Toc243493625 \h </w:instrText>
         </w:r>
         <w:r>
           <w:rPr>
@@ -1045,7 +1045,7 @@
           <w:noProof/>
         </w:rPr>
       </w:pPr>
-      <w:hyperlink w:anchor="_Toc243415808" w:history="1">
+      <w:hyperlink w:anchor="_Toc243493626" w:history="1">
         <w:r>
           <w:rPr>
             <w:rStyle w:val="aff8"/>
@@ -1072,7 +1072,7 @@
             <w:noProof/>
             <w:webHidden/>
           </w:rPr>
-          <w:instrText xml:space="preserve"> PAGEREF _Toc243415808 \h </w:instrText>
+          <w:instrText xml:space="preserve"> PAGEREF _Toc243493626 \h </w:instrText>
         </w:r>
         <w:r>
           <w:rPr>
@@ -1113,7 +1113,7 @@
           <w:noProof/>
         </w:rPr>
       </w:pPr>
-      <w:hyperlink w:anchor="_Toc243415809" w:history="1">
+      <w:hyperlink w:anchor="_Toc243493627" w:history="1">
         <w:r>
           <w:rPr>
             <w:rStyle w:val="aff8"/>
@@ -1140,7 +1140,7 @@
             <w:noProof/>
             <w:webHidden/>
           </w:rPr>
-          <w:instrText xml:space="preserve"> PAGEREF _Toc243415809 \h </w:instrText>
+          <w:instrText xml:space="preserve"> PAGEREF _Toc243493627 \h </w:instrText>
         </w:r>
         <w:r>
           <w:rPr>
@@ -1160,7 +1160,7 @@
             <w:noProof/>
             <w:webHidden/>
           </w:rPr>
-          <w:t>8</w:t>
+          <w:t>9</w:t>
         </w:r>
         <w:r>
           <w:rPr>
@@ -1181,7 +1181,7 @@
           <w:noProof/>
         </w:rPr>
       </w:pPr>
-      <w:hyperlink w:anchor="_Toc243415810" w:history="1">
+      <w:hyperlink w:anchor="_Toc243493628" w:history="1">
         <w:r>
           <w:rPr>
             <w:rStyle w:val="aff8"/>
@@ -1208,7 +1208,7 @@
             <w:noProof/>
             <w:webHidden/>
           </w:rPr>
-          <w:instrText xml:space="preserve"> PAGEREF _Toc243415810 \h </w:instrText>
+          <w:instrText xml:space="preserve"> PAGEREF _Toc243493628 \h </w:instrText>
         </w:r>
         <w:r>
           <w:rPr>
@@ -1228,7 +1228,7 @@
             <w:noProof/>
             <w:webHidden/>
           </w:rPr>
-          <w:t>8</w:t>
+          <w:t>9</w:t>
         </w:r>
         <w:r>
           <w:rPr>
@@ -1249,7 +1249,7 @@
           <w:noProof/>
         </w:rPr>
       </w:pPr>
-      <w:hyperlink w:anchor="_Toc243415811" w:history="1">
+      <w:hyperlink w:anchor="_Toc243493629" w:history="1">
         <w:r>
           <w:rPr>
             <w:rStyle w:val="aff8"/>
@@ -1276,7 +1276,7 @@
             <w:noProof/>
             <w:webHidden/>
           </w:rPr>
-          <w:instrText xml:space="preserve"> PAGEREF _Toc243415811 \h </w:instrText>
+          <w:instrText xml:space="preserve"> PAGEREF _Toc243493629 \h </w:instrText>
         </w:r>
         <w:r>
           <w:rPr>
@@ -1317,7 +1317,7 @@
           <w:noProof/>
         </w:rPr>
       </w:pPr>
-      <w:hyperlink w:anchor="_Toc243415812" w:history="1">
+      <w:hyperlink w:anchor="_Toc243493630" w:history="1">
         <w:r>
           <w:rPr>
             <w:rStyle w:val="aff8"/>
@@ -1344,7 +1344,7 @@
             <w:noProof/>
             <w:webHidden/>
           </w:rPr>
-          <w:instrText xml:space="preserve"> PAGEREF _Toc243415812 \h </w:instrText>
+          <w:instrText xml:space="preserve"> PAGEREF _Toc243493630 \h </w:instrText>
         </w:r>
         <w:r>
           <w:rPr>
@@ -1385,7 +1385,7 @@
           <w:noProof/>
         </w:rPr>
       </w:pPr>
-      <w:hyperlink w:anchor="_Toc243415813" w:history="1">
+      <w:hyperlink w:anchor="_Toc243493631" w:history="1">
         <w:r>
           <w:rPr>
             <w:rStyle w:val="aff8"/>
@@ -1412,7 +1412,7 @@
             <w:noProof/>
             <w:webHidden/>
           </w:rPr>
-          <w:instrText xml:space="preserve"> PAGEREF _Toc243415813 \h </w:instrText>
+          <w:instrText xml:space="preserve"> PAGEREF _Toc243493631 \h </w:instrText>
         </w:r>
         <w:r>
           <w:rPr>
@@ -1432,7 +1432,7 @@
             <w:noProof/>
             <w:webHidden/>
           </w:rPr>
-          <w:t>10</w:t>
+          <w:t>11</w:t>
         </w:r>
         <w:r>
           <w:rPr>
@@ -1453,7 +1453,7 @@
           <w:noProof/>
         </w:rPr>
       </w:pPr>
-      <w:hyperlink w:anchor="_Toc243415814" w:history="1">
+      <w:hyperlink w:anchor="_Toc243493632" w:history="1">
         <w:r>
           <w:rPr>
             <w:rStyle w:val="aff8"/>
@@ -1480,7 +1480,7 @@
             <w:noProof/>
             <w:webHidden/>
           </w:rPr>
-          <w:instrText xml:space="preserve"> PAGEREF _Toc243415814 \h </w:instrText>
+          <w:instrText xml:space="preserve"> PAGEREF _Toc243493632 \h </w:instrText>
         </w:r>
         <w:r>
           <w:rPr>
@@ -1521,7 +1521,7 @@
           <w:noProof/>
         </w:rPr>
       </w:pPr>
-      <w:hyperlink w:anchor="_Toc243415815" w:history="1">
+      <w:hyperlink w:anchor="_Toc243493633" w:history="1">
         <w:r>
           <w:rPr>
             <w:rStyle w:val="aff8"/>
@@ -1548,7 +1548,7 @@
             <w:noProof/>
             <w:webHidden/>
           </w:rPr>
-          <w:instrText xml:space="preserve"> PAGEREF _Toc243415815 \h </w:instrText>
+          <w:instrText xml:space="preserve"> PAGEREF _Toc243493633 \h </w:instrText>
         </w:r>
         <w:r>
           <w:rPr>
@@ -1589,7 +1589,7 @@
           <w:noProof/>
         </w:rPr>
       </w:pPr>
-      <w:hyperlink w:anchor="_Toc243415816" w:history="1">
+      <w:hyperlink w:anchor="_Toc243493634" w:history="1">
         <w:r>
           <w:rPr>
             <w:rStyle w:val="aff8"/>
@@ -1616,7 +1616,7 @@
             <w:noProof/>
             <w:webHidden/>
           </w:rPr>
-          <w:instrText xml:space="preserve"> PAGEREF _Toc243415816 \h </w:instrText>
+          <w:instrText xml:space="preserve"> PAGEREF _Toc243493634 \h </w:instrText>
         </w:r>
         <w:r>
           <w:rPr>
@@ -1636,7 +1636,7 @@
             <w:noProof/>
             <w:webHidden/>
           </w:rPr>
-          <w:t>11</w:t>
+          <w:t>12</w:t>
         </w:r>
         <w:r>
           <w:rPr>
@@ -1657,7 +1657,7 @@
           <w:noProof/>
         </w:rPr>
       </w:pPr>
-      <w:hyperlink w:anchor="_Toc243415817" w:history="1">
+      <w:hyperlink w:anchor="_Toc243493635" w:history="1">
         <w:r>
           <w:rPr>
             <w:rStyle w:val="aff8"/>
@@ -1684,7 +1684,7 @@
             <w:noProof/>
             <w:webHidden/>
           </w:rPr>
-          <w:instrText xml:space="preserve"> PAGEREF _Toc243415817 \h </w:instrText>
+          <w:instrText xml:space="preserve"> PAGEREF _Toc243493635 \h </w:instrText>
         </w:r>
         <w:r>
           <w:rPr>
@@ -1704,7 +1704,7 @@
             <w:noProof/>
             <w:webHidden/>
           </w:rPr>
-          <w:t>11</w:t>
+          <w:t>12</w:t>
         </w:r>
         <w:r>
           <w:rPr>
@@ -1725,7 +1725,7 @@
           <w:noProof/>
         </w:rPr>
       </w:pPr>
-      <w:hyperlink w:anchor="_Toc243415818" w:history="1">
+      <w:hyperlink w:anchor="_Toc243493636" w:history="1">
         <w:r>
           <w:rPr>
             <w:rStyle w:val="aff8"/>
@@ -1752,7 +1752,7 @@
             <w:noProof/>
             <w:webHidden/>
           </w:rPr>
-          <w:instrText xml:space="preserve"> PAGEREF _Toc243415818 \h </w:instrText>
+          <w:instrText xml:space="preserve"> PAGEREF _Toc243493636 \h </w:instrText>
         </w:r>
         <w:r>
           <w:rPr>
@@ -1793,7 +1793,7 @@
           <w:noProof/>
         </w:rPr>
       </w:pPr>
-      <w:hyperlink w:anchor="_Toc243415819" w:history="1">
+      <w:hyperlink w:anchor="_Toc243493637" w:history="1">
         <w:r>
           <w:rPr>
             <w:rStyle w:val="aff8"/>
@@ -1820,7 +1820,7 @@
             <w:noProof/>
             <w:webHidden/>
           </w:rPr>
-          <w:instrText xml:space="preserve"> PAGEREF _Toc243415819 \h </w:instrText>
+          <w:instrText xml:space="preserve"> PAGEREF _Toc243493637 \h </w:instrText>
         </w:r>
         <w:r>
           <w:rPr>
@@ -1861,7 +1861,7 @@
           <w:noProof/>
         </w:rPr>
       </w:pPr>
-      <w:hyperlink w:anchor="_Toc243415820" w:history="1">
+      <w:hyperlink w:anchor="_Toc243493638" w:history="1">
         <w:r>
           <w:rPr>
             <w:rStyle w:val="aff8"/>
@@ -1888,7 +1888,7 @@
             <w:noProof/>
             <w:webHidden/>
           </w:rPr>
-          <w:instrText xml:space="preserve"> PAGEREF _Toc243415820 \h </w:instrText>
+          <w:instrText xml:space="preserve"> PAGEREF _Toc243493638 \h </w:instrText>
         </w:r>
         <w:r>
           <w:rPr>
@@ -1908,7 +1908,7 @@
             <w:noProof/>
             <w:webHidden/>
           </w:rPr>
-          <w:t>12</w:t>
+          <w:t>13</w:t>
         </w:r>
         <w:r>
           <w:rPr>
@@ -1929,7 +1929,7 @@
           <w:noProof/>
         </w:rPr>
       </w:pPr>
-      <w:hyperlink w:anchor="_Toc243415821" w:history="1">
+      <w:hyperlink w:anchor="_Toc243493639" w:history="1">
         <w:r>
           <w:rPr>
             <w:rStyle w:val="aff8"/>
@@ -1956,7 +1956,7 @@
             <w:noProof/>
             <w:webHidden/>
           </w:rPr>
-          <w:instrText xml:space="preserve"> PAGEREF _Toc243415821 \h </w:instrText>
+          <w:instrText xml:space="preserve"> PAGEREF _Toc243493639 \h </w:instrText>
         </w:r>
         <w:r>
           <w:rPr>
@@ -1997,7 +1997,7 @@
           <w:noProof/>
         </w:rPr>
       </w:pPr>
-      <w:hyperlink w:anchor="_Toc243415822" w:history="1">
+      <w:hyperlink w:anchor="_Toc243493640" w:history="1">
         <w:r>
           <w:rPr>
             <w:rStyle w:val="aff8"/>
@@ -2024,7 +2024,7 @@
             <w:noProof/>
             <w:webHidden/>
           </w:rPr>
-          <w:instrText xml:space="preserve"> PAGEREF _Toc243415822 \h </w:instrText>
+          <w:instrText xml:space="preserve"> PAGEREF _Toc243493640 \h </w:instrText>
         </w:r>
         <w:r>
           <w:rPr>
@@ -2044,7 +2044,7 @@
             <w:noProof/>
             <w:webHidden/>
           </w:rPr>
-          <w:t>13</w:t>
+          <w:t>14</w:t>
         </w:r>
         <w:r>
           <w:rPr>
@@ -2065,7 +2065,7 @@
           <w:noProof/>
         </w:rPr>
       </w:pPr>
-      <w:hyperlink w:anchor="_Toc243415823" w:history="1">
+      <w:hyperlink w:anchor="_Toc243493641" w:history="1">
         <w:r>
           <w:rPr>
             <w:rStyle w:val="aff8"/>
@@ -2092,7 +2092,7 @@
             <w:noProof/>
             <w:webHidden/>
           </w:rPr>
-          <w:instrText xml:space="preserve"> PAGEREF _Toc243415823 \h </w:instrText>
+          <w:instrText xml:space="preserve"> PAGEREF _Toc243493641 \h </w:instrText>
         </w:r>
         <w:r>
           <w:rPr>
@@ -2137,7 +2137,7 @@
       <w:pPr>
         <w:pStyle w:val="1"/>
       </w:pPr>
-      <w:bookmarkStart w:id="0" w:name="_Toc243415794"/>
+      <w:bookmarkStart w:id="0" w:name="_Toc243493612"/>
       <w:r>
         <w:lastRenderedPageBreak/>
         <w:t>1. О программе</w:t>
@@ -2561,7 +2561,7 @@
           <w:rFonts w:ascii="Consolas" w:hAnsi="Consolas" w:cs="Consolas"/>
           <w:sz w:val="18"/>
         </w:rPr>
-        <w:t>├── install_data.bat          — установка пакетов данных Geant4 (запускается один раз)</w:t>
+        <w:t>├── install_data.bat          — установка пакетов данных Geant4, любых (запускается один раз)</w:t>
       </w:r>
     </w:p>
     <w:p>
@@ -2591,7 +2591,14 @@
           <w:rFonts w:ascii="Consolas" w:hAnsi="Consolas" w:cs="Consolas"/>
           <w:sz w:val="18"/>
         </w:rPr>
-        <w:t>├── vis.mac, gui.mac          — макросы визуализации и меню</w:t>
+        <w:t xml:space="preserve">├── vis.mac, gui.mac          — макросы визуализации и </w:t>
+      </w:r>
+      <w:r>
+        <w:rPr>
+          <w:rFonts w:ascii="Consolas" w:hAnsi="Consolas" w:cs="Consolas"/>
+          <w:sz w:val="18"/>
+        </w:rPr>
+        <w:t>меню</w:t>
       </w:r>
     </w:p>
     <w:p>
@@ -2606,14 +2613,7 @@
           <w:rFonts w:ascii="Consolas" w:hAnsi="Consolas" w:cs="Consolas"/>
           <w:sz w:val="18"/>
         </w:rPr>
-        <w:t>├─</w:t>
-      </w:r>
-      <w:r>
-        <w:rPr>
-          <w:rFonts w:ascii="Consolas" w:hAnsi="Consolas" w:cs="Consolas"/>
-          <w:sz w:val="18"/>
-        </w:rPr>
-        <w:t>─ MANUAL.docx               — это руководство в формате Word</w:t>
+        <w:t>├── MANUAL.docx               — это руководство в формате Word</w:t>
       </w:r>
     </w:p>
     <w:p>
@@ -2642,7 +2642,7 @@
       <w:pPr>
         <w:pStyle w:val="1"/>
       </w:pPr>
-      <w:bookmarkStart w:id="1" w:name="_Toc243415795"/>
+      <w:bookmarkStart w:id="1" w:name="_Toc243493613"/>
       <w:r>
         <w:t>2. Системные требования</w:t>
       </w:r>
@@ -2797,10 +2797,7 @@
               <w:cnfStyle w:val="000000010000" w:firstRow="0" w:lastRow="0" w:firstColumn="0" w:lastColumn="0" w:oddVBand="0" w:evenVBand="0" w:oddHBand="0" w:evenHBand="1" w:firstRowFirstColumn="0" w:firstRowLastColumn="0" w:lastRowFirstColumn="0" w:lastRowLastColumn="0"/>
             </w:pPr>
             <w:r>
-              <w:t xml:space="preserve">крупный </w:t>
-            </w:r>
-            <w:r>
-              <w:t xml:space="preserve">пакет, занимает несколько ГБ на диске; отдельно скачиваются пакеты данных, см. </w:t>
+              <w:t xml:space="preserve">крупный пакет, занимает несколько ГБ на диске; отдельно скачиваются пакеты данных, см. </w:t>
             </w:r>
             <w:r>
               <w:lastRenderedPageBreak/>
@@ -2935,10 +2932,10 @@
               <w:cnfStyle w:val="000000100000" w:firstRow="0" w:lastRow="0" w:firstColumn="0" w:lastColumn="0" w:oddVBand="0" w:evenVBand="0" w:oddHBand="1" w:evenHBand="0" w:firstRowFirstColumn="0" w:firstRowLastColumn="0" w:lastRowFirstColumn="0" w:lastRowLastColumn="0"/>
             </w:pPr>
             <w:r>
-              <w:t>ставится вм</w:t>
+              <w:t>ста</w:t>
             </w:r>
             <w:r>
-              <w:t>есте с Geant4</w:t>
+              <w:t>вится вместе с Geant4</w:t>
             </w:r>
           </w:p>
         </w:tc>
@@ -3068,7 +3065,7 @@
       <w:pPr>
         <w:pStyle w:val="1"/>
       </w:pPr>
-      <w:bookmarkStart w:id="2" w:name="_Toc243415796"/>
+      <w:bookmarkStart w:id="2" w:name="_Toc243493614"/>
       <w:r>
         <w:t>3. Скачивание и распаковка программы</w:t>
       </w:r>
@@ -3086,7 +3083,7 @@
       <w:pPr>
         <w:pStyle w:val="21"/>
       </w:pPr>
-      <w:bookmarkStart w:id="3" w:name="_Toc243415797"/>
+      <w:bookmarkStart w:id="3" w:name="_Toc243493615"/>
       <w:r>
         <w:t>3.1. Скачивание</w:t>
       </w:r>
@@ -3144,7 +3141,7 @@
       <w:pPr>
         <w:pStyle w:val="21"/>
       </w:pPr>
-      <w:bookmarkStart w:id="4" w:name="_Toc243415798"/>
+      <w:bookmarkStart w:id="4" w:name="_Toc243493616"/>
       <w:r>
         <w:t>3.2. Распаковка</w:t>
       </w:r>
@@ -3346,7 +3343,7 @@
       <w:pPr>
         <w:pStyle w:val="1"/>
       </w:pPr>
-      <w:bookmarkStart w:id="5" w:name="_Toc243415799"/>
+      <w:bookmarkStart w:id="5" w:name="_Toc243493617"/>
       <w:r>
         <w:t>4. Установка Python и зависимостей</w:t>
       </w:r>
@@ -3356,7 +3353,7 @@
       <w:pPr>
         <w:pStyle w:val="21"/>
       </w:pPr>
-      <w:bookmarkStart w:id="6" w:name="_Toc243415800"/>
+      <w:bookmarkStart w:id="6" w:name="_Toc243493618"/>
       <w:r>
         <w:t>4.1. Установка Python</w:t>
       </w:r>
@@ -3532,7 +3529,7 @@
       <w:pPr>
         <w:pStyle w:val="21"/>
       </w:pPr>
-      <w:bookmarkStart w:id="7" w:name="_Toc243415801"/>
+      <w:bookmarkStart w:id="7" w:name="_Toc243493619"/>
       <w:r>
         <w:t>4.2. Открываем командную строку</w:t>
       </w:r>
@@ -3688,7 +3685,7 @@
       <w:pPr>
         <w:pStyle w:val="21"/>
       </w:pPr>
-      <w:bookmarkStart w:id="8" w:name="_Toc243415802"/>
+      <w:bookmarkStart w:id="8" w:name="_Toc243493620"/>
       <w:r>
         <w:t>4.3. Проверка, что Python установлен</w:t>
       </w:r>
@@ -3763,7 +3760,7 @@
       <w:pPr>
         <w:pStyle w:val="21"/>
       </w:pPr>
-      <w:bookmarkStart w:id="9" w:name="_Toc243415803"/>
+      <w:bookmarkStart w:id="9" w:name="_Toc243493621"/>
       <w:r>
         <w:t>4.4. Установка matplotlib</w:t>
       </w:r>
@@ -3855,7 +3852,7 @@
       <w:pPr>
         <w:pStyle w:val="21"/>
       </w:pPr>
-      <w:bookmarkStart w:id="10" w:name="_Toc243415804"/>
+      <w:bookmarkStart w:id="10" w:name="_Toc243493622"/>
       <w:r>
         <w:t>4.5. Закройте командную строку</w:t>
       </w:r>
@@ -3883,7 +3880,7 @@
       <w:pPr>
         <w:pStyle w:val="1"/>
       </w:pPr>
-      <w:bookmarkStart w:id="11" w:name="_Toc243415805"/>
+      <w:bookmarkStart w:id="11" w:name="_Toc243493623"/>
       <w:r>
         <w:lastRenderedPageBreak/>
         <w:t>5. Установка Geant4</w:t>
@@ -3902,7 +3899,7 @@
       <w:pPr>
         <w:pStyle w:val="21"/>
       </w:pPr>
-      <w:bookmarkStart w:id="12" w:name="_Toc243415806"/>
+      <w:bookmarkStart w:id="12" w:name="_Toc243493624"/>
       <w:r>
         <w:t>5.1. Установка Geant4</w:t>
       </w:r>
@@ -4220,7 +4217,7 @@
       <w:pPr>
         <w:pStyle w:val="21"/>
       </w:pPr>
-      <w:bookmarkStart w:id="13" w:name="_Toc243415807"/>
+      <w:bookmarkStart w:id="13" w:name="_Toc243493625"/>
       <w:r>
         <w:t>5.2. Установка пакетов данных Geant4</w:t>
       </w:r>
@@ -4242,7 +4239,7 @@
         <w:t>Что скачать.</w:t>
       </w:r>
       <w:r>
-        <w:t xml:space="preserve"> Для работы программы критичны пять пакетов (версии указаны для Geant4 11.4.1):</w:t>
+        <w:t xml:space="preserve"> Для работы программы обязательны пять пакетов (версии указаны для Geant4 11.4.1):</w:t>
       </w:r>
     </w:p>
     <w:tbl>
@@ -4365,14 +4362,14 @@
                   <w:color w:val="0563C1"/>
                   <w:u w:val="single"/>
                 </w:rPr>
-                <w:t>https://cern.ch/geant4-data/datasets/G4RadioactiveDecay.6.1.2</w:t>
+                <w:t>https://cern.ch/geant4-data/datasets/G4RadioactiveDecay.6.</w:t>
               </w:r>
               <w:r>
                 <w:rPr>
                   <w:color w:val="0563C1"/>
                   <w:u w:val="single"/>
                 </w:rPr>
-                <w:t>.tar.gz</w:t>
+                <w:t>1.2.tar.gz</w:t>
               </w:r>
             </w:hyperlink>
           </w:p>
@@ -4501,7 +4498,14 @@
                   <w:color w:val="0563C1"/>
                   <w:u w:val="single"/>
                 </w:rPr>
-                <w:t>https://cern.ch/geant4-data/datasets/G4PARTICLEXS.4.2.tar.gz</w:t>
+                <w:t>https://cern.ch/geant4-data/datasets/G4PARTICLEXS.4.2.tar.</w:t>
+              </w:r>
+              <w:r>
+                <w:rPr>
+                  <w:color w:val="0563C1"/>
+                  <w:u w:val="single"/>
+                </w:rPr>
+                <w:t>gz</w:t>
               </w:r>
             </w:hyperlink>
           </w:p>
@@ -4515,57 +4519,16 @@
     </w:p>
     <w:p>
       <w:r>
-        <w:t xml:space="preserve">Полный список пакетов Geant4 (остальные для работы программы не обязательны) — на странице </w:t>
-      </w:r>
-      <w:hyperlink r:id="rId14">
-        <w:r>
-          <w:rPr>
-            <w:color w:val="0563C1"/>
-            <w:u w:val="single"/>
-          </w:rPr>
-          <w:t>https://geant4.web.cern.ch/download/11.4.1.html</w:t>
-        </w:r>
-      </w:hyperlink>
-      <w:r>
-        <w:t xml:space="preserve">, раздел </w:t>
+        <w:t xml:space="preserve">Кроме них Geant4 распространяет ещё </w:t>
       </w:r>
       <w:r>
         <w:rPr>
           <w:b/>
         </w:rPr>
-        <w:t>Datasets</w:t>
-      </w:r>
-      <w:r>
-        <w:t>.</w:t>
-      </w:r>
-    </w:p>
-    <w:p>
-      <w:r>
-        <w:rPr>
-          <w:b/>
-        </w:rPr>
-        <w:t>Порядок действий:</w:t>
-      </w:r>
-    </w:p>
-    <w:p>
-      <w:pPr>
-        <w:spacing w:after="40"/>
-        <w:ind w:left="510" w:hanging="510"/>
-      </w:pPr>
-      <w:r>
-        <w:rPr>
-          <w:b/>
-        </w:rPr>
-        <w:t>1.</w:t>
-      </w:r>
-      <w:r>
-        <w:rPr>
-          <w:b/>
-        </w:rPr>
-        <w:tab/>
-      </w:r>
-      <w:r>
-        <w:t xml:space="preserve">Скачайте пять файлов из таблицы выше — по каждой ссылке браузер начнёт загрузку файла </w:t>
+        <w:t>десять необязательных</w:t>
+      </w:r>
+      <w:r>
+        <w:t xml:space="preserve"> пакетов: G4NDL.4.7.1, G4PII.1.3, G4RealSurface.2.2, G4SAIDDATA.2.0, G4ABLA.3.3, G4INCL.1.3, G4CHANNELING.2.0, G4TENDL.1.4, G4NUDEXLIB.1.0, G4URRPT.1.1. Они нужны для других типов излучателей и на работу программы не влияют — но </w:t>
       </w:r>
       <w:r>
         <w:rPr>
@@ -4573,10 +4536,42 @@
           <w:sz w:val="18"/>
           <w:shd w:val="clear" w:color="auto" w:fill="F4F4F4"/>
         </w:rPr>
-        <w:t>.tar.gz</w:t>
+        <w:t>install_data.bat</w:t>
+      </w:r>
+      <w:r>
+        <w:t xml:space="preserve"> умеет став</w:t>
+      </w:r>
+      <w:r>
+        <w:t xml:space="preserve">ить и их, если положить их архивы рядом с ним. Полный список пакетов и ссылки — на странице </w:t>
+      </w:r>
+      <w:hyperlink r:id="rId14">
+        <w:r>
+          <w:rPr>
+            <w:color w:val="0563C1"/>
+            <w:u w:val="single"/>
+          </w:rPr>
+          <w:t>https://geant4.web.cern.ch/download/11.4.1.html</w:t>
+        </w:r>
+      </w:hyperlink>
+      <w:r>
+        <w:t xml:space="preserve">, раздел </w:t>
+      </w:r>
+      <w:r>
+        <w:rPr>
+          <w:b/>
+        </w:rPr>
+        <w:t>Datasets</w:t>
       </w:r>
       <w:r>
         <w:t>.</w:t>
+      </w:r>
+    </w:p>
+    <w:p>
+      <w:r>
+        <w:rPr>
+          <w:b/>
+        </w:rPr>
+        <w:t>Порядок действий:</w:t>
       </w:r>
     </w:p>
     <w:p>
@@ -4588,7 +4583,7 @@
         <w:rPr>
           <w:b/>
         </w:rPr>
-        <w:t>2.</w:t>
+        <w:t>1.</w:t>
       </w:r>
       <w:r>
         <w:rPr>
@@ -4597,16 +4592,10 @@
         <w:tab/>
       </w:r>
       <w:r>
-        <w:t xml:space="preserve">Положите скачанные файлы </w:t>
-      </w:r>
-      <w:r>
-        <w:rPr>
-          <w:b/>
-        </w:rPr>
-        <w:t>рядом с `install_data.bat`</w:t>
-      </w:r>
-      <w:r>
-        <w:t xml:space="preserve"> — то есть в папку программы (туда, где лежат </w:t>
+        <w:t>Скачайте п</w:t>
+      </w:r>
+      <w:r>
+        <w:t xml:space="preserve">ять файлов из таблицы выше — по каждой ссылке браузер начнёт загрузку файла </w:t>
       </w:r>
       <w:r>
         <w:rPr>
@@ -4614,10 +4603,40 @@
           <w:sz w:val="18"/>
           <w:shd w:val="clear" w:color="auto" w:fill="F4F4F4"/>
         </w:rPr>
-        <w:t>start.bat</w:t>
-      </w:r>
-      <w:r>
-        <w:t xml:space="preserve"> и </w:t>
+        <w:t>.tar.gz</w:t>
+      </w:r>
+      <w:r>
+        <w:t>.</w:t>
+      </w:r>
+    </w:p>
+    <w:p>
+      <w:pPr>
+        <w:spacing w:after="40"/>
+        <w:ind w:left="510" w:hanging="510"/>
+      </w:pPr>
+      <w:r>
+        <w:rPr>
+          <w:b/>
+        </w:rPr>
+        <w:t>2.</w:t>
+      </w:r>
+      <w:r>
+        <w:rPr>
+          <w:b/>
+        </w:rPr>
+        <w:tab/>
+      </w:r>
+      <w:r>
+        <w:t xml:space="preserve">Положите скачанные файлы </w:t>
+      </w:r>
+      <w:r>
+        <w:rPr>
+          <w:b/>
+        </w:rPr>
+        <w:t>рядом с `install_data.bat`</w:t>
+      </w:r>
+      <w:r>
+        <w:t xml:space="preserve"> — то есть в папку программы (туда, где лежат </w:t>
       </w:r>
       <w:r>
         <w:rPr>
@@ -4625,34 +4644,10 @@
           <w:sz w:val="18"/>
           <w:shd w:val="clear" w:color="auto" w:fill="F4F4F4"/>
         </w:rPr>
-        <w:t>program_b.py</w:t>
-      </w:r>
-      <w:r>
-        <w:t>). В папке «Загрузки» их оставлять не</w:t>
-      </w:r>
-      <w:r>
-        <w:t xml:space="preserve"> нужно.</w:t>
-      </w:r>
-    </w:p>
-    <w:p>
-      <w:pPr>
-        <w:spacing w:after="40"/>
-        <w:ind w:left="510" w:hanging="510"/>
-      </w:pPr>
-      <w:r>
-        <w:rPr>
-          <w:b/>
-        </w:rPr>
-        <w:t>3.</w:t>
-      </w:r>
-      <w:r>
-        <w:rPr>
-          <w:b/>
-        </w:rPr>
-        <w:tab/>
-      </w:r>
-      <w:r>
-        <w:t xml:space="preserve">Дважды щёлкните по файлу </w:t>
+        <w:t>start.bat</w:t>
+      </w:r>
+      <w:r>
+        <w:t xml:space="preserve"> и </w:t>
       </w:r>
       <w:r>
         <w:rPr>
@@ -4660,10 +4655,34 @@
           <w:sz w:val="18"/>
           <w:shd w:val="clear" w:color="auto" w:fill="F4F4F4"/>
         </w:rPr>
-        <w:t>install_data.bat</w:t>
-      </w:r>
-      <w:r>
-        <w:t xml:space="preserve"> — он распакует пакеты в папку </w:t>
+        <w:t>program_b.py</w:t>
+      </w:r>
+      <w:r>
+        <w:t xml:space="preserve">). В папке «Загрузки» их оставлять не </w:t>
+      </w:r>
+      <w:r>
+        <w:t>нужно.</w:t>
+      </w:r>
+    </w:p>
+    <w:p>
+      <w:pPr>
+        <w:spacing w:after="40"/>
+        <w:ind w:left="510" w:hanging="510"/>
+      </w:pPr>
+      <w:r>
+        <w:rPr>
+          <w:b/>
+        </w:rPr>
+        <w:t>3.</w:t>
+      </w:r>
+      <w:r>
+        <w:rPr>
+          <w:b/>
+        </w:rPr>
+        <w:tab/>
+      </w:r>
+      <w:r>
+        <w:t xml:space="preserve">Запустите </w:t>
       </w:r>
       <w:r>
         <w:rPr>
@@ -4671,34 +4690,31 @@
           <w:sz w:val="18"/>
           <w:shd w:val="clear" w:color="auto" w:fill="F4F4F4"/>
         </w:rPr>
-        <w:t>&lt;каталог Geant4&gt;\data</w:t>
-      </w:r>
-      <w:r>
-        <w:t xml:space="preserve"> (она создаётся автоматически) и сам пропишет переменные среды Windows. При первом запуске Windows может показать предупреждение «Windows защищена от запуска незнакомых приложений» — нажмите «Всё равно запустить».</w:t>
-      </w:r>
-    </w:p>
-    <w:p>
-      <w:pPr>
-        <w:spacing w:after="40"/>
-        <w:ind w:left="510" w:hanging="510"/>
-      </w:pPr>
+        <w:t>install_data.bat</w:t>
+      </w:r>
+      <w:r>
+        <w:t xml:space="preserve"> </w:t>
+      </w:r>
       <w:r>
         <w:rPr>
           <w:b/>
         </w:rPr>
-        <w:t>4.</w:t>
+        <w:t>от имени администратора</w:t>
+      </w:r>
+      <w:r>
+        <w:t xml:space="preserve">: нажмите на файл правой кнопкой мыши → </w:t>
       </w:r>
       <w:r>
         <w:rPr>
           <w:b/>
         </w:rPr>
-        <w:tab/>
-      </w:r>
-      <w:r>
-        <w:t>Дождитесь конца: в конце должно появить</w:t>
-      </w:r>
-      <w:r>
-        <w:t xml:space="preserve">ся сообщение </w:t>
+        <w:t>«Запуск от имени администратора»</w:t>
+      </w:r>
+      <w:r>
+        <w:t xml:space="preserve">. Права администратора нужны, чтобы распаковать пакеты в папку установки Geant4 — без них распаковка может не удаться. Если </w:t>
+      </w:r>
+      <w:r>
+        <w:t xml:space="preserve">запустить файл без повышения прав, скрипт запросит их сам. Скрипт разложит пакеты в папку </w:t>
       </w:r>
       <w:r>
         <w:rPr>
@@ -4706,10 +4722,34 @@
           <w:sz w:val="18"/>
           <w:shd w:val="clear" w:color="auto" w:fill="F4F4F4"/>
         </w:rPr>
-        <w:t>Готово: установлено 5 из 5 пакетов.</w:t>
-      </w:r>
-      <w:r>
-        <w:t xml:space="preserve"> Если каких-то пакетов не хватило — экран покажет перечень с ссылками: скачайте недостающие файлы, положите рядом с </w:t>
+        <w:t>&lt;каталог Geant4&gt;\data</w:t>
+      </w:r>
+      <w:r>
+        <w:t xml:space="preserve"> (она создаётся автоматически) и сам пропишет переменные среды Windows. Если архивы необязательных пакетов тоже лежат рядом, они установятся вмес</w:t>
+      </w:r>
+      <w:r>
+        <w:t>те с обязательными. При первом запуске Windows может показать предупреждение «Windows защищена от запуска незнакомых приложений» — нажмите «Всё равно запустить».</w:t>
+      </w:r>
+    </w:p>
+    <w:p>
+      <w:pPr>
+        <w:spacing w:after="40"/>
+        <w:ind w:left="510" w:hanging="510"/>
+      </w:pPr>
+      <w:r>
+        <w:rPr>
+          <w:b/>
+        </w:rPr>
+        <w:t>4.</w:t>
+      </w:r>
+      <w:r>
+        <w:rPr>
+          <w:b/>
+        </w:rPr>
+        <w:tab/>
+      </w:r>
+      <w:r>
+        <w:t xml:space="preserve">Дождитесь конца: в конце должно появиться сообщение </w:t>
       </w:r>
       <w:r>
         <w:rPr>
@@ -4717,31 +4757,7 @@
           <w:sz w:val="18"/>
           <w:shd w:val="clear" w:color="auto" w:fill="F4F4F4"/>
         </w:rPr>
-        <w:t>install_data.bat</w:t>
-      </w:r>
-      <w:r>
-        <w:t xml:space="preserve"> и запустите его ещё раз.</w:t>
-      </w:r>
-    </w:p>
-    <w:p>
-      <w:pPr>
-        <w:spacing w:after="40"/>
-        <w:ind w:left="510" w:hanging="510"/>
-      </w:pPr>
-      <w:r>
-        <w:rPr>
-          <w:b/>
-        </w:rPr>
-        <w:t>5.</w:t>
-      </w:r>
-      <w:r>
-        <w:rPr>
-          <w:b/>
-        </w:rPr>
-        <w:tab/>
-      </w:r>
-      <w:r>
-        <w:t xml:space="preserve">Запустите </w:t>
+        <w:t>Готово: обязательных пакетов 5 из 5 (вс</w:t>
       </w:r>
       <w:r>
         <w:rPr>
@@ -4749,13 +4765,74 @@
           <w:sz w:val="18"/>
           <w:shd w:val="clear" w:color="auto" w:fill="F4F4F4"/>
         </w:rPr>
+        <w:t>его 15 из 15).</w:t>
+      </w:r>
+      <w:r>
+        <w:t xml:space="preserve"> — всего 15, если рядом лежали архивы всех пакетов, и 5, если только обязательные. Если каких-то </w:t>
+      </w:r>
+      <w:r>
+        <w:rPr>
+          <w:b/>
+        </w:rPr>
+        <w:t>обязательных</w:t>
+      </w:r>
+      <w:r>
+        <w:t xml:space="preserve"> пакетов не хватило — экран покажет перечень с ссылками: скачайте недостающие файлы, положите рядом с </w:t>
+      </w:r>
+      <w:r>
+        <w:rPr>
+          <w:rFonts w:ascii="Consolas" w:hAnsi="Consolas" w:cs="Consolas"/>
+          <w:sz w:val="18"/>
+          <w:shd w:val="clear" w:color="auto" w:fill="F4F4F4"/>
+        </w:rPr>
+        <w:t>install_data.bat</w:t>
+      </w:r>
+      <w:r>
+        <w:t xml:space="preserve"> и запустите ег</w:t>
+      </w:r>
+      <w:r>
+        <w:t xml:space="preserve">о ещё раз. Недостающие </w:t>
+      </w:r>
+      <w:r>
+        <w:rPr>
+          <w:b/>
+        </w:rPr>
+        <w:t>необязательные</w:t>
+      </w:r>
+      <w:r>
+        <w:t xml:space="preserve"> пакеты скрипт перечислит одной строкой и отдельно скажет, что на работу программы они не влияют.</w:t>
+      </w:r>
+    </w:p>
+    <w:p>
+      <w:pPr>
+        <w:spacing w:after="40"/>
+        <w:ind w:left="510" w:hanging="510"/>
+      </w:pPr>
+      <w:r>
+        <w:rPr>
+          <w:b/>
+        </w:rPr>
+        <w:t>5.</w:t>
+      </w:r>
+      <w:r>
+        <w:rPr>
+          <w:b/>
+        </w:rPr>
+        <w:tab/>
+      </w:r>
+      <w:r>
+        <w:t xml:space="preserve">Запустите </w:t>
+      </w:r>
+      <w:r>
+        <w:rPr>
+          <w:rFonts w:ascii="Consolas" w:hAnsi="Consolas" w:cs="Consolas"/>
+          <w:sz w:val="18"/>
+          <w:shd w:val="clear" w:color="auto" w:fill="F4F4F4"/>
+        </w:rPr>
         <w:t>start.bat</w:t>
       </w:r>
       <w:r>
-        <w:t xml:space="preserve"> (раздел 5.3) — откроется ок</w:t>
-      </w:r>
-      <w:r>
-        <w:t>но программы.</w:t>
+        <w:t xml:space="preserve"> (раздел 5.3) — откроется окно программы.</w:t>
       </w:r>
     </w:p>
     <w:p>
@@ -4786,7 +4863,14 @@
           <w:rFonts w:ascii="Consolas" w:hAnsi="Consolas" w:cs="Consolas"/>
           <w:sz w:val="18"/>
         </w:rPr>
-        <w:t>=============================================================</w:t>
+        <w:t>=========================</w:t>
+      </w:r>
+      <w:r>
+        <w:rPr>
+          <w:rFonts w:ascii="Consolas" w:hAnsi="Consolas" w:cs="Consolas"/>
+          <w:sz w:val="18"/>
+        </w:rPr>
+        <w:t>====================================</w:t>
       </w:r>
     </w:p>
     <w:p>
@@ -4846,14 +4930,7 @@
           <w:rFonts w:ascii="Consolas" w:hAnsi="Consolas" w:cs="Consolas"/>
           <w:sz w:val="18"/>
         </w:rPr>
-        <w:t xml:space="preserve">  [распакован</w:t>
-      </w:r>
-      <w:r>
-        <w:rPr>
-          <w:rFonts w:ascii="Consolas" w:hAnsi="Consolas" w:cs="Consolas"/>
-          <w:sz w:val="18"/>
-        </w:rPr>
-        <w:t>о] G4EMLOW.8.8 - папка: ...\data\G4EMLOW8.8</w:t>
+        <w:t xml:space="preserve">  [распаковано] G4EMLOW.8.8 - папка: ...\data\G4EMLOW8.8</w:t>
       </w:r>
     </w:p>
     <w:p>
@@ -4883,7 +4960,14 @@
           <w:rFonts w:ascii="Consolas" w:hAnsi="Consolas" w:cs="Consolas"/>
           <w:sz w:val="18"/>
         </w:rPr>
-        <w:t xml:space="preserve"> Готово: установлено 5 из 5 пакетов.</w:t>
+        <w:t xml:space="preserve"> Готово: обязательных</w:t>
+      </w:r>
+      <w:r>
+        <w:rPr>
+          <w:rFonts w:ascii="Consolas" w:hAnsi="Consolas" w:cs="Consolas"/>
+          <w:sz w:val="18"/>
+        </w:rPr>
+        <w:t xml:space="preserve"> пакетов 5 из 5 (всего 15 из 15).</w:t>
       </w:r>
     </w:p>
     <w:p>
@@ -4912,7 +4996,7 @@
           <w:rFonts w:ascii="Consolas" w:hAnsi="Consolas" w:cs="Consolas"/>
           <w:sz w:val="18"/>
         </w:rPr>
-        <w:t>=============================================================</w:t>
+        <w:t>============================================================</w:t>
       </w:r>
     </w:p>
     <w:p>
@@ -4928,10 +5012,21 @@
         <w:t>[ок]</w:t>
       </w:r>
       <w:r>
-        <w:t xml:space="preserve"> означает, что пакет уже стоит (например, его поставил сам установщ</w:t>
-      </w:r>
-      <w:r>
-        <w:t>ик Geant4) — распаковывать его повторно не нужно.</w:t>
+        <w:t xml:space="preserve"> означает, что пакет уже распакован в папке </w:t>
+      </w:r>
+      <w:r>
+        <w:rPr>
+          <w:rFonts w:ascii="Consolas" w:hAnsi="Consolas" w:cs="Consolas"/>
+          <w:sz w:val="18"/>
+          <w:shd w:val="clear" w:color="auto" w:fill="F4F4F4"/>
+        </w:rPr>
+        <w:t>&lt;каталог Geant4&gt;\data</w:t>
+      </w:r>
+      <w:r>
+        <w:t xml:space="preserve"> — повторно распаковывать его не нужно, скрипт только пр</w:t>
+      </w:r>
+      <w:r>
+        <w:t>опишет переменную среды.</w:t>
       </w:r>
     </w:p>
     <w:p>
@@ -4997,10 +5092,7 @@
               <w:cnfStyle w:val="100000000000" w:firstRow="1" w:lastRow="0" w:firstColumn="0" w:lastColumn="0" w:oddVBand="0" w:evenVBand="0" w:oddHBand="0" w:evenHBand="0" w:firstRowFirstColumn="0" w:firstRowLastColumn="0" w:lastRowFirstColumn="0" w:lastRowLastColumn="0"/>
             </w:pPr>
             <w:r>
-              <w:t xml:space="preserve">Чего не </w:t>
-            </w:r>
-            <w:r>
-              <w:t>хватает</w:t>
+              <w:t>Чего не хватает</w:t>
             </w:r>
           </w:p>
         </w:tc>
@@ -5025,7 +5117,15 @@
                 <w:sz w:val="18"/>
                 <w:shd w:val="clear" w:color="auto" w:fill="F4F4F4"/>
               </w:rPr>
-              <w:t>G4LEDATA data directory was not found</w:t>
+              <w:t xml:space="preserve">G4LEDATA data </w:t>
+            </w:r>
+            <w:r>
+              <w:rPr>
+                <w:rFonts w:ascii="Consolas" w:hAnsi="Consolas" w:cs="Consolas"/>
+                <w:sz w:val="18"/>
+                <w:shd w:val="clear" w:color="auto" w:fill="F4F4F4"/>
+              </w:rPr>
+              <w:t>directory was not found</w:t>
             </w:r>
           </w:p>
         </w:tc>
@@ -5039,7 +5139,11 @@
               <w:cnfStyle w:val="000000100000" w:firstRow="0" w:lastRow="0" w:firstColumn="0" w:lastColumn="0" w:oddVBand="0" w:evenVBand="0" w:oddHBand="1" w:evenHBand="0" w:firstRowFirstColumn="0" w:firstRowLastColumn="0" w:lastRowFirstColumn="0" w:lastRowLastColumn="0"/>
             </w:pPr>
             <w:r>
-              <w:t>пакет G4EMLOW — таблицы электромагнитного взаимодействия</w:t>
+              <w:t xml:space="preserve">пакет G4EMLOW — таблицы электромагнитного </w:t>
+            </w:r>
+            <w:r>
+              <w:lastRenderedPageBreak/>
+              <w:t>взаимодействия</w:t>
             </w:r>
           </w:p>
         </w:tc>
@@ -5064,6 +5168,7 @@
                 <w:sz w:val="18"/>
                 <w:shd w:val="clear" w:color="auto" w:fill="F4F4F4"/>
               </w:rPr>
+              <w:lastRenderedPageBreak/>
               <w:t>G4RADIOACTIVEDATA ...</w:t>
             </w:r>
           </w:p>
@@ -5142,15 +5247,7 @@
                 <w:sz w:val="18"/>
                 <w:shd w:val="clear" w:color="auto" w:fill="F4F4F4"/>
               </w:rPr>
-              <w:t>G4ENSDFSTATEDATA ..</w:t>
-            </w:r>
-            <w:r>
-              <w:rPr>
-                <w:rFonts w:ascii="Consolas" w:hAnsi="Consolas" w:cs="Consolas"/>
-                <w:sz w:val="18"/>
-                <w:shd w:val="clear" w:color="auto" w:fill="F4F4F4"/>
-              </w:rPr>
-              <w:t>.</w:t>
+              <w:t>G4ENSDFSTATEDATA ...</w:t>
             </w:r>
           </w:p>
         </w:tc>
@@ -5164,7 +5261,10 @@
               <w:cnfStyle w:val="000000010000" w:firstRow="0" w:lastRow="0" w:firstColumn="0" w:lastColumn="0" w:oddVBand="0" w:evenVBand="0" w:oddHBand="0" w:evenHBand="1" w:firstRowFirstColumn="0" w:firstRowLastColumn="0" w:lastRowFirstColumn="0" w:lastRowLastColumn="0"/>
             </w:pPr>
             <w:r>
-              <w:t>пакет G4ENSDFSTATE — энергии уровней ядер</w:t>
+              <w:t xml:space="preserve">пакет G4ENSDFSTATE — </w:t>
+            </w:r>
+            <w:r>
+              <w:t>энергии уровней ядер</w:t>
             </w:r>
           </w:p>
         </w:tc>
@@ -5224,7 +5324,6 @@
         <w:rPr>
           <w:b/>
         </w:rPr>
-        <w:lastRenderedPageBreak/>
         <w:t>Переменные среды — вручную ничего не нужно.</w:t>
       </w:r>
       <w:r>
@@ -5250,7 +5349,7 @@
         <w:t>G4EMLOW8.8</w:t>
       </w:r>
       <w:r>
-        <w:t xml:space="preserve">). </w:t>
+        <w:t xml:space="preserve">). Переменные создаёт </w:t>
       </w:r>
       <w:r>
         <w:rPr>
@@ -5261,7 +5360,7 @@
         <w:t>install_data.bat</w:t>
       </w:r>
       <w:r>
-        <w:t xml:space="preserve"> и </w:t>
+        <w:t xml:space="preserve"> — он находит установленные папки данных и прописывает переменные всех пакетов, которые поставил. </w:t>
       </w:r>
       <w:r>
         <w:rPr>
@@ -5272,7 +5371,22 @@
         <w:t>start.bat</w:t>
       </w:r>
       <w:r>
-        <w:t xml:space="preserve"> сами находят установленные папки данных и создают недостающие переменные. Например, </w:t>
+        <w:t xml:space="preserve"> переменные </w:t>
+      </w:r>
+      <w:r>
+        <w:rPr>
+          <w:b/>
+        </w:rPr>
+        <w:t>н</w:t>
+      </w:r>
+      <w:r>
+        <w:rPr>
+          <w:b/>
+        </w:rPr>
+        <w:t>е создаёт и не меняет</w:t>
+      </w:r>
+      <w:r>
+        <w:t xml:space="preserve"> — он только проверяет, что они заданы и указывают на существующие папки. Если переменных нет, </w:t>
       </w:r>
       <w:r>
         <w:rPr>
@@ -5283,33 +5397,7 @@
         <w:t>start.bat</w:t>
       </w:r>
       <w:r>
-        <w:t xml:space="preserve"> печатает:</w:t>
-      </w:r>
-    </w:p>
-    <w:p>
-      <w:pPr>
-        <w:shd w:val="clear" w:color="auto" w:fill="F4F4F4"/>
-        <w:spacing w:before="120" w:line="240" w:lineRule="auto"/>
-        <w:ind w:left="227"/>
-      </w:pPr>
-      <w:r>
-        <w:rPr>
-          <w:rFonts w:ascii="Consolas" w:hAnsi="Consolas" w:cs="Consolas"/>
-          <w:sz w:val="18"/>
-        </w:rPr>
-        <w:t xml:space="preserve">[Исправлено] </w:t>
-      </w:r>
-      <w:r>
-        <w:rPr>
-          <w:rFonts w:ascii="Consolas" w:hAnsi="Consolas" w:cs="Consolas"/>
-          <w:sz w:val="18"/>
-        </w:rPr>
-        <w:t>создана переменная G4LEDATA = C:\Geant4\data\G4EMLOW8.8</w:t>
-      </w:r>
-    </w:p>
-    <w:p>
-      <w:r>
-        <w:t xml:space="preserve">Распаковать архивы вручную (без </w:t>
+        <w:t xml:space="preserve"> напишет об этом и предложит запустить </w:t>
       </w:r>
       <w:r>
         <w:rPr>
@@ -5320,7 +5408,26 @@
         <w:t>install_data.bat</w:t>
       </w:r>
       <w:r>
-        <w:t>) или посмотреть переменную вручную — раздел 8.3.</w:t>
+        <w:t xml:space="preserve"> (раздел 5.2).</w:t>
+      </w:r>
+    </w:p>
+    <w:p>
+      <w:r>
+        <w:t xml:space="preserve">Распаковать архивы вручную (без </w:t>
+      </w:r>
+      <w:r>
+        <w:rPr>
+          <w:rFonts w:ascii="Consolas" w:hAnsi="Consolas" w:cs="Consolas"/>
+          <w:sz w:val="18"/>
+          <w:shd w:val="clear" w:color="auto" w:fill="F4F4F4"/>
+        </w:rPr>
+        <w:t>install_data.bat</w:t>
+      </w:r>
+      <w:r>
+        <w:t>) или посмотр</w:t>
+      </w:r>
+      <w:r>
+        <w:t>еть переменную вручную — раздел 8.3.</w:t>
       </w:r>
     </w:p>
     <w:p>
@@ -5335,7 +5442,7 @@
       <w:pPr>
         <w:pStyle w:val="21"/>
       </w:pPr>
-      <w:bookmarkStart w:id="14" w:name="_Toc243415808"/>
+      <w:bookmarkStart w:id="14" w:name="_Toc243493626"/>
       <w:r>
         <w:t>5.3. Первый запуск</w:t>
       </w:r>
@@ -5351,10 +5458,10 @@
     </w:p>
     <w:p>
       <w:r>
-        <w:t>При первом запуске Windows может показать пр</w:t>
-      </w:r>
-      <w:r>
-        <w:t>едупреждение «Windows защищена от запуска незнакомых приложений» — нажмите «Всё равно запустить» (этот файл — часть программы, он безопасен).</w:t>
+        <w:t>При первом запуске Windows может показать предупреждение «Windows защищена от запуска незнакомых приложений» — нажмите «Всё равно запустить» (этот файл — часть п</w:t>
+      </w:r>
+      <w:r>
+        <w:t>рограммы, он безопасен).</w:t>
       </w:r>
     </w:p>
     <w:p>
@@ -5412,10 +5519,7 @@
         <w:tab/>
       </w:r>
       <w:r>
-        <w:t>Проверяет, что Python собран с tkinter (нужен для ок</w:t>
-      </w:r>
-      <w:r>
-        <w:t>он интерфейса).</w:t>
+        <w:t>Проверяет, что Python собран с tkinter (нужен для окон интерфейса).</w:t>
       </w:r>
     </w:p>
     <w:p>
@@ -5457,7 +5561,10 @@
         <w:tab/>
       </w:r>
       <w:r>
-        <w:t>Находит установленный Geant4 и проверяет, прописан ли он в системе (PATH).</w:t>
+        <w:t xml:space="preserve">Находит установленный Geant4 и проверяет, прописан ли он </w:t>
+      </w:r>
+      <w:r>
+        <w:t>в системе (PATH).</w:t>
       </w:r>
     </w:p>
     <w:p>
@@ -5478,7 +5585,7 @@
         <w:tab/>
       </w:r>
       <w:r>
-        <w:t xml:space="preserve">Проверяет все пакеты данных Geant4: если папка с данными есть, а переменная не задана — создаёт её сама (печатает </w:t>
+        <w:t xml:space="preserve">Проверяет пакеты данных Geant4: для пяти обязательных — проверяет, что переменная задана и папка с данными на месте; если чего-то не хватает, пишет перечень и предлагает запустить </w:t>
       </w:r>
       <w:r>
         <w:rPr>
@@ -5486,7 +5593,13 @@
           <w:sz w:val="18"/>
           <w:shd w:val="clear" w:color="auto" w:fill="F4F4F4"/>
         </w:rPr>
-        <w:t>[Исп</w:t>
+        <w:t>install_data.bat</w:t>
+      </w:r>
+      <w:r>
+        <w:t xml:space="preserve"> (раздел 5.2). Остальные десять пакетов</w:t>
+      </w:r>
+      <w:r>
+        <w:t xml:space="preserve"> тоже проверяются, но их отсутствие на работу программы не влияет и сообщением не мешает. Никаких переменных </w:t>
       </w:r>
       <w:r>
         <w:rPr>
@@ -5494,10 +5607,10 @@
           <w:sz w:val="18"/>
           <w:shd w:val="clear" w:color="auto" w:fill="F4F4F4"/>
         </w:rPr>
-        <w:t>равлено] создана переменная ...</w:t>
-      </w:r>
-      <w:r>
-        <w:t xml:space="preserve">); если пакетов не хватает — предлагает скачать архивы и запустить </w:t>
+        <w:t>start.bat</w:t>
+      </w:r>
+      <w:r>
+        <w:t xml:space="preserve"> не создаёт и не меняет — это делает </w:t>
       </w:r>
       <w:r>
         <w:rPr>
@@ -5508,7 +5621,7 @@
         <w:t>install_data.bat</w:t>
       </w:r>
       <w:r>
-        <w:t xml:space="preserve"> (раздел 5.2).</w:t>
+        <w:t>.</w:t>
       </w:r>
     </w:p>
     <w:p>
@@ -5540,7 +5653,10 @@
         <w:t>build\Release\main.exe</w:t>
       </w:r>
       <w:r>
-        <w:t xml:space="preserve"> на месте (архив распакован полностью).</w:t>
+        <w:t xml:space="preserve"> на месте (архив распакован полностью)</w:t>
+      </w:r>
+      <w:r>
+        <w:t>.</w:t>
       </w:r>
     </w:p>
     <w:p>
@@ -5554,10 +5670,7 @@
         <w:t>всё в порядке</w:t>
       </w:r>
       <w:r>
-        <w:t xml:space="preserve"> — молча открывается окн</w:t>
-      </w:r>
-      <w:r>
-        <w:t xml:space="preserve">о программы «Программа Б — Генератор макросов». Если что-то не нашлось — </w:t>
+        <w:t xml:space="preserve"> — молча открывается окно программы «Программа Б — Генератор макросов». Если что-то не нашлось — </w:t>
       </w:r>
       <w:r>
         <w:rPr>
@@ -5579,7 +5692,13 @@
         <w:rPr>
           <w:b/>
         </w:rPr>
-        <w:t>[Скриншот: окно «Программа Б — Генератор макросов»]</w:t>
+        <w:t>[Скриншот: окно «Программа Б — Генератор макрос</w:t>
+      </w:r>
+      <w:r>
+        <w:rPr>
+          <w:b/>
+        </w:rPr>
+        <w:t>ов»]</w:t>
       </w:r>
       <w:r>
         <w:t xml:space="preserve"> &gt; </w:t>
@@ -5588,13 +5707,7 @@
         <w:rPr>
           <w:i/>
         </w:rPr>
-        <w:t>— окно программы, видны вкладки: Геом</w:t>
-      </w:r>
-      <w:r>
-        <w:rPr>
-          <w:i/>
-        </w:rPr>
-        <w:t>етрия, Среда и материалы, Радионуклид, Распад, Получаемые значения, Запуск и вывод, Спектры.</w:t>
+        <w:t>— окно программы, видны вкладки: Геометрия, Среда и материалы, Радионуклид, Распад, Получаемые значения, Запуск и вывод, Спектры.</w:t>
       </w:r>
     </w:p>
     <w:p>
@@ -5609,8 +5722,9 @@
       <w:pPr>
         <w:pStyle w:val="1"/>
       </w:pPr>
-      <w:bookmarkStart w:id="15" w:name="_Toc243415809"/>
-      <w:r>
+      <w:bookmarkStart w:id="15" w:name="_Toc243493627"/>
+      <w:r>
+        <w:lastRenderedPageBreak/>
         <w:t>6. Программа: устройство и пример расчёта</w:t>
       </w:r>
       <w:bookmarkEnd w:id="15"/>
@@ -5619,7 +5733,7 @@
       <w:pPr>
         <w:pStyle w:val="21"/>
       </w:pPr>
-      <w:bookmarkStart w:id="16" w:name="_Toc243415810"/>
+      <w:bookmarkStart w:id="16" w:name="_Toc243493628"/>
       <w:r>
         <w:t>6.1. Вкладки программы</w:t>
       </w:r>
@@ -5700,10 +5814,10 @@
               <w:cnfStyle w:val="000000100000" w:firstRow="0" w:lastRow="0" w:firstColumn="0" w:lastColumn="0" w:oddVBand="0" w:evenVBand="0" w:oddHBand="1" w:evenHBand="0" w:firstRowFirstColumn="0" w:firstRowLastColumn="0" w:lastRowFirstColumn="0" w:lastRowLastColumn="0"/>
             </w:pPr>
             <w:r>
-              <w:t xml:space="preserve">форма ёмкости (цилиндр, стакан, пробирка), радиус, </w:t>
+              <w:t xml:space="preserve">форма </w:t>
             </w:r>
             <w:r>
-              <w:t>высота, толщина стеклянной стенки, сухой бортик</w:t>
+              <w:t>ёмкости (цилиндр, стакан, пробирка), радиус, высота, толщина стеклянной стенки, сухой бортик</w:t>
             </w:r>
           </w:p>
         </w:tc>
@@ -5805,10 +5919,10 @@
               <w:cnfStyle w:val="000000010000" w:firstRow="0" w:lastRow="0" w:firstColumn="0" w:lastColumn="0" w:oddVBand="0" w:evenVBand="0" w:oddHBand="0" w:evenHBand="1" w:firstRowFirstColumn="0" w:firstRowLastColumn="0" w:lastRowFirstColumn="0" w:lastRowLastColumn="0"/>
             </w:pPr>
             <w:r>
-              <w:t>режим расчёта: по числу распадов или по активнос</w:t>
+              <w:t>реж</w:t>
             </w:r>
             <w:r>
-              <w:t>ти и времени облучения</w:t>
+              <w:t>им расчёта: по числу распадов или по активности и времени облучения</w:t>
             </w:r>
           </w:p>
         </w:tc>
@@ -5896,7 +6010,6 @@
               <w:spacing w:after="40"/>
             </w:pPr>
             <w:r>
-              <w:lastRenderedPageBreak/>
               <w:t>Спектры</w:t>
             </w:r>
           </w:p>
@@ -5926,7 +6039,7 @@
       <w:pPr>
         <w:pStyle w:val="21"/>
       </w:pPr>
-      <w:bookmarkStart w:id="17" w:name="_Toc243415811"/>
+      <w:bookmarkStart w:id="17" w:name="_Toc243493629"/>
       <w:r>
         <w:t>6.2. Пример: Lu-177 в стакане</w:t>
       </w:r>
@@ -5934,10 +6047,7 @@
     </w:p>
     <w:p>
       <w:r>
-        <w:t xml:space="preserve">Разберём полный расчёт: сколько </w:t>
-      </w:r>
-      <w:r>
-        <w:t>поглощённой дозы получает вода в стакане от растворённого в ней Lu-177 (β⁻-излучатель, E_βmax ≈ 497 кэВ, один из основных нуклидов таргетной радиотерапии).</w:t>
+        <w:t>Разберём полный расчёт: сколько поглощённой дозы получает вода в стакане от растворённого в ней Lu-177 (β⁻-излучатель, E_βmax ≈ 497 кэВ, один из основных нуклидов таргетной радиотерапии).</w:t>
       </w:r>
     </w:p>
     <w:p>
@@ -5974,10 +6084,10 @@
         <w:ind w:left="340" w:hanging="198"/>
       </w:pPr>
       <w:r>
-        <w:t>Радиус: 2 см, Высота: 6 см (значе</w:t>
-      </w:r>
-      <w:r>
-        <w:t>ния по умолчанию)</w:t>
+        <w:t>Р</w:t>
+      </w:r>
+      <w:r>
+        <w:t>адиус: 2 см, Высота: 6 см (значения по умолчанию)</w:t>
       </w:r>
     </w:p>
     <w:p>
@@ -6003,10 +6113,10 @@
         <w:t>Шаг 2 — Среда и материалы.</w:t>
       </w:r>
       <w:r>
-        <w:t xml:space="preserve"> Оставляем по умолчанию: жидкость — вода (G4_WATER, 1,000 г/см³), оболочка — стекл</w:t>
-      </w:r>
-      <w:r>
-        <w:t>о (SiO₂, 2,320 г/см³).</w:t>
+        <w:t xml:space="preserve"> Оставляем по умолчанию: жидкость — вода (G4_WATER</w:t>
+      </w:r>
+      <w:r>
+        <w:t>, 1,000 г/см³), оболочка — стекло (SiO₂, 2,320 г/см³).</w:t>
       </w:r>
     </w:p>
     <w:p>
@@ -6026,7 +6136,10 @@
         <w:t>Lu-177</w:t>
       </w:r>
       <w:r>
-        <w:t>. Программа покажет период полураспада (T½ ≈ 6,644 сут) и сообщение «Схема распада есть. Уровни дочерних есть.» — значит, данные Geant4 на месте.</w:t>
+        <w:t>. Программа покажет период полураспада (T½ ≈ 6,644 сут) и сообщение «Схема распада есть. Уровни дочерних есть.» — значит, данные G</w:t>
+      </w:r>
+      <w:r>
+        <w:t>eant4 на месте.</w:t>
       </w:r>
     </w:p>
     <w:p>
@@ -6037,10 +6150,7 @@
         <w:t>Шаг 4 — Распад.</w:t>
       </w:r>
       <w:r>
-        <w:t xml:space="preserve"> </w:t>
-      </w:r>
-      <w:r>
-        <w:t xml:space="preserve">Режим: </w:t>
+        <w:t xml:space="preserve"> Режим: </w:t>
       </w:r>
       <w:r>
         <w:rPr>
@@ -6091,10 +6201,7 @@
         <w:t>Шаг 6 — Результаты.</w:t>
       </w:r>
       <w:r>
-        <w:t xml:space="preserve"> После заверш</w:t>
-      </w:r>
-      <w:r>
-        <w:t>ения внизу появится блок результатов (примерный вид; точные числа будут отличаться, так как генератор случайных чисел каждый раз другой):</w:t>
+        <w:t xml:space="preserve"> После завершения внизу появится блок результатов (примерный вид; точные числа будут отличаться, так как генератор случайных чисел каждый раз другой):</w:t>
       </w:r>
     </w:p>
     <w:p>
@@ -6109,6 +6216,7 @@
           <w:rFonts w:ascii="Consolas" w:hAnsi="Consolas" w:cs="Consolas"/>
           <w:sz w:val="18"/>
         </w:rPr>
+        <w:lastRenderedPageBreak/>
         <w:t>========================================</w:t>
       </w:r>
     </w:p>
@@ -6468,7 +6576,14 @@
           <w:rFonts w:ascii="Consolas" w:hAnsi="Consolas" w:cs="Consolas"/>
           <w:sz w:val="18"/>
         </w:rPr>
-        <w:t>Cross-check (A-B):   -3.0923e-11 MeV</w:t>
+        <w:t xml:space="preserve">Cross-check (A-B):   </w:t>
+      </w:r>
+      <w:r>
+        <w:rPr>
+          <w:rFonts w:ascii="Consolas" w:hAnsi="Consolas" w:cs="Consolas"/>
+          <w:sz w:val="18"/>
+        </w:rPr>
+        <w:t>-3.0923e-11 MeV</w:t>
       </w:r>
     </w:p>
     <w:p>
@@ -6483,14 +6598,7 @@
           <w:rFonts w:ascii="Consolas" w:hAnsi="Consolas" w:cs="Consolas"/>
           <w:sz w:val="18"/>
         </w:rPr>
-        <w:t>Ene</w:t>
-      </w:r>
-      <w:r>
-        <w:rPr>
-          <w:rFonts w:ascii="Consolas" w:hAnsi="Consolas" w:cs="Consolas"/>
-          <w:sz w:val="18"/>
-        </w:rPr>
-        <w:t>rgy per decay:    0.1495 MeV</w:t>
+        <w:t>Energy per decay:    0.1495 MeV</w:t>
       </w:r>
     </w:p>
     <w:p>
@@ -6556,9 +6664,8 @@
       <w:pPr>
         <w:pStyle w:val="21"/>
       </w:pPr>
-      <w:bookmarkStart w:id="18" w:name="_Toc243415812"/>
-      <w:r>
-        <w:lastRenderedPageBreak/>
+      <w:bookmarkStart w:id="18" w:name="_Toc243493630"/>
+      <w:r>
         <w:t>6.3. Как читать результаты</w:t>
       </w:r>
       <w:bookmarkEnd w:id="18"/>
@@ -6643,10 +6750,10 @@
               <w:cnfStyle w:val="000000100000" w:firstRow="0" w:lastRow="0" w:firstColumn="0" w:lastColumn="0" w:oddVBand="0" w:evenVBand="0" w:oddHBand="1" w:evenHBand="0" w:firstRowFirstColumn="0" w:firstRowLastColumn="0" w:lastRowFirstColumn="0" w:lastRowLastColumn="0"/>
             </w:pPr>
             <w:r>
-              <w:t xml:space="preserve">сколько распадов </w:t>
+              <w:t xml:space="preserve">сколько </w:t>
             </w:r>
             <w:r>
-              <w:t>просчитано — должно совпадать с заданным</w:t>
+              <w:t>распадов просчитано — должно совпадать с заданным</w:t>
             </w:r>
           </w:p>
         </w:tc>
@@ -6780,10 +6887,7 @@
               <w:t>поглощённая доза по Path A, Гр (Грей)</w:t>
             </w:r>
             <w:r>
-              <w:t xml:space="preserve"> — основн</w:t>
-            </w:r>
-            <w:r>
-              <w:t>ой результат расчёта</w:t>
+              <w:t xml:space="preserve"> — основной результат расчёта</w:t>
             </w:r>
           </w:p>
         </w:tc>
@@ -6900,10 +7004,7 @@
               <w:cnfStyle w:val="000000100000" w:firstRow="0" w:lastRow="0" w:firstColumn="0" w:lastColumn="0" w:oddVBand="0" w:evenVBand="0" w:oddHBand="1" w:evenHBand="0" w:firstRowFirstColumn="0" w:firstRowLastColumn="0" w:lastRowFirstColumn="0" w:lastRowLastColumn="0"/>
             </w:pPr>
             <w:r>
-              <w:t xml:space="preserve">энергия, </w:t>
-            </w:r>
-            <w:r>
-              <w:t>оставшаяся в жидкости по балансу (выход из баланса), МэВ</w:t>
+              <w:t>энергия, оставшаяся в жидкости по балансу (выход из баланса), МэВ</w:t>
             </w:r>
           </w:p>
         </w:tc>
@@ -6990,10 +7091,10 @@
               <w:t>Должно быть ≈ 0</w:t>
             </w:r>
             <w:r>
-              <w:t xml:space="preserve"> — это ключевая проверка корректности: два независимых метода дали одинак</w:t>
+              <w:t xml:space="preserve"> — это ключевая проверка корректности: два независимых метода да</w:t>
             </w:r>
             <w:r>
-              <w:t>овый результат</w:t>
+              <w:t>ли одинаковый результат</w:t>
             </w:r>
           </w:p>
         </w:tc>
@@ -7045,6 +7146,7 @@
     </w:p>
     <w:p>
       <w:r>
+        <w:lastRenderedPageBreak/>
         <w:t>Физический смысл: полная энергия распадов делится на поглощённую в жидкости и ушедшую наружу. Поглощённая часть (</w:t>
       </w:r>
       <w:r>
@@ -7067,10 +7169,10 @@
         <w:t>Transferred (B)</w:t>
       </w:r>
       <w:r>
-        <w:t>) — это в основном энерг</w:t>
-      </w:r>
-      <w:r>
-        <w:t>ия β-частиц: их пробег в воде при E_βmax ≈ 497 кэВ около миллиметра, поэтому практически все они останавливаются в сантиметровом объёме и отдают энергию на ионизацию среды. Энергию же, покинувшую объём через границу жидкости (</w:t>
+        <w:t>) — это в основ</w:t>
+      </w:r>
+      <w:r>
+        <w:t>ном энергия β-частиц: их пробег в воде при E_βmax ≈ 497 кэВ около миллиметра, поэтому практически все они останавливаются в сантиметровом объёме и отдают энергию на ионизацию среды. Энергию же, покинувшую объём через границу жидкости (</w:t>
       </w:r>
       <w:r>
         <w:rPr>
@@ -7081,20 +7183,20 @@
         <w:t>Escaped energy (B)</w:t>
       </w:r>
       <w:r>
-        <w:t>), уносят пр</w:t>
-      </w:r>
-      <w:r>
-        <w:t>еимущественно вторичные γ-кванта — прежде всего квант 208 кэВ дочернего ядра Hf-177: длина свободного пробега такого кванта в воде порядка 10 см, поэтому часть квантов проходит сквозь несколько сантиметров воды, не поглотившись. В этой геометрии наружу ухо</w:t>
-      </w:r>
-      <w:r>
-        <w:t>дит около двух третей энергии распада, и поглощённая доза при 10⁵ распадов в 75 см³ воды — порядка 10⁻⁸ Гр.</w:t>
+        <w:t xml:space="preserve">), </w:t>
+      </w:r>
+      <w:r>
+        <w:t>уносят преимущественно вторичные γ-кванта — прежде всего квант 208 кэВ дочернего ядра Hf-177: длина свободного пробега такого кванта в воде порядка 10 см, поэтому часть квантов проходит сквозь несколько сантиметров воды, не поглотившись. В этой геометрии н</w:t>
+      </w:r>
+      <w:r>
+        <w:t>аружу уходит около двух третей энергии распада, и поглощённая доза при 10⁵ распадов в 75 см³ воды — порядка 10⁻⁸ Гр.</w:t>
       </w:r>
     </w:p>
     <w:p>
       <w:pPr>
         <w:pStyle w:val="21"/>
       </w:pPr>
-      <w:bookmarkStart w:id="19" w:name="_Toc243415813"/>
+      <w:bookmarkStart w:id="19" w:name="_Toc243493631"/>
       <w:r>
         <w:t>6.4. Где сохраняются результаты</w:t>
       </w:r>
@@ -7137,10 +7239,7 @@
         <w:t>дописывается</w:t>
       </w:r>
       <w:r>
-        <w:t xml:space="preserve"> в к</w:t>
-      </w:r>
-      <w:r>
-        <w:t xml:space="preserve">онец файла, так что </w:t>
+        <w:t xml:space="preserve"> в конец файла, так что </w:t>
       </w:r>
       <w:r>
         <w:rPr>
@@ -7198,9 +7297,8 @@
       <w:pPr>
         <w:pStyle w:val="1"/>
       </w:pPr>
-      <w:bookmarkStart w:id="20" w:name="_Toc243415814"/>
-      <w:r>
-        <w:lastRenderedPageBreak/>
+      <w:bookmarkStart w:id="20" w:name="_Toc243493632"/>
+      <w:r>
         <w:t>7. Если что-то пошло не так</w:t>
       </w:r>
       <w:bookmarkEnd w:id="20"/>
@@ -7209,7 +7307,7 @@
       <w:pPr>
         <w:pStyle w:val="21"/>
       </w:pPr>
-      <w:bookmarkStart w:id="21" w:name="_Toc243415815"/>
+      <w:bookmarkStart w:id="21" w:name="_Toc243493633"/>
       <w:r>
         <w:t>7.1. Сообщения start.bat</w:t>
       </w:r>
@@ -7346,10 +7444,7 @@
               <w:cnfStyle w:val="000000010000" w:firstRow="0" w:lastRow="0" w:firstColumn="0" w:lastColumn="0" w:oddVBand="0" w:evenVBand="0" w:oddHBand="0" w:evenHBand="1" w:firstRowFirstColumn="0" w:firstRowLastColumn="0" w:lastRowFirstColumn="0" w:lastRowLastColumn="0"/>
             </w:pPr>
             <w:r>
-              <w:t xml:space="preserve">Переустановите Python: запустите установщик повторно → «Modify» → </w:t>
-            </w:r>
-            <w:r>
-              <w:t>включите «tcl/tk and IDLE»</w:t>
+              <w:t>Переустановите Python: запустите установщик повторно → «Modify» → включите «tcl/tk and IDLE»</w:t>
             </w:r>
           </w:p>
         </w:tc>
@@ -7449,10 +7544,7 @@
               <w:cnfStyle w:val="000000010000" w:firstRow="0" w:lastRow="0" w:firstColumn="0" w:lastColumn="0" w:oddVBand="0" w:evenVBand="0" w:oddHBand="0" w:evenHBand="1" w:firstRowFirstColumn="0" w:firstRowLastColumn="0" w:lastRowFirstColumn="0" w:lastRowLastColumn="0"/>
             </w:pPr>
             <w:r>
-              <w:t xml:space="preserve">Установите Geant4 11.4.1 (раздел 5), не забудьте отметить опцию добавления в PATH </w:t>
-            </w:r>
-            <w:r>
-              <w:t>(шаг 5) и перезагрузите компьютер</w:t>
+              <w:t>Установите Geant4 11.4.1 (раздел 5), не забудьте отметить опцию добавления в PATH (шаг 5) и перезагрузите компьютер</w:t>
             </w:r>
           </w:p>
         </w:tc>
@@ -7477,7 +7569,15 @@
                 <w:sz w:val="18"/>
                 <w:shd w:val="clear" w:color="auto" w:fill="F4F4F4"/>
               </w:rPr>
-              <w:t>в установке Geant4 не хватает пакетов данных</w:t>
+              <w:t xml:space="preserve">в установке Geant4 не </w:t>
+            </w:r>
+            <w:r>
+              <w:rPr>
+                <w:rFonts w:ascii="Consolas" w:hAnsi="Consolas" w:cs="Consolas"/>
+                <w:sz w:val="18"/>
+                <w:shd w:val="clear" w:color="auto" w:fill="F4F4F4"/>
+              </w:rPr>
+              <w:t>хватает пакетов данных</w:t>
             </w:r>
           </w:p>
         </w:tc>
@@ -7513,18 +7613,19 @@
               <w:t>install_data.bat</w:t>
             </w:r>
             <w:r>
-              <w:t xml:space="preserve">, запустите </w:t>
+              <w:t xml:space="preserve"> и запустите его </w:t>
             </w:r>
             <w:r>
               <w:rPr>
-                <w:rFonts w:ascii="Consolas" w:hAnsi="Consolas" w:cs="Consolas"/>
-                <w:sz w:val="18"/>
-                <w:shd w:val="clear" w:color="auto" w:fill="F4F4F4"/>
+                <w:b/>
               </w:rPr>
-              <w:t>install_data.bat</w:t>
+              <w:t>от имени администратора</w:t>
             </w:r>
             <w:r>
-              <w:t xml:space="preserve"> один раз, затем </w:t>
+              <w:t xml:space="preserve"> (правая кнопка мыши → «Запуск от имени администратора») — он и распакует недостающее, и пропишет переменны</w:t>
+            </w:r>
+            <w:r>
+              <w:t xml:space="preserve">е. Затем запустите </w:t>
             </w:r>
             <w:r>
               <w:rPr>
@@ -7560,15 +7661,7 @@
                 <w:sz w:val="18"/>
                 <w:shd w:val="clear" w:color="auto" w:fill="F4F4F4"/>
               </w:rPr>
-              <w:t>не найден файл build\Relea</w:t>
-            </w:r>
-            <w:r>
-              <w:rPr>
-                <w:rFonts w:ascii="Consolas" w:hAnsi="Consolas" w:cs="Consolas"/>
-                <w:sz w:val="18"/>
-                <w:shd w:val="clear" w:color="auto" w:fill="F4F4F4"/>
-              </w:rPr>
-              <w:t>se\main.exe</w:t>
+              <w:t>не найден файл build\Release\main.exe</w:t>
             </w:r>
           </w:p>
         </w:tc>
@@ -7613,15 +7706,19 @@
       <w:pPr>
         <w:pStyle w:val="21"/>
       </w:pPr>
-      <w:bookmarkStart w:id="22" w:name="_Toc243415816"/>
-      <w:r>
+      <w:bookmarkStart w:id="22" w:name="_Toc243493634"/>
+      <w:r>
+        <w:lastRenderedPageBreak/>
         <w:t>7.2. Ошибки Geant4 при расчёте</w:t>
       </w:r>
       <w:bookmarkEnd w:id="22"/>
     </w:p>
     <w:p>
       <w:r>
-        <w:t xml:space="preserve">Эти ошибки появляются в самой программе (не в окне </w:t>
+        <w:t xml:space="preserve">Эти ошибки появляются в самой </w:t>
+      </w:r>
+      <w:r>
+        <w:t xml:space="preserve">программе (не в окне </w:t>
       </w:r>
       <w:r>
         <w:rPr>
@@ -7643,10 +7740,7 @@
         <w:t>start.bat</w:t>
       </w:r>
       <w:r>
-        <w:t xml:space="preserve"> запускал</w:t>
-      </w:r>
-      <w:r>
-        <w:t>и не перед расчётом или обходили его:</w:t>
+        <w:t xml:space="preserve"> запускали не перед расчётом или обходили его:</w:t>
       </w:r>
     </w:p>
     <w:tbl>
@@ -7740,7 +7834,10 @@
               <w:t>install_data.bat</w:t>
             </w:r>
             <w:r>
-              <w:t xml:space="preserve">, запустите </w:t>
+              <w:t>, за</w:t>
+            </w:r>
+            <w:r>
+              <w:t xml:space="preserve">пустите </w:t>
             </w:r>
             <w:r>
               <w:rPr>
@@ -7773,10 +7870,7 @@
               <w:t>G4LEDATA</w:t>
             </w:r>
             <w:r>
-              <w:t xml:space="preserve"> </w:t>
-            </w:r>
-            <w:r>
-              <w:t>пропишется сама)</w:t>
+              <w:t xml:space="preserve"> пропишется сама)</w:t>
             </w:r>
           </w:p>
         </w:tc>
@@ -7876,7 +7970,10 @@
               <w:cnfStyle w:val="000000100000" w:firstRow="0" w:lastRow="0" w:firstColumn="0" w:lastColumn="0" w:oddVBand="0" w:evenVBand="0" w:oddHBand="1" w:evenHBand="0" w:firstRowFirstColumn="0" w:firstRowLastColumn="0" w:lastRowFirstColumn="0" w:lastRowLastColumn="0"/>
             </w:pPr>
             <w:r>
-              <w:t>Не хватает пакетов G4ENSDFSTATE / G4PARTICLEXS — раздел 5.2</w:t>
+              <w:t xml:space="preserve">Не </w:t>
+            </w:r>
+            <w:r>
+              <w:t>хватает пакетов G4ENSDFSTATE / G4PARTICLEXS — раздел 5.2</w:t>
             </w:r>
           </w:p>
         </w:tc>
@@ -7911,7 +8008,10 @@
         <w:t>install_data.bat</w:t>
       </w:r>
       <w:r>
-        <w:t xml:space="preserve">, запустите его, затем запустите </w:t>
+        <w:t>, запустите его, зат</w:t>
+      </w:r>
+      <w:r>
+        <w:t xml:space="preserve">ем запустите </w:t>
       </w:r>
       <w:r>
         <w:rPr>
@@ -7929,7 +8029,7 @@
       <w:pPr>
         <w:pStyle w:val="21"/>
       </w:pPr>
-      <w:bookmarkStart w:id="23" w:name="_Toc243415817"/>
+      <w:bookmarkStart w:id="23" w:name="_Toc243493635"/>
       <w:r>
         <w:t>7.3. Окно программы открылось, но что-то не так</w:t>
       </w:r>
@@ -7996,11 +8096,7 @@
               <w:spacing w:after="40"/>
             </w:pPr>
             <w:r>
-              <w:lastRenderedPageBreak/>
-              <w:t xml:space="preserve">Ошибка «Illegal </w:t>
-            </w:r>
-            <w:r>
-              <w:t>application state» при запуске по своему макросу</w:t>
+              <w:t>Ошибка «Illegal application state» при запуске по своему макросу</w:t>
             </w:r>
           </w:p>
         </w:tc>
@@ -8051,7 +8147,10 @@
               <w:spacing w:after="40"/>
             </w:pPr>
             <w:r>
-              <w:t>На вкладке «Радионуклид» написано, что данных Geant4 нет</w:t>
+              <w:t>На вкла</w:t>
+            </w:r>
+            <w:r>
+              <w:t>дке «Радионуклид» написано, что данных Geant4 нет</w:t>
             </w:r>
           </w:p>
         </w:tc>
@@ -8065,10 +8164,7 @@
               <w:cnfStyle w:val="000000010000" w:firstRow="0" w:lastRow="0" w:firstColumn="0" w:lastColumn="0" w:oddVBand="0" w:evenVBand="0" w:oddHBand="0" w:evenHBand="1" w:firstRowFirstColumn="0" w:firstRowLastColumn="0" w:lastRowFirstColumn="0" w:lastRowLastColumn="0"/>
             </w:pPr>
             <w:r>
-              <w:t>Для этого нуклида в вашей установке Geant4 нет схемы распада — выб</w:t>
-            </w:r>
-            <w:r>
-              <w:t>ерите другой нуклид из списка</w:t>
+              <w:t>Для этого нуклида в вашей установке Geant4 нет схемы распада — выберите другой нуклид из списка</w:t>
             </w:r>
           </w:p>
         </w:tc>
@@ -8102,7 +8198,10 @@
               <w:cnfStyle w:val="000000100000" w:firstRow="0" w:lastRow="0" w:firstColumn="0" w:lastColumn="0" w:oddVBand="0" w:evenVBand="0" w:oddHBand="1" w:evenHBand="0" w:firstRowFirstColumn="0" w:firstRowLastColumn="0" w:lastRowFirstColumn="0" w:lastRowLastColumn="0"/>
             </w:pPr>
             <w:r>
-              <w:t>Возможно, задано очень много распадов — подождите или нажмите «Остановить симуляцию» и уменьшите число распадов</w:t>
+              <w:t xml:space="preserve">Возможно, задано очень много распадов — подождите или нажмите </w:t>
+            </w:r>
+            <w:r>
+              <w:t>«Остановить симуляцию» и уменьшите число распадов</w:t>
             </w:r>
           </w:p>
         </w:tc>
@@ -8136,7 +8235,10 @@
               <w:cnfStyle w:val="000000010000" w:firstRow="0" w:lastRow="0" w:firstColumn="0" w:lastColumn="0" w:oddVBand="0" w:evenVBand="0" w:oddHBand="0" w:evenHBand="1" w:firstRowFirstColumn="0" w:firstRowLastColumn="0" w:lastRowFirstColumn="0" w:lastRowLastColumn="0"/>
             </w:pPr>
             <w:r>
-              <w:t xml:space="preserve">Запустите start.bat через правую кнопку мыши → «Запуск от имени администратора». Если окно всё равно закрывается — запустите его из командной строки, чтобы увидеть текст ошибки: Win+R → </w:t>
+              <w:t>Запустите start.bat через правую кнопку мыши → «Запуск от имени администратора». Если окно всё равно закрывается — запустите его из командной строки, чтобы у</w:t>
+            </w:r>
+            <w:r>
+              <w:t xml:space="preserve">видеть текст ошибки: Win+R → </w:t>
             </w:r>
             <w:r>
               <w:rPr>
@@ -8181,25 +8283,25 @@
       <w:pPr>
         <w:pStyle w:val="1"/>
       </w:pPr>
-      <w:bookmarkStart w:id="24" w:name="_Toc243415818"/>
-      <w:r>
-        <w:t>8. Приложени</w:t>
-      </w:r>
-      <w:r>
-        <w:t>е для опытных пользователей</w:t>
+      <w:bookmarkStart w:id="24" w:name="_Toc243493636"/>
+      <w:r>
+        <w:t>8. Приложение для опытных пользователей</w:t>
       </w:r>
       <w:bookmarkEnd w:id="24"/>
     </w:p>
     <w:p>
       <w:r>
-        <w:t>Разделы ниже не нужны для обычной работы; они пригодятся, если потребуется запускать расчёты без интерфейса или разбираться в устройстве установки Geant4.</w:t>
+        <w:t>Разделы ниже не нужны для обычной работы; они пригодятся, если потребуется запускать расчёты без интерфейса или разбираться в уст</w:t>
+      </w:r>
+      <w:r>
+        <w:t>ройстве установки Geant4.</w:t>
       </w:r>
     </w:p>
     <w:p>
       <w:pPr>
         <w:pStyle w:val="21"/>
       </w:pPr>
-      <w:bookmarkStart w:id="25" w:name="_Toc243415819"/>
+      <w:bookmarkStart w:id="25" w:name="_Toc243493637"/>
       <w:r>
         <w:t>8.1. Пакетный режим (без графического интерфейса)</w:t>
       </w:r>
@@ -8215,10 +8317,7 @@
         <w:t>main.exe</w:t>
       </w:r>
       <w:r>
-        <w:t xml:space="preserve"> умеет работать</w:t>
-      </w:r>
-      <w:r>
-        <w:t xml:space="preserve"> по файлу-макросу:</w:t>
+        <w:t xml:space="preserve"> умеет работать по файлу-макросу:</w:t>
       </w:r>
     </w:p>
     <w:p>
@@ -8232,6 +8331,7 @@
           <w:rFonts w:ascii="Consolas" w:hAnsi="Consolas" w:cs="Consolas"/>
           <w:sz w:val="18"/>
         </w:rPr>
+        <w:lastRenderedPageBreak/>
         <w:t>build\Release\main.exe run.mac</w:t>
       </w:r>
     </w:p>
@@ -8248,7 +8348,10 @@
         <w:t>run.mac</w:t>
       </w:r>
       <w:r>
-        <w:t xml:space="preserve"> создаётся графическим интерфейсом автоматически при каждом запуске (его также можно сохранить кнопкой «Сохранить .mac»). Основные команды макроса:</w:t>
+        <w:t xml:space="preserve"> создаётся графическим интерфейсом автоматически при каждом запуске (его также можно сохранить </w:t>
+      </w:r>
+      <w:r>
+        <w:t>кнопкой «Сохранить .mac»). Основные команды макроса:</w:t>
       </w:r>
     </w:p>
     <w:p>
@@ -8263,14 +8366,7 @@
           <w:rFonts w:ascii="Consolas" w:hAnsi="Consolas" w:cs="Consolas"/>
           <w:sz w:val="18"/>
         </w:rPr>
-        <w:t>/myDetector/setGeometry        cylinder | beak</w:t>
-      </w:r>
-      <w:r>
-        <w:rPr>
-          <w:rFonts w:ascii="Consolas" w:hAnsi="Consolas" w:cs="Consolas"/>
-          <w:sz w:val="18"/>
-        </w:rPr>
-        <w:t>er | tube</w:t>
+        <w:t>/myDetector/setGeometry        cylinder | beaker | tube</w:t>
       </w:r>
     </w:p>
     <w:p>
@@ -8330,7 +8426,14 @@
           <w:rFonts w:ascii="Consolas" w:hAnsi="Consolas" w:cs="Consolas"/>
           <w:sz w:val="18"/>
         </w:rPr>
-        <w:t>/myDetector/setRim             0 cm</w:t>
+        <w:t xml:space="preserve">/myDetector/setRim             0 </w:t>
+      </w:r>
+      <w:r>
+        <w:rPr>
+          <w:rFonts w:ascii="Consolas" w:hAnsi="Consolas" w:cs="Consolas"/>
+          <w:sz w:val="18"/>
+        </w:rPr>
+        <w:t>cm</w:t>
       </w:r>
     </w:p>
     <w:p>
@@ -8493,7 +8596,39 @@
           <w:sz w:val="18"/>
           <w:shd w:val="clear" w:color="auto" w:fill="F4F4F4"/>
         </w:rPr>
-        <w:t>/run/initi</w:t>
+        <w:t>/run/initialize</w:t>
+      </w:r>
+      <w:r>
+        <w:t>.</w:t>
+      </w:r>
+    </w:p>
+    <w:p>
+      <w:pPr>
+        <w:pStyle w:val="21"/>
+      </w:pPr>
+      <w:bookmarkStart w:id="26" w:name="_Toc243493638"/>
+      <w:r>
+        <w:t>8.2. Интерактивный режим с визуализацией</w:t>
+      </w:r>
+      <w:bookmarkEnd w:id="26"/>
+    </w:p>
+    <w:p>
+      <w:pPr>
+        <w:shd w:val="clear" w:color="auto" w:fill="F4F4F4"/>
+        <w:spacing w:before="120" w:line="240" w:lineRule="auto"/>
+        <w:ind w:left="227"/>
+      </w:pPr>
+      <w:r>
+        <w:rPr>
+          <w:rFonts w:ascii="Consolas" w:hAnsi="Consolas" w:cs="Consolas"/>
+          <w:sz w:val="18"/>
+        </w:rPr>
+        <w:t>interactive.bat</w:t>
+      </w:r>
+    </w:p>
+    <w:p>
+      <w:r>
+        <w:t xml:space="preserve">или запустите </w:t>
       </w:r>
       <w:r>
         <w:rPr>
@@ -8501,21 +8636,158 @@
           <w:sz w:val="18"/>
           <w:shd w:val="clear" w:color="auto" w:fill="F4F4F4"/>
         </w:rPr>
-        <w:t>alize</w:t>
-      </w:r>
-      <w:r>
-        <w:t>.</w:t>
+        <w:t>main.exe</w:t>
+      </w:r>
+      <w:r>
+        <w:t xml:space="preserve"> без аргументов — откроется меню Geant4 с визуализацией геометрии (</w:t>
+      </w:r>
+      <w:r>
+        <w:t xml:space="preserve">нужна поддержка OpenGL). Запускайте из папки программы: макросы </w:t>
+      </w:r>
+      <w:r>
+        <w:rPr>
+          <w:rFonts w:ascii="Consolas" w:hAnsi="Consolas" w:cs="Consolas"/>
+          <w:sz w:val="18"/>
+          <w:shd w:val="clear" w:color="auto" w:fill="F4F4F4"/>
+        </w:rPr>
+        <w:t>vis.mac</w:t>
+      </w:r>
+      <w:r>
+        <w:t xml:space="preserve"> и </w:t>
+      </w:r>
+      <w:r>
+        <w:rPr>
+          <w:rFonts w:ascii="Consolas" w:hAnsi="Consolas" w:cs="Consolas"/>
+          <w:sz w:val="18"/>
+          <w:shd w:val="clear" w:color="auto" w:fill="F4F4F4"/>
+        </w:rPr>
+        <w:t>gui.mac</w:t>
+      </w:r>
+      <w:r>
+        <w:t xml:space="preserve"> ищутся в текущем каталоге.</w:t>
       </w:r>
     </w:p>
     <w:p>
       <w:pPr>
         <w:pStyle w:val="21"/>
       </w:pPr>
-      <w:bookmarkStart w:id="26" w:name="_Toc243415820"/>
-      <w:r>
-        <w:t>8.2. Интерактивный режим с визуализацией</w:t>
-      </w:r>
-      <w:bookmarkEnd w:id="26"/>
+      <w:bookmarkStart w:id="27" w:name="_Toc243493639"/>
+      <w:r>
+        <w:t>8.3. Ручная распаковка пакетов и переменные G4*DATA</w:t>
+      </w:r>
+      <w:bookmarkEnd w:id="27"/>
+    </w:p>
+    <w:p>
+      <w:r>
+        <w:rPr>
+          <w:b/>
+        </w:rPr>
+        <w:t>Распаковка вручную.</w:t>
+      </w:r>
+      <w:r>
+        <w:t xml:space="preserve"> Обычно пакеты ставит </w:t>
+      </w:r>
+      <w:r>
+        <w:rPr>
+          <w:rFonts w:ascii="Consolas" w:hAnsi="Consolas" w:cs="Consolas"/>
+          <w:sz w:val="18"/>
+          <w:shd w:val="clear" w:color="auto" w:fill="F4F4F4"/>
+        </w:rPr>
+        <w:t>install_data.bat</w:t>
+      </w:r>
+      <w:r>
+        <w:t xml:space="preserve"> от имени администратора (раздел 5.2) </w:t>
+      </w:r>
+      <w:r>
+        <w:t xml:space="preserve">— ручной способ нужен, только если он по каким-то причинам не подходит. Файл пакета имеет расширение </w:t>
+      </w:r>
+      <w:r>
+        <w:rPr>
+          <w:rFonts w:ascii="Consolas" w:hAnsi="Consolas" w:cs="Consolas"/>
+          <w:sz w:val="18"/>
+          <w:shd w:val="clear" w:color="auto" w:fill="F4F4F4"/>
+        </w:rPr>
+        <w:t>.tar.gz</w:t>
+      </w:r>
+      <w:r>
+        <w:t>: Windows 11 открывает такие архивы прямо в Проводнике (правая кнопка → «Извлечь всё»), а в Windows 10 встроенной поддержки нет — там пригодится бес</w:t>
+      </w:r>
+      <w:r>
+        <w:t xml:space="preserve">платный 7-Zip (описан ниже). Способ, работающий в обеих системах, — команда </w:t>
+      </w:r>
+      <w:r>
+        <w:rPr>
+          <w:rFonts w:ascii="Consolas" w:hAnsi="Consolas" w:cs="Consolas"/>
+          <w:sz w:val="18"/>
+          <w:shd w:val="clear" w:color="auto" w:fill="F4F4F4"/>
+        </w:rPr>
+        <w:t>tar</w:t>
+      </w:r>
+      <w:r>
+        <w:t>, встроенная в Windows 10/11:</w:t>
+      </w:r>
+    </w:p>
+    <w:p>
+      <w:pPr>
+        <w:spacing w:after="40"/>
+        <w:ind w:left="510" w:hanging="510"/>
+      </w:pPr>
+      <w:r>
+        <w:rPr>
+          <w:b/>
+        </w:rPr>
+        <w:t>1.</w:t>
+      </w:r>
+      <w:r>
+        <w:rPr>
+          <w:b/>
+        </w:rPr>
+        <w:tab/>
+      </w:r>
+      <w:r>
+        <w:t xml:space="preserve">Откройте командную строку: </w:t>
+      </w:r>
+      <w:r>
+        <w:rPr>
+          <w:b/>
+        </w:rPr>
+        <w:t>Win + R</w:t>
+      </w:r>
+      <w:r>
+        <w:t xml:space="preserve"> → </w:t>
+      </w:r>
+      <w:r>
+        <w:rPr>
+          <w:rFonts w:ascii="Consolas" w:hAnsi="Consolas" w:cs="Consolas"/>
+          <w:sz w:val="18"/>
+          <w:shd w:val="clear" w:color="auto" w:fill="F4F4F4"/>
+        </w:rPr>
+        <w:t>cmd</w:t>
+      </w:r>
+      <w:r>
+        <w:t xml:space="preserve"> → Enter (как в разделе 4.2).</w:t>
+      </w:r>
+    </w:p>
+    <w:p>
+      <w:pPr>
+        <w:spacing w:after="40"/>
+        <w:ind w:left="510" w:hanging="510"/>
+      </w:pPr>
+      <w:r>
+        <w:rPr>
+          <w:b/>
+        </w:rPr>
+        <w:t>2.</w:t>
+      </w:r>
+      <w:r>
+        <w:rPr>
+          <w:b/>
+        </w:rPr>
+        <w:tab/>
+      </w:r>
+      <w:r>
+        <w:t>Перейдите в папку данных Geant4 (путь подставьте свой):</w:t>
+      </w:r>
     </w:p>
     <w:p>
       <w:pPr>
@@ -8528,24 +8800,83 @@
           <w:rFonts w:ascii="Consolas" w:hAnsi="Consolas" w:cs="Consolas"/>
           <w:sz w:val="18"/>
         </w:rPr>
-        <w:t>interactive.bat</w:t>
-      </w:r>
-    </w:p>
-    <w:p>
-      <w:r>
-        <w:lastRenderedPageBreak/>
-        <w:t xml:space="preserve">или запустите </w:t>
-      </w:r>
+        <w:t xml:space="preserve">   cd /d "C:\Ge</w:t>
+      </w:r>
+      <w:r>
+        <w:rPr>
+          <w:rFonts w:ascii="Consolas" w:hAnsi="Consolas" w:cs="Consolas"/>
+          <w:sz w:val="18"/>
+        </w:rPr>
+        <w:t>ant4\data"</w:t>
+      </w:r>
+    </w:p>
+    <w:p>
+      <w:pPr>
+        <w:spacing w:after="40"/>
+        <w:ind w:left="510" w:hanging="510"/>
+      </w:pPr>
+      <w:r>
+        <w:rPr>
+          <w:b/>
+        </w:rPr>
+        <w:t>3.</w:t>
+      </w:r>
+      <w:r>
+        <w:rPr>
+          <w:b/>
+        </w:rPr>
+        <w:tab/>
+      </w:r>
+      <w:r>
+        <w:t>Распакуйте скачанный файл (путь подставьте свой, обычно это папка «Загрузки»):</w:t>
+      </w:r>
+    </w:p>
+    <w:p>
+      <w:pPr>
+        <w:shd w:val="clear" w:color="auto" w:fill="F4F4F4"/>
+        <w:spacing w:before="120" w:line="240" w:lineRule="auto"/>
+        <w:ind w:left="227"/>
+      </w:pPr>
+      <w:r>
+        <w:rPr>
+          <w:rFonts w:ascii="Consolas" w:hAnsi="Consolas" w:cs="Consolas"/>
+          <w:sz w:val="18"/>
+        </w:rPr>
+        <w:t xml:space="preserve">   tar -xzf "C:\Users\&lt;имя пользователя&gt;\Downloads\G4EMLOW.8.8.tar.gz"</w:t>
+      </w:r>
+    </w:p>
+    <w:p>
+      <w:pPr>
+        <w:spacing w:after="40"/>
+        <w:ind w:left="510" w:hanging="510"/>
+      </w:pPr>
+      <w:r>
+        <w:rPr>
+          <w:b/>
+        </w:rPr>
+        <w:t>4.</w:t>
+      </w:r>
+      <w:r>
+        <w:rPr>
+          <w:b/>
+        </w:rPr>
+        <w:tab/>
+      </w:r>
+      <w:r>
+        <w:t>Повторите команду для каждого скачанного пакета — у каждого свой путь к файлу.</w:t>
+      </w:r>
+    </w:p>
+    <w:p>
       <w:r>
         <w:rPr>
           <w:rFonts w:ascii="Consolas" w:hAnsi="Consolas" w:cs="Consolas"/>
           <w:sz w:val="18"/>
           <w:shd w:val="clear" w:color="auto" w:fill="F4F4F4"/>
         </w:rPr>
-        <w:t>main.exe</w:t>
-      </w:r>
-      <w:r>
-        <w:t xml:space="preserve"> без аргументов — откроется меню Geant4 с визуализацией геометрии (нужна поддержка OpenGL). Запускайте из папки программы: макросы </w:t>
+        <w:t>start.bat</w:t>
+      </w:r>
+      <w:r>
+        <w:t xml:space="preserve"> ищет папки в </w:t>
       </w:r>
       <w:r>
         <w:rPr>
@@ -8553,10 +8884,10 @@
           <w:sz w:val="18"/>
           <w:shd w:val="clear" w:color="auto" w:fill="F4F4F4"/>
         </w:rPr>
-        <w:t>vis.mac</w:t>
-      </w:r>
-      <w:r>
-        <w:t xml:space="preserve"> и </w:t>
+        <w:t>&lt;каталог Geant4&gt;\data</w:t>
+      </w:r>
+      <w:r>
+        <w:t xml:space="preserve"> - там, куда их ставит </w:t>
       </w:r>
       <w:r>
         <w:rPr>
@@ -8564,34 +8895,27 @@
           <w:sz w:val="18"/>
           <w:shd w:val="clear" w:color="auto" w:fill="F4F4F4"/>
         </w:rPr>
-        <w:t>gui.mac</w:t>
-      </w:r>
-      <w:r>
-        <w:t xml:space="preserve"> ищутся в текущем каталоге.</w:t>
-      </w:r>
-    </w:p>
-    <w:p>
-      <w:pPr>
-        <w:pStyle w:val="21"/>
-      </w:pPr>
-      <w:bookmarkStart w:id="27" w:name="_Toc243415821"/>
-      <w:r>
-        <w:t>8.3. Ручная распаковка пакетов и переменные G4*DATA</w:t>
-      </w:r>
-      <w:bookmarkEnd w:id="27"/>
-    </w:p>
-    <w:p>
+        <w:t>install_data.bat</w:t>
+      </w:r>
+      <w:r>
+        <w:t>.</w:t>
+      </w:r>
+    </w:p>
+    <w:p>
+      <w:r>
+        <w:t xml:space="preserve">Если командная строка пугает — распакуйте через бесплатный архиватор 7-Zip: правая кнопка мыши по файлу → </w:t>
+      </w:r>
       <w:r>
         <w:rPr>
           <w:b/>
         </w:rPr>
-        <w:t>Распаковка вручную.</w:t>
-      </w:r>
-      <w:r>
-        <w:t xml:space="preserve"> Обычно п</w:t>
-      </w:r>
-      <w:r>
-        <w:t xml:space="preserve">акеты ставит </w:t>
+        <w:t>7-Zip → «Извлечь сюда»</w:t>
+      </w:r>
+      <w:r>
+        <w:t>, затем перенесите появившуюся папку (напри</w:t>
+      </w:r>
+      <w:r>
+        <w:t xml:space="preserve">мер </w:t>
       </w:r>
       <w:r>
         <w:rPr>
@@ -8599,10 +8923,21 @@
           <w:sz w:val="18"/>
           <w:shd w:val="clear" w:color="auto" w:fill="F4F4F4"/>
         </w:rPr>
-        <w:t>install_data.bat</w:t>
-      </w:r>
-      <w:r>
-        <w:t xml:space="preserve"> (раздел 5.2) — ручной способ нужен, только если он по каким-то причинам не подходит. Файл пакета имеет расширение </w:t>
+        <w:t>G4EMLOW8.8</w:t>
+      </w:r>
+      <w:r>
+        <w:t>) в папку данных Geant4.</w:t>
+      </w:r>
+    </w:p>
+    <w:p>
+      <w:r>
+        <w:rPr>
+          <w:b/>
+        </w:rPr>
+        <w:t>Переменные среды.</w:t>
+      </w:r>
+      <w:r>
+        <w:t xml:space="preserve"> Переменные окружения — это записи в системе Windows, которые указывают программам, где лежат файлы. Geant4 использует переменные вида </w:t>
       </w:r>
       <w:r>
         <w:rPr>
@@ -8610,13 +8945,10 @@
           <w:sz w:val="18"/>
           <w:shd w:val="clear" w:color="auto" w:fill="F4F4F4"/>
         </w:rPr>
-        <w:t>.tar.gz</w:t>
-      </w:r>
-      <w:r>
-        <w:t>: Windows 11 открывает такие архивы прямо в Проводнике (правая кнопка → «Извлечь всё»), а в Windows 10 вс</w:t>
-      </w:r>
-      <w:r>
-        <w:t xml:space="preserve">троенной поддержки нет — там пригодится бесплатный 7-Zip (описан ниже). Способ, работающий в обеих системах, — команда </w:t>
+        <w:t>G4*DATA</w:t>
+      </w:r>
+      <w:r>
+        <w:t xml:space="preserve">: например, </w:t>
       </w:r>
       <w:r>
         <w:rPr>
@@ -8624,40 +8956,13 @@
           <w:sz w:val="18"/>
           <w:shd w:val="clear" w:color="auto" w:fill="F4F4F4"/>
         </w:rPr>
-        <w:t>tar</w:t>
-      </w:r>
-      <w:r>
-        <w:t>, встроенная в Windows 10/11:</w:t>
-      </w:r>
-    </w:p>
-    <w:p>
-      <w:pPr>
-        <w:spacing w:after="40"/>
-        <w:ind w:left="510" w:hanging="510"/>
-      </w:pPr>
-      <w:r>
-        <w:rPr>
-          <w:b/>
-        </w:rPr>
-        <w:t>1.</w:t>
-      </w:r>
-      <w:r>
-        <w:rPr>
-          <w:b/>
-        </w:rPr>
-        <w:tab/>
-      </w:r>
-      <w:r>
-        <w:t xml:space="preserve">Откройте командную строку: </w:t>
-      </w:r>
-      <w:r>
-        <w:rPr>
-          <w:b/>
-        </w:rPr>
-        <w:t>Win + R</w:t>
-      </w:r>
-      <w:r>
-        <w:t xml:space="preserve"> → </w:t>
+        <w:t>G4RADIOACTIVEDATA</w:t>
+      </w:r>
+      <w:r>
+        <w:t xml:space="preserve"> указывает на папку со схемам</w:t>
+      </w:r>
+      <w:r>
+        <w:t xml:space="preserve">и распадов, </w:t>
       </w:r>
       <w:r>
         <w:rPr>
@@ -8665,10 +8970,33 @@
           <w:sz w:val="18"/>
           <w:shd w:val="clear" w:color="auto" w:fill="F4F4F4"/>
         </w:rPr>
-        <w:t>cmd</w:t>
-      </w:r>
-      <w:r>
-        <w:t xml:space="preserve"> → Enter (как в разделе 4.2).</w:t>
+        <w:t>G4LEVELGAMMADATA</w:t>
+      </w:r>
+      <w:r>
+        <w:t xml:space="preserve"> — на папку с уровнями дочерних ядер.</w:t>
+      </w:r>
+    </w:p>
+    <w:p>
+      <w:r>
+        <w:t xml:space="preserve">Обычно переменные создаёт установщик Geant4, но при установке без пакетов данных их может не оказаться. </w:t>
+      </w:r>
+      <w:r>
+        <w:rPr>
+          <w:b/>
+        </w:rPr>
+        <w:t>Проще всего не трогать их руками: запустите `install_data.bat`, а затем `start.bat`</w:t>
+      </w:r>
+      <w:r>
+        <w:t xml:space="preserve"> — </w:t>
+      </w:r>
+      <w:r>
+        <w:t>они сами найдут папки данных и создадут недостающие переменные (раздел 5.2).</w:t>
+      </w:r>
+    </w:p>
+    <w:p>
+      <w:r>
+        <w:lastRenderedPageBreak/>
+        <w:t>Если нужно посмотреть или создать переменную вручную:</w:t>
       </w:r>
     </w:p>
     <w:p>
@@ -8680,7 +9008,7 @@
         <w:rPr>
           <w:b/>
         </w:rPr>
-        <w:t>2.</w:t>
+        <w:t>1.</w:t>
       </w:r>
       <w:r>
         <w:rPr>
@@ -8689,93 +9017,69 @@
         <w:tab/>
       </w:r>
       <w:r>
-        <w:t>Перейдите в папку данных Gea</w:t>
-      </w:r>
-      <w:r>
-        <w:t>nt4 (путь подставьте свой):</w:t>
-      </w:r>
-    </w:p>
-    <w:p>
-      <w:pPr>
-        <w:shd w:val="clear" w:color="auto" w:fill="F4F4F4"/>
-        <w:spacing w:before="120" w:line="240" w:lineRule="auto"/>
-        <w:ind w:left="227"/>
-      </w:pPr>
-      <w:r>
-        <w:rPr>
-          <w:rFonts w:ascii="Consolas" w:hAnsi="Consolas" w:cs="Consolas"/>
-          <w:sz w:val="18"/>
-        </w:rPr>
-        <w:t xml:space="preserve">   cd /d "C:\Geant4\data"</w:t>
-      </w:r>
-    </w:p>
-    <w:p>
-      <w:pPr>
-        <w:spacing w:after="40"/>
-        <w:ind w:left="510" w:hanging="510"/>
-      </w:pPr>
+        <w:t xml:space="preserve">Нажмите </w:t>
+      </w:r>
       <w:r>
         <w:rPr>
           <w:b/>
         </w:rPr>
-        <w:t>3.</w:t>
-      </w:r>
-      <w:r>
-        <w:rPr>
-          <w:b/>
-        </w:rPr>
-        <w:tab/>
-      </w:r>
-      <w:r>
-        <w:t>Распакуйте скачанный файл (путь подставьте свой, обычно это папка «Загрузки»):</w:t>
-      </w:r>
-    </w:p>
-    <w:p>
-      <w:pPr>
-        <w:shd w:val="clear" w:color="auto" w:fill="F4F4F4"/>
-        <w:spacing w:before="120" w:line="240" w:lineRule="auto"/>
-        <w:ind w:left="227"/>
-      </w:pPr>
-      <w:r>
-        <w:rPr>
-          <w:rFonts w:ascii="Consolas" w:hAnsi="Consolas" w:cs="Consolas"/>
-          <w:sz w:val="18"/>
-        </w:rPr>
-        <w:t xml:space="preserve">   tar -xzf "C:\Users\&lt;имя пользователя&gt;\Downloads\G4EMLOW.8.8.tar.gz"</w:t>
-      </w:r>
-    </w:p>
-    <w:p>
-      <w:pPr>
-        <w:spacing w:after="40"/>
-        <w:ind w:left="510" w:hanging="510"/>
-      </w:pPr>
-      <w:r>
-        <w:rPr>
-          <w:b/>
-        </w:rPr>
-        <w:t>4.</w:t>
-      </w:r>
-      <w:r>
-        <w:rPr>
-          <w:b/>
-        </w:rPr>
-        <w:tab/>
-      </w:r>
-      <w:r>
-        <w:t>Повторите команду для каждого скачанного пакета — у каждого свой путь к файлу.</w:t>
-      </w:r>
-    </w:p>
-    <w:p>
+        <w:t>Win + R</w:t>
+      </w:r>
+      <w:r>
+        <w:t xml:space="preserve">, введите </w:t>
+      </w:r>
       <w:r>
         <w:rPr>
           <w:rFonts w:ascii="Consolas" w:hAnsi="Consolas" w:cs="Consolas"/>
           <w:sz w:val="18"/>
           <w:shd w:val="clear" w:color="auto" w:fill="F4F4F4"/>
         </w:rPr>
-        <w:t>start.bat</w:t>
-      </w:r>
-      <w:r>
-        <w:t xml:space="preserve"> ищет папки в </w:t>
+        <w:t>sysdm.cpl</w:t>
+      </w:r>
+      <w:r>
+        <w:t>, нажмите Enter.</w:t>
+      </w:r>
+    </w:p>
+    <w:p>
+      <w:pPr>
+        <w:spacing w:after="40"/>
+        <w:ind w:left="510" w:hanging="510"/>
+      </w:pPr>
+      <w:r>
+        <w:rPr>
+          <w:b/>
+        </w:rPr>
+        <w:t>2.</w:t>
+      </w:r>
+      <w:r>
+        <w:rPr>
+          <w:b/>
+        </w:rPr>
+        <w:tab/>
+      </w:r>
+      <w:r>
+        <w:t>Вкладка «Дополнительно» → кнопка «Переменные среды…».</w:t>
+      </w:r>
+    </w:p>
+    <w:p>
+      <w:pPr>
+        <w:spacing w:after="40"/>
+        <w:ind w:left="510" w:hanging="510"/>
+      </w:pPr>
+      <w:r>
+        <w:rPr>
+          <w:b/>
+        </w:rPr>
+        <w:t>3.</w:t>
+      </w:r>
+      <w:r>
+        <w:rPr>
+          <w:b/>
+        </w:rPr>
+        <w:tab/>
+      </w:r>
+      <w:r>
+        <w:t xml:space="preserve">Найдите </w:t>
       </w:r>
       <w:r>
         <w:rPr>
@@ -8783,10 +9087,10 @@
           <w:sz w:val="18"/>
           <w:shd w:val="clear" w:color="auto" w:fill="F4F4F4"/>
         </w:rPr>
-        <w:t>&lt;каталог Geant4&gt;\data</w:t>
-      </w:r>
-      <w:r>
-        <w:t xml:space="preserve"> - там, куда их ставит </w:t>
+        <w:t>G4RADIOACTIVEDATA</w:t>
+      </w:r>
+      <w:r>
+        <w:t xml:space="preserve"> — она может находиться в блоке «Системные переменные» или «Переменные пользователя»; значением должен быть путь вида </w:t>
       </w:r>
       <w:r>
         <w:rPr>
@@ -8794,7 +9098,7 @@
           <w:sz w:val="18"/>
           <w:shd w:val="clear" w:color="auto" w:fill="F4F4F4"/>
         </w:rPr>
-        <w:t>install_data.bat</w:t>
+        <w:t>...\data\RadioactiveDecay6.1.2</w:t>
       </w:r>
       <w:r>
         <w:t>.</w:t>
@@ -8802,19 +9106,37 @@
     </w:p>
     <w:p>
       <w:r>
-        <w:t>Если командная стр</w:t>
-      </w:r>
-      <w:r>
-        <w:t xml:space="preserve">ока пугает — распакуйте через бесплатный архиватор 7-Zip: правая кнопка мыши по файлу → </w:t>
+        <w:t xml:space="preserve">&gt; </w:t>
       </w:r>
       <w:r>
         <w:rPr>
           <w:b/>
         </w:rPr>
-        <w:t>7-Zip → «Извлечь сюда»</w:t>
-      </w:r>
-      <w:r>
-        <w:t xml:space="preserve">, затем перенесите появившуюся папку (например </w:t>
+        <w:t>[Скриншот: окно «Переменные среды» с подсвеченной G4RADIOACTIVEDATA]</w:t>
+      </w:r>
+    </w:p>
+    <w:p>
+      <w:pPr>
+        <w:spacing w:after="40"/>
+        <w:ind w:left="510" w:hanging="510"/>
+      </w:pPr>
+      <w:r>
+        <w:rPr>
+          <w:b/>
+        </w:rPr>
+        <w:t>4.</w:t>
+      </w:r>
+      <w:r>
+        <w:rPr>
+          <w:b/>
+        </w:rPr>
+        <w:tab/>
+      </w:r>
+      <w:r>
+        <w:t>Если пе</w:t>
+      </w:r>
+      <w:r>
+        <w:t xml:space="preserve">ременной нет, а папка с данными уже скачана — нажмите «Создать…» и укажите имя переменной и путь к папке. Но быстрее и надёжнее это делает </w:t>
       </w:r>
       <w:r>
         <w:rPr>
@@ -8822,257 +9144,34 @@
           <w:sz w:val="18"/>
           <w:shd w:val="clear" w:color="auto" w:fill="F4F4F4"/>
         </w:rPr>
-        <w:t>G4EMLOW8.8</w:t>
-      </w:r>
-      <w:r>
-        <w:t>) в папку данных Geant4.</w:t>
-      </w:r>
+        <w:t>start.bat</w:t>
+      </w:r>
+      <w:r>
+        <w:t>.</w:t>
+      </w:r>
+    </w:p>
+    <w:p>
+      <w:pPr>
+        <w:pStyle w:val="21"/>
+      </w:pPr>
+      <w:bookmarkStart w:id="28" w:name="_Toc243493640"/>
+      <w:r>
+        <w:t>8.4. Обновление и удаление</w:t>
+      </w:r>
+      <w:bookmarkEnd w:id="28"/>
     </w:p>
     <w:p>
       <w:r>
         <w:rPr>
           <w:b/>
         </w:rPr>
-        <w:t>Переменные среды.</w:t>
-      </w:r>
-      <w:r>
-        <w:t xml:space="preserve"> Переменные окружения — это записи в системе Wi</w:t>
-      </w:r>
-      <w:r>
-        <w:t xml:space="preserve">ndows, которые указывают программам, где лежат файлы. Geant4 использует переменные вида </w:t>
-      </w:r>
-      <w:r>
-        <w:rPr>
-          <w:rFonts w:ascii="Consolas" w:hAnsi="Consolas" w:cs="Consolas"/>
-          <w:sz w:val="18"/>
-          <w:shd w:val="clear" w:color="auto" w:fill="F4F4F4"/>
-        </w:rPr>
-        <w:t>G4*DATA</w:t>
-      </w:r>
-      <w:r>
-        <w:t xml:space="preserve">: например, </w:t>
-      </w:r>
-      <w:r>
-        <w:rPr>
-          <w:rFonts w:ascii="Consolas" w:hAnsi="Consolas" w:cs="Consolas"/>
-          <w:sz w:val="18"/>
-          <w:shd w:val="clear" w:color="auto" w:fill="F4F4F4"/>
-        </w:rPr>
-        <w:t>G4RADIOACTIVEDATA</w:t>
-      </w:r>
-      <w:r>
-        <w:t xml:space="preserve"> указывает на папку со схемами распадов, </w:t>
-      </w:r>
-      <w:r>
-        <w:rPr>
-          <w:rFonts w:ascii="Consolas" w:hAnsi="Consolas" w:cs="Consolas"/>
-          <w:sz w:val="18"/>
-          <w:shd w:val="clear" w:color="auto" w:fill="F4F4F4"/>
-        </w:rPr>
-        <w:t>G4LEVELGAMMADATA</w:t>
-      </w:r>
-      <w:r>
-        <w:t xml:space="preserve"> — на папку с уровнями дочерних ядер.</w:t>
-      </w:r>
-    </w:p>
-    <w:p>
-      <w:r>
-        <w:t xml:space="preserve">Обычно переменные создаёт установщик </w:t>
-      </w:r>
-      <w:r>
-        <w:t xml:space="preserve">Geant4, но при установке без пакетов данных их может не оказаться. </w:t>
-      </w:r>
-      <w:r>
-        <w:rPr>
-          <w:b/>
-        </w:rPr>
-        <w:t>Проще всего не трогать их руками: запустите `install_data.bat`, а затем `start.bat`</w:t>
-      </w:r>
-      <w:r>
-        <w:t xml:space="preserve"> — они сами найдут папки данных и создадут недостающие переменные (раздел 5.2).</w:t>
-      </w:r>
-    </w:p>
-    <w:p>
-      <w:r>
-        <w:t xml:space="preserve">Если нужно посмотреть или </w:t>
-      </w:r>
-      <w:r>
-        <w:t>создать переменную вручную:</w:t>
-      </w:r>
-    </w:p>
-    <w:p>
-      <w:pPr>
-        <w:spacing w:after="40"/>
-        <w:ind w:left="510" w:hanging="510"/>
-      </w:pPr>
-      <w:r>
-        <w:rPr>
-          <w:b/>
-        </w:rPr>
-        <w:t>1.</w:t>
-      </w:r>
-      <w:r>
-        <w:rPr>
-          <w:b/>
-        </w:rPr>
-        <w:tab/>
-      </w:r>
-      <w:r>
-        <w:t xml:space="preserve">Нажмите </w:t>
-      </w:r>
-      <w:r>
-        <w:rPr>
-          <w:b/>
-        </w:rPr>
-        <w:t>Win + R</w:t>
-      </w:r>
-      <w:r>
-        <w:t xml:space="preserve">, введите </w:t>
-      </w:r>
-      <w:r>
-        <w:rPr>
-          <w:rFonts w:ascii="Consolas" w:hAnsi="Consolas" w:cs="Consolas"/>
-          <w:sz w:val="18"/>
-          <w:shd w:val="clear" w:color="auto" w:fill="F4F4F4"/>
-        </w:rPr>
-        <w:t>sysdm.cpl</w:t>
-      </w:r>
-      <w:r>
-        <w:t>, нажмите Enter.</w:t>
-      </w:r>
-    </w:p>
-    <w:p>
-      <w:pPr>
-        <w:spacing w:after="40"/>
-        <w:ind w:left="510" w:hanging="510"/>
-      </w:pPr>
-      <w:r>
-        <w:rPr>
-          <w:b/>
-        </w:rPr>
-        <w:t>2.</w:t>
-      </w:r>
-      <w:r>
-        <w:rPr>
-          <w:b/>
-        </w:rPr>
-        <w:tab/>
-      </w:r>
-      <w:r>
-        <w:t>Вкладка «Дополнительно» → кнопка «Переменные среды…».</w:t>
-      </w:r>
-    </w:p>
-    <w:p>
-      <w:pPr>
-        <w:spacing w:after="40"/>
-        <w:ind w:left="510" w:hanging="510"/>
-      </w:pPr>
-      <w:r>
-        <w:rPr>
-          <w:b/>
-        </w:rPr>
-        <w:t>3.</w:t>
-      </w:r>
-      <w:r>
-        <w:rPr>
-          <w:b/>
-        </w:rPr>
-        <w:tab/>
-      </w:r>
-      <w:r>
-        <w:t xml:space="preserve">Найдите </w:t>
-      </w:r>
-      <w:r>
-        <w:rPr>
-          <w:rFonts w:ascii="Consolas" w:hAnsi="Consolas" w:cs="Consolas"/>
-          <w:sz w:val="18"/>
-          <w:shd w:val="clear" w:color="auto" w:fill="F4F4F4"/>
-        </w:rPr>
-        <w:t>G4RADIOACTIVEDATA</w:t>
-      </w:r>
-      <w:r>
-        <w:t xml:space="preserve"> — она может находиться в блоке «Системные переменные» или «Переменные пользователя»; зна</w:t>
-      </w:r>
-      <w:r>
-        <w:t xml:space="preserve">чением должен быть путь вида </w:t>
-      </w:r>
-      <w:r>
-        <w:rPr>
-          <w:rFonts w:ascii="Consolas" w:hAnsi="Consolas" w:cs="Consolas"/>
-          <w:sz w:val="18"/>
-          <w:shd w:val="clear" w:color="auto" w:fill="F4F4F4"/>
-        </w:rPr>
-        <w:t>...\data\RadioactiveDecay6.1.2</w:t>
-      </w:r>
-      <w:r>
-        <w:t>.</w:t>
-      </w:r>
-    </w:p>
-    <w:p>
-      <w:r>
-        <w:t xml:space="preserve">&gt; </w:t>
-      </w:r>
-      <w:r>
-        <w:rPr>
-          <w:b/>
-        </w:rPr>
-        <w:t>[Скриншот: окно «Переменные среды» с подсвеченной G4RADIOACTIVEDATA]</w:t>
-      </w:r>
-    </w:p>
-    <w:p>
-      <w:pPr>
-        <w:spacing w:after="40"/>
-        <w:ind w:left="510" w:hanging="510"/>
-      </w:pPr>
-      <w:r>
-        <w:rPr>
-          <w:b/>
-        </w:rPr>
-        <w:t>4.</w:t>
-      </w:r>
-      <w:r>
-        <w:rPr>
-          <w:b/>
-        </w:rPr>
-        <w:tab/>
-      </w:r>
-      <w:r>
-        <w:t xml:space="preserve">Если переменной нет, а папка с данными уже скачана — нажмите «Создать…» и укажите имя переменной и путь к папке. Но быстрее и надёжнее это делает </w:t>
-      </w:r>
-      <w:r>
-        <w:rPr>
-          <w:rFonts w:ascii="Consolas" w:hAnsi="Consolas" w:cs="Consolas"/>
-          <w:sz w:val="18"/>
-          <w:shd w:val="clear" w:color="auto" w:fill="F4F4F4"/>
-        </w:rPr>
-        <w:t>start.bat</w:t>
-      </w:r>
-      <w:r>
-        <w:t>.</w:t>
-      </w:r>
-    </w:p>
-    <w:p>
-      <w:pPr>
-        <w:pStyle w:val="21"/>
-      </w:pPr>
-      <w:bookmarkStart w:id="28" w:name="_Toc243415822"/>
-      <w:r>
-        <w:t>8.4. Обновление и удаление</w:t>
-      </w:r>
-      <w:bookmarkEnd w:id="28"/>
-    </w:p>
-    <w:p>
-      <w:r>
-        <w:rPr>
-          <w:b/>
-        </w:rPr>
         <w:t>Обновление:</w:t>
       </w:r>
       <w:r>
-        <w:t xml:space="preserve"> скачайте новый архив релиза, распакуйте его поверх папки про</w:t>
-      </w:r>
-      <w:r>
-        <w:t xml:space="preserve">граммы, заменив файлы. Файлы </w:t>
+        <w:t xml:space="preserve"> скачайте новый архив релиза, распакуйте его поверх папки программы,</w:t>
+      </w:r>
+      <w:r>
+        <w:t xml:space="preserve"> заменив файлы. Файлы </w:t>
       </w:r>
       <w:r>
         <w:rPr>
@@ -9120,13 +9219,12 @@
       <w:pPr>
         <w:pStyle w:val="1"/>
       </w:pPr>
-      <w:bookmarkStart w:id="29" w:name="_Toc243415823"/>
-      <w:r>
-        <w:lastRenderedPageBreak/>
-        <w:t>9. К</w:t>
-      </w:r>
-      <w:r>
-        <w:t>онтрольный список перед первым запуском</w:t>
+      <w:bookmarkStart w:id="29" w:name="_Toc243493641"/>
+      <w:r>
+        <w:t>9. Контроль</w:t>
+      </w:r>
+      <w:r>
+        <w:t>ный список перед первым запуском</w:t>
       </w:r>
       <w:bookmarkEnd w:id="29"/>
     </w:p>
@@ -9190,7 +9288,7 @@
         <w:tab/>
       </w:r>
       <w:r>
-        <w:t xml:space="preserve">Скачаны пять архивов данных Geant4 и положены рядом с </w:t>
+        <w:t xml:space="preserve">Скачаны пять обязательных архивов данных Geant4 и положены рядом с </w:t>
       </w:r>
       <w:r>
         <w:rPr>
@@ -9198,7 +9296,7 @@
           <w:sz w:val="18"/>
           <w:shd w:val="clear" w:color="auto" w:fill="F4F4F4"/>
         </w:rPr>
-        <w:t>install_da</w:t>
+        <w:t>inst</w:t>
       </w:r>
       <w:r>
         <w:rPr>
@@ -9206,7 +9304,7 @@
           <w:sz w:val="18"/>
           <w:shd w:val="clear" w:color="auto" w:fill="F4F4F4"/>
         </w:rPr>
-        <w:t>ta.bat</w:t>
+        <w:t>all_data.bat</w:t>
       </w:r>
       <w:r>
         <w:t xml:space="preserve">, </w:t>
@@ -9220,7 +9318,16 @@
         <w:t>install_data.bat</w:t>
       </w:r>
       <w:r>
-        <w:t xml:space="preserve"> запущен и написал </w:t>
+        <w:t xml:space="preserve"> запущен </w:t>
+      </w:r>
+      <w:r>
+        <w:rPr>
+          <w:b/>
+        </w:rPr>
+        <w:t>от имени администратора</w:t>
+      </w:r>
+      <w:r>
+        <w:t xml:space="preserve"> и написал </w:t>
       </w:r>
       <w:r>
         <w:rPr>
@@ -9228,7 +9335,7 @@
           <w:sz w:val="18"/>
           <w:shd w:val="clear" w:color="auto" w:fill="F4F4F4"/>
         </w:rPr>
-        <w:t>Готово: установлено 5 из 5 пакетов</w:t>
+        <w:t>Готово: обязательных пакетов 5 из 5</w:t>
       </w:r>
       <w:r>
         <w:t xml:space="preserve"> (раздел 5.2).</w:t>
@@ -9284,7 +9391,10 @@
         <w:tab/>
       </w:r>
       <w:r>
-        <w:t>Установлен matplotlib (раздел 4.4).</w:t>
+        <w:t xml:space="preserve">Установлен matplotlib </w:t>
+      </w:r>
+      <w:r>
+        <w:t>(раздел 4.4).</w:t>
       </w:r>
     </w:p>
     <w:p>
@@ -9369,7 +9479,10 @@
         <w:tab/>
       </w:r>
       <w:r>
-        <w:t>На вкладке «Радионуклид» выбран нуклид, и показаны T½ и статус данных Geant4.</w:t>
+        <w:t>На вкладке «Радионуклид» выбран нуклид, и показаны T½ и статус данных</w:t>
+      </w:r>
+      <w:r>
+        <w:t xml:space="preserve"> Geant4.</w:t>
       </w:r>
     </w:p>
     <w:p>
@@ -9390,10 +9503,7 @@
         <w:tab/>
       </w:r>
       <w:r>
-        <w:t>Тесто</w:t>
-      </w:r>
-      <w:r>
-        <w:t xml:space="preserve">вый расчёт (раздел 6.2) выполнен, в результатах </w:t>
+        <w:t xml:space="preserve">Тестовый расчёт (раздел 6.2) выполнен, в результатах </w:t>
       </w:r>
       <w:r>
         <w:rPr>
@@ -21015,7 +21125,7 @@
     <w:autoRedefine/>
     <w:uiPriority w:val="39"/>
     <w:unhideWhenUsed/>
-    <w:rsid w:val="000D12A0"/>
+    <w:rsid w:val="001D44D6"/>
     <w:pPr>
       <w:spacing w:after="100"/>
     </w:pPr>
@@ -21027,7 +21137,7 @@
     <w:autoRedefine/>
     <w:uiPriority w:val="39"/>
     <w:unhideWhenUsed/>
-    <w:rsid w:val="000D12A0"/>
+    <w:rsid w:val="001D44D6"/>
     <w:pPr>
       <w:spacing w:after="100"/>
       <w:ind w:left="220"/>
@@ -21038,7 +21148,7 @@
     <w:basedOn w:val="a2"/>
     <w:uiPriority w:val="99"/>
     <w:unhideWhenUsed/>
-    <w:rsid w:val="000D12A0"/>
+    <w:rsid w:val="001D44D6"/>
     <w:rPr>
       <w:color w:val="0000FF" w:themeColor="hyperlink"/>
       <w:u w:val="single"/>

</xml_diff>